<commit_message>
Otra línea que se puede quitar por ser un detallito
</commit_message>
<xml_diff>
--- a/Guiones/Guion_Dani.docx
+++ b/Guiones/Guion_Dani.docx
@@ -48,10 +48,7 @@
     </w:p>
     <w:p>
       <w:r>
-        <w:t>Ambos calculan</w:t>
-      </w:r>
-      <w:r>
-        <w:t xml:space="preserve"> un modelo MHN sin </w:t>
+        <w:t xml:space="preserve">Ambos calculan un modelo MHN sin </w:t>
       </w:r>
       <w:proofErr w:type="spellStart"/>
       <w:r>
@@ -59,13 +56,62 @@
       </w:r>
       <w:proofErr w:type="spellEnd"/>
       <w:r>
-        <w:t xml:space="preserve"> de sesgo a partir de un fichero </w:t>
-      </w:r>
-      <w:r>
+        <w:t xml:space="preserve"> de sesgo </w:t>
+      </w:r>
+      <w:commentRangeStart w:id="0"/>
+      <w:r>
+        <w:rPr>
+          <w:strike/>
+        </w:rPr>
+        <w:t>(</w:t>
+      </w:r>
+      <w:r>
+        <w:rPr>
+          <w:strike/>
+          <w:color w:val="7F7F7F" w:themeColor="text1" w:themeTint="80"/>
+        </w:rPr>
+        <w:t xml:space="preserve">a partir de un fichero </w:t>
+      </w:r>
+      <w:r>
+        <w:rPr>
+          <w:strike/>
+          <w:color w:val="7F7F7F" w:themeColor="text1" w:themeTint="80"/>
+        </w:rPr>
         <w:t>con</w:t>
       </w:r>
       <w:r>
-        <w:t xml:space="preserve"> los datos con estructura binaria. </w:t>
+        <w:rPr>
+          <w:strike/>
+          <w:color w:val="7F7F7F" w:themeColor="text1" w:themeTint="80"/>
+        </w:rPr>
+        <w:t xml:space="preserve"> los datos con estructura binaria</w:t>
+      </w:r>
+      <w:r>
+        <w:rPr>
+          <w:strike/>
+          <w:color w:val="7F7F7F" w:themeColor="text1" w:themeTint="80"/>
+        </w:rPr>
+        <w:t>)</w:t>
+      </w:r>
+      <w:r>
+        <w:rPr>
+          <w:strike/>
+          <w:color w:val="7F7F7F" w:themeColor="text1" w:themeTint="80"/>
+        </w:rPr>
+        <w:t>.</w:t>
+      </w:r>
+      <w:r>
+        <w:rPr>
+          <w:strike/>
+        </w:rPr>
+        <w:t xml:space="preserve"> </w:t>
+      </w:r>
+      <w:commentRangeEnd w:id="0"/>
+      <w:r>
+        <w:rPr>
+          <w:rStyle w:val="Refdecomentario"/>
+        </w:rPr>
+        <w:commentReference w:id="0"/>
       </w:r>
     </w:p>
     <w:p>
@@ -88,13 +134,7 @@
         <w:t xml:space="preserve">y se </w:t>
       </w:r>
       <w:r>
-        <w:t xml:space="preserve">pueden </w:t>
-      </w:r>
-      <w:r>
-        <w:t>especificar</w:t>
-      </w:r>
-      <w:r>
-        <w:t xml:space="preserve"> parámetros como el número de núcleos (</w:t>
+        <w:t>pueden especificar parámetros como el número de núcleos (</w:t>
       </w:r>
       <w:proofErr w:type="spellStart"/>
       <w:r>
@@ -105,30 +145,24 @@
         <w:t>, sólo desde R</w:t>
       </w:r>
       <w:r>
-        <w:t>) y</w:t>
-      </w:r>
-      <w:r>
-        <w:t>,</w:t>
-      </w:r>
-      <w:r>
-        <w:t xml:space="preserve"> </w:t>
-      </w:r>
-      <w:r>
-        <w:t xml:space="preserve">en ambos, </w:t>
-      </w:r>
-      <w:r>
-        <w:t>el h</w:t>
-      </w:r>
-      <w:proofErr w:type="spellStart"/>
-      <w:r>
-        <w:t>iperparámetro</w:t>
-      </w:r>
-      <w:proofErr w:type="spellEnd"/>
-      <w:r>
-        <w:t xml:space="preserve"> lambda</w:t>
-      </w:r>
-      <w:r>
-        <w:t xml:space="preserve"> (</w:t>
+        <w:t xml:space="preserve">) y, en </w:t>
+      </w:r>
+      <w:r>
+        <w:t xml:space="preserve">los </w:t>
+      </w:r>
+      <w:r>
+        <w:t>dos</w:t>
+      </w:r>
+      <w:r>
+        <w:t xml:space="preserve">, el </w:t>
+      </w:r>
+      <w:proofErr w:type="spellStart"/>
+      <w:r>
+        <w:t>hiperparámetro</w:t>
+      </w:r>
+      <w:proofErr w:type="spellEnd"/>
+      <w:r>
+        <w:t xml:space="preserve"> lambda (</w:t>
       </w:r>
       <w:proofErr w:type="spellStart"/>
       <w:r>
@@ -146,21 +180,10 @@
           <w:iCs/>
           <w:color w:val="7F7F7F" w:themeColor="text1" w:themeTint="80"/>
         </w:rPr>
-        <w:t xml:space="preserve"> = </w:t>
-      </w:r>
-      <w:r>
-        <w:rPr>
-          <w:i/>
-          <w:iCs/>
-          <w:color w:val="7F7F7F" w:themeColor="text1" w:themeTint="80"/>
-        </w:rPr>
-        <w:t>un parámetro cuyo valor se utiliza para controlar el proceso de aprendizaje</w:t>
-      </w:r>
-      <w:r>
-        <w:t>)</w:t>
-      </w:r>
-      <w:r>
-        <w:t xml:space="preserve">. </w:t>
+        <w:t xml:space="preserve"> = un parámetro cuyo valor se utiliza para controlar el proceso de aprendizaje</w:t>
+      </w:r>
+      <w:r>
+        <w:t xml:space="preserve">). </w:t>
       </w:r>
     </w:p>
     <w:p>
@@ -264,15 +287,7 @@
       </w:r>
       <w:proofErr w:type="spellEnd"/>
       <w:r>
-        <w:t xml:space="preserve"> de R, </w:t>
-      </w:r>
-      <w:proofErr w:type="spellStart"/>
-      <w:r>
-        <w:t>el</w:t>
-      </w:r>
-      <w:proofErr w:type="spellEnd"/>
-      <w:r>
-        <w:t xml:space="preserve"> primero</w:t>
+        <w:t xml:space="preserve"> de R, el primero</w:t>
       </w:r>
       <w:r>
         <w:t xml:space="preserve"> está </w:t>
@@ -293,127 +308,91 @@
         <w:rPr>
           <w:u w:val="single"/>
         </w:rPr>
-        <w:t>calcular</w:t>
-      </w:r>
+        <w:t xml:space="preserve">calcular el </w:t>
+      </w:r>
+      <w:proofErr w:type="spellStart"/>
       <w:r>
         <w:rPr>
           <w:u w:val="single"/>
         </w:rPr>
-        <w:t xml:space="preserve"> </w:t>
+        <w:t>oMHN</w:t>
+      </w:r>
+      <w:proofErr w:type="spellEnd"/>
+      <w:r>
+        <w:t xml:space="preserve"> (aplicando la </w:t>
+      </w:r>
+      <w:proofErr w:type="spellStart"/>
+      <w:r>
+        <w:t>correción</w:t>
+      </w:r>
+      <w:proofErr w:type="spellEnd"/>
+      <w:r>
+        <w:t xml:space="preserve"> del sesgo).</w:t>
+      </w:r>
+      <w:r>
+        <w:t xml:space="preserve"> Sin embargo</w:t>
+      </w:r>
+      <w:r>
+        <w:t>,</w:t>
+      </w:r>
+      <w:r>
+        <w:t xml:space="preserve"> el segundo </w:t>
+      </w:r>
+      <w:r>
+        <w:t xml:space="preserve">puede </w:t>
       </w:r>
       <w:r>
         <w:rPr>
           <w:u w:val="single"/>
         </w:rPr>
-        <w:t>el o</w:t>
+        <w:t xml:space="preserve">aplicar otros </w:t>
       </w:r>
       <w:proofErr w:type="spellStart"/>
       <w:r>
         <w:rPr>
           <w:u w:val="single"/>
         </w:rPr>
-        <w:t>MHN</w:t>
-      </w:r>
-      <w:proofErr w:type="spellEnd"/>
-      <w:r>
-        <w:t xml:space="preserve"> </w:t>
-      </w:r>
-      <w:r>
-        <w:t>(</w:t>
-      </w:r>
-      <w:r>
-        <w:t xml:space="preserve">aplicando la </w:t>
-      </w:r>
-      <w:proofErr w:type="spellStart"/>
-      <w:r>
-        <w:t>correción</w:t>
-      </w:r>
-      <w:proofErr w:type="spellEnd"/>
-      <w:r>
-        <w:t xml:space="preserve"> del sesgo</w:t>
-      </w:r>
-      <w:r>
-        <w:t>)</w:t>
-      </w:r>
-      <w:r>
-        <w:t>.</w:t>
-      </w:r>
-      <w:r>
-        <w:t xml:space="preserve"> Sin embargo</w:t>
-      </w:r>
-      <w:r>
-        <w:t>,</w:t>
-      </w:r>
-      <w:r>
-        <w:t xml:space="preserve"> el segundo </w:t>
-      </w:r>
-      <w:r>
-        <w:t xml:space="preserve">puede </w:t>
+        <w:t>CPMs</w:t>
+      </w:r>
+      <w:proofErr w:type="spellEnd"/>
+      <w:r>
+        <w:t xml:space="preserve"> y </w:t>
+      </w:r>
+      <w:r>
+        <w:t xml:space="preserve">cuenta con la función </w:t>
+      </w:r>
+      <w:proofErr w:type="spellStart"/>
+      <w:r>
+        <w:rPr>
+          <w:b/>
+          <w:bCs/>
+        </w:rPr>
+        <w:t>random_evam</w:t>
+      </w:r>
+      <w:proofErr w:type="spellEnd"/>
+      <w:r>
+        <w:rPr>
+          <w:b/>
+          <w:bCs/>
+        </w:rPr>
+        <w:t>()</w:t>
+      </w:r>
+      <w:r>
+        <w:t xml:space="preserve"> que permite </w:t>
       </w:r>
       <w:r>
         <w:rPr>
           <w:u w:val="single"/>
         </w:rPr>
-        <w:t xml:space="preserve">aplicar otros </w:t>
-      </w:r>
-      <w:proofErr w:type="spellStart"/>
-      <w:r>
-        <w:rPr>
-          <w:u w:val="single"/>
-        </w:rPr>
-        <w:t>CPMs</w:t>
-      </w:r>
-      <w:proofErr w:type="spellEnd"/>
-      <w:r>
-        <w:t xml:space="preserve"> y </w:t>
-      </w:r>
-      <w:r>
-        <w:t xml:space="preserve">cuenta con la función </w:t>
-      </w:r>
-      <w:proofErr w:type="spellStart"/>
-      <w:r>
-        <w:rPr>
-          <w:b/>
-          <w:bCs/>
-        </w:rPr>
-        <w:t>random_evam</w:t>
-      </w:r>
-      <w:proofErr w:type="spellEnd"/>
-      <w:r>
-        <w:rPr>
-          <w:b/>
-          <w:bCs/>
-        </w:rPr>
-        <w:t>()</w:t>
-      </w:r>
-      <w:r>
-        <w:t xml:space="preserve"> que permite </w:t>
-      </w:r>
-      <w:r>
-        <w:rPr>
-          <w:u w:val="single"/>
-        </w:rPr>
         <w:t>crear un modelo customizado</w:t>
       </w:r>
       <w:r>
-        <w:t xml:space="preserve"> sin necesidad de disponer de datos</w:t>
-      </w:r>
-      <w:r>
-        <w:t>; y otras</w:t>
-      </w:r>
-      <w:r>
-        <w:t xml:space="preserve"> funcionalidades que aportan los datos para entrenar a los modelos</w:t>
-      </w:r>
-      <w:r>
-        <w:t>.</w:t>
+        <w:t xml:space="preserve"> sin necesidad de disponer de datos; y otras funcionalidades que aportan los datos para entrenar a los modelos.</w:t>
       </w:r>
     </w:p>
     <w:p>
       <w:r>
-        <w:t>Además,</w:t>
-      </w:r>
-      <w:r>
-        <w:t xml:space="preserve"> contiene la función </w:t>
+        <w:t xml:space="preserve">Además, contiene la función </w:t>
       </w:r>
       <w:proofErr w:type="spellStart"/>
       <w:r>
@@ -432,62 +411,38 @@
         <w:t>()</w:t>
       </w:r>
       <w:r>
-        <w:t xml:space="preserve"> que </w:t>
-      </w:r>
-      <w:r>
-        <w:t xml:space="preserve">le </w:t>
-      </w:r>
-      <w:r>
-        <w:t xml:space="preserve">permite calcular </w:t>
-      </w:r>
-      <w:r>
-        <w:t xml:space="preserve">el </w:t>
-      </w:r>
-      <w:r>
-        <w:t xml:space="preserve">lambda óptimo para el conjunto de datos </w:t>
-      </w:r>
-      <w:commentRangeStart w:id="0"/>
+        <w:t xml:space="preserve"> que le permite calcular el lambda óptimo para el conjunto de datos </w:t>
+      </w:r>
+      <w:commentRangeStart w:id="1"/>
       <w:r>
         <w:rPr>
           <w:strike/>
         </w:rPr>
-        <w:t>(</w:t>
-      </w:r>
+        <w:t xml:space="preserve">(indicando los valores de lambda máximo y mínimo, el número de pasos y el número de </w:t>
+      </w:r>
+      <w:proofErr w:type="spellStart"/>
       <w:r>
         <w:rPr>
           <w:strike/>
         </w:rPr>
-        <w:t xml:space="preserve">indicando los valores de lambda máximo y mínimo, el número de pasos y el número de </w:t>
-      </w:r>
-      <w:proofErr w:type="spellStart"/>
+        <w:t>folds</w:t>
+      </w:r>
+      <w:proofErr w:type="spellEnd"/>
       <w:r>
         <w:rPr>
           <w:strike/>
         </w:rPr>
-        <w:t>folds</w:t>
-      </w:r>
-      <w:proofErr w:type="spellEnd"/>
-      <w:r>
-        <w:rPr>
-          <w:strike/>
-        </w:rPr>
-        <w:t>)</w:t>
-      </w:r>
-      <w:r>
-        <w:rPr>
-          <w:strike/>
-        </w:rPr>
-        <w:t>.</w:t>
+        <w:t>).</w:t>
       </w:r>
       <w:r>
         <w:t xml:space="preserve"> </w:t>
       </w:r>
-      <w:commentRangeEnd w:id="0"/>
+      <w:commentRangeEnd w:id="1"/>
       <w:r>
         <w:rPr>
           <w:rStyle w:val="Refdecomentario"/>
         </w:rPr>
-        <w:commentReference w:id="0"/>
+        <w:commentReference w:id="1"/>
       </w:r>
       <w:r>
         <w:t xml:space="preserve">Sin embargo, para </w:t>
@@ -538,10 +493,7 @@
         <w:t>, mientras que R además devuelve, entre otros, la matriz log-Theta exponencial, los ratios de transición y las probabilidades de transición</w:t>
       </w:r>
       <w:r>
-        <w:t xml:space="preserve">; y posee la </w:t>
-      </w:r>
-      <w:r>
-        <w:t xml:space="preserve">función </w:t>
+        <w:t xml:space="preserve">; y posee la función </w:t>
       </w:r>
       <w:proofErr w:type="spellStart"/>
       <w:r>
@@ -560,13 +512,7 @@
         <w:t xml:space="preserve"> </w:t>
       </w:r>
       <w:r>
-        <w:t xml:space="preserve">que permite especificar distintos tipos de gráficos </w:t>
-      </w:r>
-      <w:r>
-        <w:t>a</w:t>
-      </w:r>
-      <w:r>
-        <w:t xml:space="preserve"> representar</w:t>
+        <w:t>que permite especificar distintos tipos de gráficos a representar</w:t>
       </w:r>
       <w:r>
         <w:t xml:space="preserve">. </w:t>
@@ -641,7 +587,7 @@
       <w:r>
         <w:t xml:space="preserve"> R. </w:t>
       </w:r>
-      <w:commentRangeStart w:id="1"/>
+      <w:commentRangeStart w:id="2"/>
       <w:r>
         <w:rPr>
           <w:strike/>
@@ -660,19 +606,19 @@
         </w:rPr>
         <w:t>)</w:t>
       </w:r>
-      <w:commentRangeEnd w:id="1"/>
+      <w:commentRangeEnd w:id="2"/>
       <w:r>
         <w:rPr>
           <w:rStyle w:val="Refdecomentario"/>
         </w:rPr>
-        <w:commentReference w:id="1"/>
+        <w:commentReference w:id="2"/>
       </w:r>
       <w:r>
         <w:t xml:space="preserve"> </w:t>
       </w:r>
     </w:p>
     <w:p>
-      <w:commentRangeStart w:id="2"/>
+      <w:commentRangeStart w:id="3"/>
       <w:r>
         <w:rPr>
           <w:strike/>
@@ -748,12 +694,12 @@
       <w:r>
         <w:t xml:space="preserve"> </w:t>
       </w:r>
-      <w:commentRangeEnd w:id="2"/>
+      <w:commentRangeEnd w:id="3"/>
       <w:r>
         <w:rPr>
           <w:rStyle w:val="Refdecomentario"/>
         </w:rPr>
-        <w:commentReference w:id="2"/>
+        <w:commentReference w:id="3"/>
       </w:r>
       <w:r>
         <w:t xml:space="preserve">En Python, podemos calcular las probabilidad de que una mutación haya precedido a otra sabiendo que ambas se encuentran en el presente mutadas mediante la función </w:t>
@@ -862,18 +808,12 @@
       <w:r>
         <w:t xml:space="preserve">En ocasiones, es necesario combinar herramientas y librerías de diferentes lenguajes de programación con el objetivo de aprovechar sus fortalezas específicas. </w:t>
       </w:r>
-      <w:commentRangeStart w:id="3"/>
+      <w:commentRangeStart w:id="4"/>
       <w:r>
         <w:rPr>
           <w:strike/>
         </w:rPr>
-        <w:t>(</w:t>
-      </w:r>
-      <w:r>
-        <w:rPr>
-          <w:strike/>
-        </w:rPr>
-        <w:t xml:space="preserve">La integración entre los lenguajes de Python y R puede ser clave, permitiendo así disponer de las </w:t>
+        <w:t xml:space="preserve">(La integración entre los lenguajes de Python y R puede ser clave, permitiendo así disponer de las </w:t>
       </w:r>
       <w:r>
         <w:rPr>
@@ -896,42 +836,30 @@
         <w:rPr>
           <w:strike/>
         </w:rPr>
-        <w:t xml:space="preserve"> y</w:t>
-      </w:r>
-      <w:r>
-        <w:rPr>
+        <w:t xml:space="preserve"> y </w:t>
+      </w:r>
+      <w:proofErr w:type="spellStart"/>
+      <w:r>
+        <w:rPr>
+          <w:b/>
+          <w:bCs/>
           <w:strike/>
         </w:rPr>
-        <w:t xml:space="preserve"> </w:t>
-      </w:r>
-      <w:proofErr w:type="spellStart"/>
-      <w:r>
-        <w:rPr>
-          <w:b/>
-          <w:bCs/>
+        <w:t>evamtools</w:t>
+      </w:r>
+      <w:proofErr w:type="spellEnd"/>
+      <w:r>
+        <w:rPr>
           <w:strike/>
         </w:rPr>
-        <w:t>evamtools</w:t>
-      </w:r>
-      <w:proofErr w:type="spellEnd"/>
-      <w:r>
-        <w:rPr>
-          <w:strike/>
-        </w:rPr>
-        <w:t>) para poder desarrollar proyectos más complejos.</w:t>
-      </w:r>
-      <w:r>
-        <w:rPr>
-          <w:strike/>
-        </w:rPr>
-        <w:t>)</w:t>
-      </w:r>
-      <w:commentRangeEnd w:id="3"/>
+        <w:t>) para poder desarrollar proyectos más complejos.)</w:t>
+      </w:r>
+      <w:commentRangeEnd w:id="4"/>
       <w:r>
         <w:rPr>
           <w:rStyle w:val="Refdecomentario"/>
         </w:rPr>
-        <w:commentReference w:id="3"/>
+        <w:commentReference w:id="4"/>
       </w:r>
     </w:p>
     <w:p>
@@ -992,19 +920,19 @@
       <w:r>
         <w:t xml:space="preserve"> </w:t>
       </w:r>
-      <w:commentRangeStart w:id="4"/>
+      <w:commentRangeStart w:id="5"/>
       <w:r>
         <w:rPr>
           <w:color w:val="7F7F7F" w:themeColor="text1" w:themeTint="80"/>
         </w:rPr>
         <w:t xml:space="preserve">debido a su simplicidad, flexibilidad y su fácil acceso a las numerosas librerías de Python. </w:t>
       </w:r>
-      <w:commentRangeEnd w:id="4"/>
+      <w:commentRangeEnd w:id="5"/>
       <w:r>
         <w:rPr>
           <w:rStyle w:val="Refdecomentario"/>
         </w:rPr>
-        <w:commentReference w:id="4"/>
+        <w:commentReference w:id="5"/>
       </w:r>
     </w:p>
     <w:p>
@@ -1106,7 +1034,7 @@
       <w:r>
         <w:t>Transferencia de datos entre lenguajes:</w:t>
       </w:r>
-      <w:commentRangeStart w:id="5"/>
+      <w:commentRangeStart w:id="6"/>
       <w:r>
         <w:t xml:space="preserve"> </w:t>
       </w:r>
@@ -1116,12 +1044,12 @@
         </w:rPr>
         <w:t>Probar la transferencia de datos y verificar la correcta ejecución de las funciones.</w:t>
       </w:r>
-      <w:commentRangeEnd w:id="5"/>
+      <w:commentRangeEnd w:id="6"/>
       <w:r>
         <w:rPr>
           <w:rStyle w:val="Refdecomentario"/>
         </w:rPr>
-        <w:commentReference w:id="5"/>
+        <w:commentReference w:id="6"/>
       </w:r>
     </w:p>
     <w:p/>
@@ -1199,7 +1127,7 @@
       <w:r>
         <w:t xml:space="preserve">s opciones </w:t>
       </w:r>
-      <w:commentRangeStart w:id="6"/>
+      <w:commentRangeStart w:id="7"/>
       <w:r>
         <w:t>(</w:t>
       </w:r>
@@ -1212,12 +1140,12 @@
       <w:r>
         <w:t xml:space="preserve">), </w:t>
       </w:r>
-      <w:commentRangeEnd w:id="6"/>
+      <w:commentRangeEnd w:id="7"/>
       <w:r>
         <w:rPr>
           <w:rStyle w:val="Refdecomentario"/>
         </w:rPr>
-        <w:commentReference w:id="6"/>
+        <w:commentReference w:id="7"/>
       </w:r>
       <w:r>
         <w:t>pero los valores no coincidían</w:t>
@@ -1299,16 +1227,16 @@
       <w:r>
         <w:t xml:space="preserve">, </w:t>
       </w:r>
-      <w:commentRangeStart w:id="7"/>
+      <w:commentRangeStart w:id="8"/>
       <w:r>
         <w:t>los resultados de la matriz son idénticos.</w:t>
       </w:r>
-      <w:commentRangeEnd w:id="7"/>
+      <w:commentRangeEnd w:id="8"/>
       <w:r>
         <w:rPr>
           <w:rStyle w:val="Refdecomentario"/>
         </w:rPr>
-        <w:commentReference w:id="7"/>
+        <w:commentReference w:id="8"/>
       </w:r>
     </w:p>
     <w:sectPr>
@@ -1323,7 +1251,23 @@
 
 <file path=word/comments.xml><?xml version="1.0" encoding="utf-8"?>
 <w:comments xmlns:wpc="http://schemas.microsoft.com/office/word/2010/wordprocessingCanvas" xmlns:cx="http://schemas.microsoft.com/office/drawing/2014/chartex" xmlns:cx1="http://schemas.microsoft.com/office/drawing/2015/9/8/chartex" xmlns:cx2="http://schemas.microsoft.com/office/drawing/2015/10/21/chartex" xmlns:cx3="http://schemas.microsoft.com/office/drawing/2016/5/9/chartex" xmlns:cx4="http://schemas.microsoft.com/office/drawing/2016/5/10/chartex" xmlns:cx5="http://schemas.microsoft.com/office/drawing/2016/5/11/chartex" xmlns:cx6="http://schemas.microsoft.com/office/drawing/2016/5/12/chartex" xmlns:cx7="http://schemas.microsoft.com/office/drawing/2016/5/13/chartex" xmlns:cx8="http://schemas.microsoft.com/office/drawing/2016/5/14/chartex" xmlns:mc="http://schemas.openxmlformats.org/markup-compatibility/2006" xmlns:aink="http://schemas.microsoft.com/office/drawing/2016/ink" xmlns:am3d="http://schemas.microsoft.com/office/drawing/2017/model3d" xmlns:o="urn:schemas-microsoft-com:office:office" xmlns:oel="http://schemas.microsoft.com/office/2019/extlst" xmlns:r="http://schemas.openxmlformats.org/officeDocument/2006/relationships" xmlns:m="http://schemas.openxmlformats.org/officeDocument/2006/math" xmlns:v="urn:schemas-microsoft-com:vml" xmlns:wp14="http://schemas.microsoft.com/office/word/2010/wordprocessingDrawing" xmlns:wp="http://schemas.openxmlformats.org/drawingml/2006/wordprocessingDrawing" xmlns:w10="urn:schemas-microsoft-com:office:word" xmlns:w="http://schemas.openxmlformats.org/wordprocessingml/2006/main" xmlns:w14="http://schemas.microsoft.com/office/word/2010/wordml" xmlns:w15="http://schemas.microsoft.com/office/word/2012/wordml" xmlns:w16cex="http://schemas.microsoft.com/office/word/2018/wordml/cex" xmlns:w16cid="http://schemas.microsoft.com/office/word/2016/wordml/cid" xmlns:w16="http://schemas.microsoft.com/office/word/2018/wordml" xmlns:w16du="http://schemas.microsoft.com/office/word/2023/wordml/word16du" xmlns:w16sdtdh="http://schemas.microsoft.com/office/word/2020/wordml/sdtdatahash" xmlns:w16sdtfl="http://schemas.microsoft.com/office/word/2024/wordml/sdtformatlock" xmlns:w16se="http://schemas.microsoft.com/office/word/2015/wordml/symex" xmlns:wpg="http://schemas.microsoft.com/office/word/2010/wordprocessingGroup" xmlns:wpi="http://schemas.microsoft.com/office/word/2010/wordprocessingInk" xmlns:wne="http://schemas.microsoft.com/office/word/2006/wordml" xmlns:wps="http://schemas.microsoft.com/office/word/2010/wordprocessingShape" mc:Ignorable="w14 w15 w16se w16cid w16 w16cex w16sdtdh w16sdtfl w16du wp14">
-  <w:comment w:id="0" w:author="Daniel Parra" w:date="2025-01-06T10:18:00Z" w:initials="DP">
+  <w:comment w:id="0" w:author="Daniel Parra" w:date="2025-01-07T09:13:00Z" w:initials="DP">
+    <w:p>
+      <w:pPr>
+        <w:pStyle w:val="Textocomentario"/>
+      </w:pPr>
+      <w:r>
+        <w:rPr>
+          <w:rStyle w:val="Refdecomentario"/>
+        </w:rPr>
+        <w:annotationRef/>
+      </w:r>
+      <w:r>
+        <w:t>Para quitarlo, es un detallito</w:t>
+      </w:r>
+    </w:p>
+  </w:comment>
+  <w:comment w:id="1" w:author="Daniel Parra" w:date="2025-01-06T10:18:00Z" w:initials="DP">
     <w:p>
       <w:pPr>
         <w:pStyle w:val="Textocomentario"/>
@@ -1343,7 +1287,7 @@
       </w:r>
     </w:p>
   </w:comment>
-  <w:comment w:id="1" w:author="Daniel Parra Gutiérrez" w:date="2025-01-06T10:30:00Z" w:initials="DP">
+  <w:comment w:id="2" w:author="Daniel Parra Gutiérrez" w:date="2025-01-06T10:30:00Z" w:initials="DP">
     <w:p>
       <w:pPr>
         <w:pStyle w:val="Textocomentario"/>
@@ -1359,7 +1303,7 @@
       </w:r>
     </w:p>
   </w:comment>
-  <w:comment w:id="2" w:author="Daniel Parra Gutiérrez" w:date="2025-01-06T10:41:00Z" w:initials="DP">
+  <w:comment w:id="3" w:author="Daniel Parra Gutiérrez" w:date="2025-01-06T10:41:00Z" w:initials="DP">
     <w:p>
       <w:pPr>
         <w:pStyle w:val="Textocomentario"/>
@@ -1379,7 +1323,7 @@
       </w:r>
     </w:p>
   </w:comment>
-  <w:comment w:id="3" w:author="Daniel Parra Gutiérrez" w:date="2025-01-06T11:00:00Z" w:initials="DP">
+  <w:comment w:id="4" w:author="Daniel Parra Gutiérrez" w:date="2025-01-06T11:00:00Z" w:initials="DP">
     <w:p>
       <w:pPr>
         <w:pStyle w:val="Textocomentario"/>
@@ -1395,7 +1339,7 @@
       </w:r>
     </w:p>
   </w:comment>
-  <w:comment w:id="4" w:author="Daniel Parra Gutiérrez" w:date="2025-01-06T11:05:00Z" w:initials="DP">
+  <w:comment w:id="5" w:author="Daniel Parra Gutiérrez" w:date="2025-01-06T11:05:00Z" w:initials="DP">
     <w:p>
       <w:pPr>
         <w:pStyle w:val="Textocomentario"/>
@@ -1411,7 +1355,7 @@
       </w:r>
     </w:p>
   </w:comment>
-  <w:comment w:id="5" w:author="Daniel Parra Gutiérrez" w:date="2025-01-06T11:02:00Z" w:initials="DP">
+  <w:comment w:id="6" w:author="Daniel Parra Gutiérrez" w:date="2025-01-06T11:02:00Z" w:initials="DP">
     <w:p>
       <w:pPr>
         <w:pStyle w:val="Textocomentario"/>
@@ -1427,7 +1371,7 @@
       </w:r>
     </w:p>
   </w:comment>
-  <w:comment w:id="6" w:author="Daniel Parra Gutiérrez" w:date="2025-01-06T11:54:00Z" w:initials="DP">
+  <w:comment w:id="7" w:author="Daniel Parra Gutiérrez" w:date="2025-01-06T11:54:00Z" w:initials="DP">
     <w:p>
       <w:pPr>
         <w:pStyle w:val="Textocomentario"/>
@@ -1443,7 +1387,7 @@
       </w:r>
     </w:p>
   </w:comment>
-  <w:comment w:id="7" w:author="Daniel Parra Gutiérrez" w:date="2025-01-06T11:59:00Z" w:initials="DP">
+  <w:comment w:id="8" w:author="Daniel Parra Gutiérrez" w:date="2025-01-06T11:59:00Z" w:initials="DP">
     <w:p>
       <w:pPr>
         <w:pStyle w:val="Textocomentario"/>
@@ -1464,6 +1408,7 @@
 
 <file path=word/commentsExtended.xml><?xml version="1.0" encoding="utf-8"?>
 <w15:commentsEx xmlns:wpc="http://schemas.microsoft.com/office/word/2010/wordprocessingCanvas" xmlns:cx="http://schemas.microsoft.com/office/drawing/2014/chartex" xmlns:cx1="http://schemas.microsoft.com/office/drawing/2015/9/8/chartex" xmlns:cx2="http://schemas.microsoft.com/office/drawing/2015/10/21/chartex" xmlns:cx3="http://schemas.microsoft.com/office/drawing/2016/5/9/chartex" xmlns:cx4="http://schemas.microsoft.com/office/drawing/2016/5/10/chartex" xmlns:cx5="http://schemas.microsoft.com/office/drawing/2016/5/11/chartex" xmlns:cx6="http://schemas.microsoft.com/office/drawing/2016/5/12/chartex" xmlns:cx7="http://schemas.microsoft.com/office/drawing/2016/5/13/chartex" xmlns:cx8="http://schemas.microsoft.com/office/drawing/2016/5/14/chartex" xmlns:mc="http://schemas.openxmlformats.org/markup-compatibility/2006" xmlns:aink="http://schemas.microsoft.com/office/drawing/2016/ink" xmlns:am3d="http://schemas.microsoft.com/office/drawing/2017/model3d" xmlns:o="urn:schemas-microsoft-com:office:office" xmlns:oel="http://schemas.microsoft.com/office/2019/extlst" xmlns:r="http://schemas.openxmlformats.org/officeDocument/2006/relationships" xmlns:m="http://schemas.openxmlformats.org/officeDocument/2006/math" xmlns:v="urn:schemas-microsoft-com:vml" xmlns:wp14="http://schemas.microsoft.com/office/word/2010/wordprocessingDrawing" xmlns:wp="http://schemas.openxmlformats.org/drawingml/2006/wordprocessingDrawing" xmlns:w10="urn:schemas-microsoft-com:office:word" xmlns:w="http://schemas.openxmlformats.org/wordprocessingml/2006/main" xmlns:w14="http://schemas.microsoft.com/office/word/2010/wordml" xmlns:w15="http://schemas.microsoft.com/office/word/2012/wordml" xmlns:w16cex="http://schemas.microsoft.com/office/word/2018/wordml/cex" xmlns:w16cid="http://schemas.microsoft.com/office/word/2016/wordml/cid" xmlns:w16="http://schemas.microsoft.com/office/word/2018/wordml" xmlns:w16du="http://schemas.microsoft.com/office/word/2023/wordml/word16du" xmlns:w16sdtdh="http://schemas.microsoft.com/office/word/2020/wordml/sdtdatahash" xmlns:w16sdtfl="http://schemas.microsoft.com/office/word/2024/wordml/sdtformatlock" xmlns:w16se="http://schemas.microsoft.com/office/word/2015/wordml/symex" xmlns:wpg="http://schemas.microsoft.com/office/word/2010/wordprocessingGroup" xmlns:wpi="http://schemas.microsoft.com/office/word/2010/wordprocessingInk" xmlns:wne="http://schemas.microsoft.com/office/word/2006/wordml" xmlns:wps="http://schemas.microsoft.com/office/word/2010/wordprocessingShape" mc:Ignorable="w14 w15 w16se w16cid w16 w16cex w16sdtdh w16sdtfl w16du wp14">
+  <w15:commentEx w15:paraId="377670DF" w15:done="0"/>
   <w15:commentEx w15:paraId="72217A0A" w15:done="0"/>
   <w15:commentEx w15:paraId="3ABA5523" w15:done="0"/>
   <w15:commentEx w15:paraId="30E09FCF" w15:done="0"/>
@@ -1477,6 +1422,7 @@
 
 <file path=word/commentsExtensible.xml><?xml version="1.0" encoding="utf-8"?>
 <w16cex:commentsExtensible xmlns:wpc="http://schemas.microsoft.com/office/word/2010/wordprocessingCanvas" xmlns:cx="http://schemas.microsoft.com/office/drawing/2014/chartex" xmlns:cx1="http://schemas.microsoft.com/office/drawing/2015/9/8/chartex" xmlns:cx2="http://schemas.microsoft.com/office/drawing/2015/10/21/chartex" xmlns:cx3="http://schemas.microsoft.com/office/drawing/2016/5/9/chartex" xmlns:cx4="http://schemas.microsoft.com/office/drawing/2016/5/10/chartex" xmlns:cx5="http://schemas.microsoft.com/office/drawing/2016/5/11/chartex" xmlns:cx6="http://schemas.microsoft.com/office/drawing/2016/5/12/chartex" xmlns:cx7="http://schemas.microsoft.com/office/drawing/2016/5/13/chartex" xmlns:cx8="http://schemas.microsoft.com/office/drawing/2016/5/14/chartex" xmlns:cr="http://schemas.microsoft.com/office/comments/2020/reactions" xmlns:mc="http://schemas.openxmlformats.org/markup-compatibility/2006" xmlns:aink="http://schemas.microsoft.com/office/drawing/2016/ink" xmlns:am3d="http://schemas.microsoft.com/office/drawing/2017/model3d" xmlns:o="urn:schemas-microsoft-com:office:office" xmlns:oel="http://schemas.microsoft.com/office/2019/extlst" xmlns:r="http://schemas.openxmlformats.org/officeDocument/2006/relationships" xmlns:m="http://schemas.openxmlformats.org/officeDocument/2006/math" xmlns:v="urn:schemas-microsoft-com:vml" xmlns:wp14="http://schemas.microsoft.com/office/word/2010/wordprocessingDrawing" xmlns:wp="http://schemas.openxmlformats.org/drawingml/2006/wordprocessingDrawing" xmlns:w10="urn:schemas-microsoft-com:office:word" xmlns:w="http://schemas.openxmlformats.org/wordprocessingml/2006/main" xmlns:w14="http://schemas.microsoft.com/office/word/2010/wordml" xmlns:w15="http://schemas.microsoft.com/office/word/2012/wordml" xmlns:w16cex="http://schemas.microsoft.com/office/word/2018/wordml/cex" xmlns:w16cid="http://schemas.microsoft.com/office/word/2016/wordml/cid" xmlns:w16="http://schemas.microsoft.com/office/word/2018/wordml" xmlns:w16du="http://schemas.microsoft.com/office/word/2023/wordml/word16du" xmlns:w16sdtdh="http://schemas.microsoft.com/office/word/2020/wordml/sdtdatahash" xmlns:w16sdtfl="http://schemas.microsoft.com/office/word/2024/wordml/sdtformatlock" xmlns:w16se="http://schemas.microsoft.com/office/word/2015/wordml/symex" xmlns:wpg="http://schemas.microsoft.com/office/word/2010/wordprocessingGroup" xmlns:wpi="http://schemas.microsoft.com/office/word/2010/wordprocessingInk" xmlns:wne="http://schemas.microsoft.com/office/word/2006/wordml" xmlns:wps="http://schemas.microsoft.com/office/word/2010/wordprocessingShape" mc:Ignorable="w14 w15 w16se w16cid w16 w16cex w16sdtdh w16sdtfl cr w16du wp14">
+  <w16cex:commentExtensible w16cex:durableId="6403676D" w16cex:dateUtc="2025-01-07T08:13:00Z"/>
   <w16cex:commentExtensible w16cex:durableId="18200464" w16cex:dateUtc="2025-01-06T09:18:00Z"/>
   <w16cex:commentExtensible w16cex:durableId="427B5BD5" w16cex:dateUtc="2025-01-06T09:30:00Z"/>
   <w16cex:commentExtensible w16cex:durableId="5E55D6E7" w16cex:dateUtc="2025-01-06T09:41:00Z"/>
@@ -1490,6 +1436,7 @@
 
 <file path=word/commentsIds.xml><?xml version="1.0" encoding="utf-8"?>
 <w16cid:commentsIds xmlns:wpc="http://schemas.microsoft.com/office/word/2010/wordprocessingCanvas" xmlns:cx="http://schemas.microsoft.com/office/drawing/2014/chartex" xmlns:cx1="http://schemas.microsoft.com/office/drawing/2015/9/8/chartex" xmlns:cx2="http://schemas.microsoft.com/office/drawing/2015/10/21/chartex" xmlns:cx3="http://schemas.microsoft.com/office/drawing/2016/5/9/chartex" xmlns:cx4="http://schemas.microsoft.com/office/drawing/2016/5/10/chartex" xmlns:cx5="http://schemas.microsoft.com/office/drawing/2016/5/11/chartex" xmlns:cx6="http://schemas.microsoft.com/office/drawing/2016/5/12/chartex" xmlns:cx7="http://schemas.microsoft.com/office/drawing/2016/5/13/chartex" xmlns:cx8="http://schemas.microsoft.com/office/drawing/2016/5/14/chartex" xmlns:mc="http://schemas.openxmlformats.org/markup-compatibility/2006" xmlns:aink="http://schemas.microsoft.com/office/drawing/2016/ink" xmlns:am3d="http://schemas.microsoft.com/office/drawing/2017/model3d" xmlns:o="urn:schemas-microsoft-com:office:office" xmlns:oel="http://schemas.microsoft.com/office/2019/extlst" xmlns:r="http://schemas.openxmlformats.org/officeDocument/2006/relationships" xmlns:m="http://schemas.openxmlformats.org/officeDocument/2006/math" xmlns:v="urn:schemas-microsoft-com:vml" xmlns:wp14="http://schemas.microsoft.com/office/word/2010/wordprocessingDrawing" xmlns:wp="http://schemas.openxmlformats.org/drawingml/2006/wordprocessingDrawing" xmlns:w10="urn:schemas-microsoft-com:office:word" xmlns:w="http://schemas.openxmlformats.org/wordprocessingml/2006/main" xmlns:w14="http://schemas.microsoft.com/office/word/2010/wordml" xmlns:w15="http://schemas.microsoft.com/office/word/2012/wordml" xmlns:w16cex="http://schemas.microsoft.com/office/word/2018/wordml/cex" xmlns:w16cid="http://schemas.microsoft.com/office/word/2016/wordml/cid" xmlns:w16="http://schemas.microsoft.com/office/word/2018/wordml" xmlns:w16du="http://schemas.microsoft.com/office/word/2023/wordml/word16du" xmlns:w16sdtdh="http://schemas.microsoft.com/office/word/2020/wordml/sdtdatahash" xmlns:w16sdtfl="http://schemas.microsoft.com/office/word/2024/wordml/sdtformatlock" xmlns:w16se="http://schemas.microsoft.com/office/word/2015/wordml/symex" xmlns:wpg="http://schemas.microsoft.com/office/word/2010/wordprocessingGroup" xmlns:wpi="http://schemas.microsoft.com/office/word/2010/wordprocessingInk" xmlns:wne="http://schemas.microsoft.com/office/word/2006/wordml" xmlns:wps="http://schemas.microsoft.com/office/word/2010/wordprocessingShape" mc:Ignorable="w14 w15 w16se w16cid w16 w16cex w16sdtdh w16sdtfl w16du wp14">
+  <w16cid:commentId w16cid:paraId="377670DF" w16cid:durableId="6403676D"/>
   <w16cid:commentId w16cid:paraId="72217A0A" w16cid:durableId="18200464"/>
   <w16cid:commentId w16cid:paraId="3ABA5523" w16cid:durableId="427B5BD5"/>
   <w16cid:commentId w16cid:paraId="30E09FCF" w16cid:durableId="5E55D6E7"/>
@@ -2324,6 +2271,7 @@
   <w:style w:type="character" w:default="1" w:styleId="Fuentedeprrafopredeter">
     <w:name w:val="Default Paragraph Font"/>
     <w:uiPriority w:val="1"/>
+    <w:semiHidden/>
     <w:unhideWhenUsed/>
   </w:style>
   <w:style w:type="table" w:default="1" w:styleId="Tablanormal">

</xml_diff>

<commit_message>
Cambio de una palabra
</commit_message>
<xml_diff>
--- a/Guiones/Guion_Dani.docx
+++ b/Guiones/Guion_Dani.docx
@@ -1,6 +1,6 @@
 
 <file path=word/document.xml><?xml version="1.0" encoding="utf-8"?>
-<w:document xmlns:wpc="http://schemas.microsoft.com/office/word/2010/wordprocessingCanvas" xmlns:cx="http://schemas.microsoft.com/office/drawing/2014/chartex" xmlns:cx1="http://schemas.microsoft.com/office/drawing/2015/9/8/chartex" xmlns:cx2="http://schemas.microsoft.com/office/drawing/2015/10/21/chartex" xmlns:cx3="http://schemas.microsoft.com/office/drawing/2016/5/9/chartex" xmlns:cx4="http://schemas.microsoft.com/office/drawing/2016/5/10/chartex" xmlns:cx5="http://schemas.microsoft.com/office/drawing/2016/5/11/chartex" xmlns:cx6="http://schemas.microsoft.com/office/drawing/2016/5/12/chartex" xmlns:cx7="http://schemas.microsoft.com/office/drawing/2016/5/13/chartex" xmlns:cx8="http://schemas.microsoft.com/office/drawing/2016/5/14/chartex" xmlns:mc="http://schemas.openxmlformats.org/markup-compatibility/2006" xmlns:aink="http://schemas.microsoft.com/office/drawing/2016/ink" xmlns:am3d="http://schemas.microsoft.com/office/drawing/2017/model3d" xmlns:o="urn:schemas-microsoft-com:office:office" xmlns:oel="http://schemas.microsoft.com/office/2019/extlst" xmlns:r="http://schemas.openxmlformats.org/officeDocument/2006/relationships" xmlns:m="http://schemas.openxmlformats.org/officeDocument/2006/math" xmlns:v="urn:schemas-microsoft-com:vml" xmlns:wp14="http://schemas.microsoft.com/office/word/2010/wordprocessingDrawing" xmlns:wp="http://schemas.openxmlformats.org/drawingml/2006/wordprocessingDrawing" xmlns:w10="urn:schemas-microsoft-com:office:word" xmlns:w="http://schemas.openxmlformats.org/wordprocessingml/2006/main" xmlns:w14="http://schemas.microsoft.com/office/word/2010/wordml" xmlns:w15="http://schemas.microsoft.com/office/word/2012/wordml" xmlns:w16cex="http://schemas.microsoft.com/office/word/2018/wordml/cex" xmlns:w16cid="http://schemas.microsoft.com/office/word/2016/wordml/cid" xmlns:w16="http://schemas.microsoft.com/office/word/2018/wordml" xmlns:w16du="http://schemas.microsoft.com/office/word/2023/wordml/word16du" xmlns:w16sdtdh="http://schemas.microsoft.com/office/word/2020/wordml/sdtdatahash" xmlns:w16sdtfl="http://schemas.microsoft.com/office/word/2024/wordml/sdtformatlock" xmlns:w16se="http://schemas.microsoft.com/office/word/2015/wordml/symex" xmlns:wpg="http://schemas.microsoft.com/office/word/2010/wordprocessingGroup" xmlns:wpi="http://schemas.microsoft.com/office/word/2010/wordprocessingInk" xmlns:wne="http://schemas.microsoft.com/office/word/2006/wordml" xmlns:wps="http://schemas.microsoft.com/office/word/2010/wordprocessingShape" mc:Ignorable="w14 w15 w16se w16cid w16 w16cex w16sdtdh w16sdtfl w16du wp14">
+<w:document xmlns:wpc="http://schemas.microsoft.com/office/word/2010/wordprocessingCanvas" xmlns:cx="http://schemas.microsoft.com/office/drawing/2014/chartex" xmlns:cx1="http://schemas.microsoft.com/office/drawing/2015/9/8/chartex" xmlns:cx2="http://schemas.microsoft.com/office/drawing/2015/10/21/chartex" xmlns:cx3="http://schemas.microsoft.com/office/drawing/2016/5/9/chartex" xmlns:cx4="http://schemas.microsoft.com/office/drawing/2016/5/10/chartex" xmlns:cx5="http://schemas.microsoft.com/office/drawing/2016/5/11/chartex" xmlns:cx6="http://schemas.microsoft.com/office/drawing/2016/5/12/chartex" xmlns:cx7="http://schemas.microsoft.com/office/drawing/2016/5/13/chartex" xmlns:cx8="http://schemas.microsoft.com/office/drawing/2016/5/14/chartex" xmlns:mc="http://schemas.openxmlformats.org/markup-compatibility/2006" xmlns:aink="http://schemas.microsoft.com/office/drawing/2016/ink" xmlns:am3d="http://schemas.microsoft.com/office/drawing/2017/model3d" xmlns:o="urn:schemas-microsoft-com:office:office" xmlns:oel="http://schemas.microsoft.com/office/2019/extlst" xmlns:r="http://schemas.openxmlformats.org/officeDocument/2006/relationships" xmlns:m="http://schemas.openxmlformats.org/officeDocument/2006/math" xmlns:v="urn:schemas-microsoft-com:vml" xmlns:wp14="http://schemas.microsoft.com/office/word/2010/wordprocessingDrawing" xmlns:wp="http://schemas.openxmlformats.org/drawingml/2006/wordprocessingDrawing" xmlns:w10="urn:schemas-microsoft-com:office:word" xmlns:w="http://schemas.openxmlformats.org/wordprocessingml/2006/main" xmlns:w14="http://schemas.microsoft.com/office/word/2010/wordml" xmlns:w15="http://schemas.microsoft.com/office/word/2012/wordml" xmlns:w16cex="http://schemas.microsoft.com/office/word/2018/wordml/cex" xmlns:w16cid="http://schemas.microsoft.com/office/word/2016/wordml/cid" xmlns:w16="http://schemas.microsoft.com/office/word/2018/wordml" xmlns:w16du="http://schemas.microsoft.com/office/word/2023/wordml/word16du" xmlns:w16sdtdh="http://schemas.microsoft.com/office/word/2020/wordml/sdtdatahash" xmlns:w16se="http://schemas.microsoft.com/office/word/2015/wordml/symex" xmlns:wpg="http://schemas.microsoft.com/office/word/2010/wordprocessingGroup" xmlns:wpi="http://schemas.microsoft.com/office/word/2010/wordprocessingInk" xmlns:wne="http://schemas.microsoft.com/office/word/2006/wordml" xmlns:wps="http://schemas.microsoft.com/office/word/2010/wordprocessingShape" mc:Ignorable="w14 w15 w16se w16cid w16 w16cex w16sdtdh w16du wp14">
   <w:body>
     <w:p>
       <w:pPr>
@@ -33,7 +33,6 @@
       <w:r>
         <w:t xml:space="preserve">Comparativa entre las funcionalidades de </w:t>
       </w:r>
-      <w:proofErr w:type="spellStart"/>
       <w:r>
         <w:rPr>
           <w:b/>
@@ -41,22 +40,13 @@
         </w:rPr>
         <w:t>evamtools</w:t>
       </w:r>
-      <w:proofErr w:type="spellEnd"/>
       <w:r>
         <w:t xml:space="preserve"> y su página web</w:t>
       </w:r>
     </w:p>
     <w:p>
       <w:r>
-        <w:t xml:space="preserve">Ambos calculan un modelo MHN sin </w:t>
-      </w:r>
-      <w:proofErr w:type="spellStart"/>
-      <w:r>
-        <w:t>correción</w:t>
-      </w:r>
-      <w:proofErr w:type="spellEnd"/>
-      <w:r>
-        <w:t xml:space="preserve"> de sesgo </w:t>
+        <w:t xml:space="preserve">Ambos calculan un modelo MHN sin correción de sesgo </w:t>
       </w:r>
       <w:commentRangeStart w:id="0"/>
       <w:r>
@@ -118,7 +108,6 @@
       <w:r>
         <w:t xml:space="preserve">La página web permite introducir la frecuencia de los genotipos de forma manual y, los datos cargados pueden ser modificados. El cálculo del modelo se realiza con la función </w:t>
       </w:r>
-      <w:proofErr w:type="spellStart"/>
       <w:r>
         <w:rPr>
           <w:b/>
@@ -126,7 +115,6 @@
         </w:rPr>
         <w:t>evam</w:t>
       </w:r>
-      <w:proofErr w:type="spellEnd"/>
       <w:r>
         <w:t xml:space="preserve"> del paquete </w:t>
       </w:r>
@@ -134,13 +122,8 @@
         <w:t xml:space="preserve">y se </w:t>
       </w:r>
       <w:r>
-        <w:t>pueden especificar parámetros como el número de núcleos (</w:t>
-      </w:r>
-      <w:proofErr w:type="spellStart"/>
-      <w:r>
-        <w:t>core</w:t>
-      </w:r>
-      <w:proofErr w:type="spellEnd"/>
+        <w:t>pueden especificar parámetros como el número de núcleos (core</w:t>
+      </w:r>
       <w:r>
         <w:t>, sólo desde R</w:t>
       </w:r>
@@ -154,33 +137,15 @@
         <w:t>dos</w:t>
       </w:r>
       <w:r>
-        <w:t xml:space="preserve">, el </w:t>
-      </w:r>
-      <w:proofErr w:type="spellStart"/>
-      <w:r>
-        <w:t>hiperparámetro</w:t>
-      </w:r>
-      <w:proofErr w:type="spellEnd"/>
-      <w:r>
-        <w:t xml:space="preserve"> lambda (</w:t>
-      </w:r>
-      <w:proofErr w:type="spellStart"/>
+        <w:t>, el hiperparámetro lambda (</w:t>
+      </w:r>
       <w:r>
         <w:rPr>
           <w:i/>
           <w:iCs/>
           <w:color w:val="7F7F7F" w:themeColor="text1" w:themeTint="80"/>
         </w:rPr>
-        <w:t>hiperparámetro</w:t>
-      </w:r>
-      <w:proofErr w:type="spellEnd"/>
-      <w:r>
-        <w:rPr>
-          <w:i/>
-          <w:iCs/>
-          <w:color w:val="7F7F7F" w:themeColor="text1" w:themeTint="80"/>
-        </w:rPr>
-        <w:t xml:space="preserve"> = un parámetro cuyo valor se utiliza para controlar el proceso de aprendizaje</w:t>
+        <w:t>hiperparámetro = un parámetro cuyo valor se utiliza para controlar el proceso de aprendizaje</w:t>
       </w:r>
       <w:r>
         <w:t xml:space="preserve">). </w:t>
@@ -245,39 +210,141 @@
         </w:numPr>
       </w:pPr>
       <w:r>
-        <w:t xml:space="preserve">Comparativa entre las funcionalidades de </w:t>
-      </w:r>
-      <w:proofErr w:type="spellStart"/>
-      <w:r>
+        <w:t>Comparativa entre las funcionalidades de evamtools y mhn</w:t>
+      </w:r>
+    </w:p>
+    <w:p>
+      <w:r>
+        <w:t xml:space="preserve">Respecto al paquete </w:t>
+      </w:r>
+      <w:r>
+        <w:rPr>
+          <w:b/>
+          <w:bCs/>
+        </w:rPr>
+        <w:t>mhn</w:t>
+      </w:r>
+      <w:r>
+        <w:t xml:space="preserve"> de Python y </w:t>
+      </w:r>
+      <w:r>
+        <w:rPr>
+          <w:b/>
+          <w:bCs/>
+        </w:rPr>
         <w:t>evamtools</w:t>
       </w:r>
-      <w:proofErr w:type="spellEnd"/>
+      <w:r>
+        <w:t xml:space="preserve"> de R, el primero</w:t>
+      </w:r>
+      <w:r>
+        <w:t xml:space="preserve"> está </w:t>
+      </w:r>
+      <w:r>
+        <w:rPr>
+          <w:u w:val="single"/>
+        </w:rPr>
+        <w:t xml:space="preserve">limitado a los modelos MHN </w:t>
+      </w:r>
+      <w:r>
+        <w:t>y</w:t>
+      </w:r>
+      <w:r>
+        <w:t xml:space="preserve"> puede </w:t>
+      </w:r>
+      <w:r>
+        <w:rPr>
+          <w:u w:val="single"/>
+        </w:rPr>
+        <w:t>calcular el oMHN</w:t>
+      </w:r>
+      <w:r>
+        <w:t xml:space="preserve"> (aplicando la correción del sesgo).</w:t>
+      </w:r>
+      <w:r>
+        <w:t xml:space="preserve"> Sin embargo</w:t>
+      </w:r>
+      <w:r>
+        <w:t>,</w:t>
+      </w:r>
+      <w:r>
+        <w:t xml:space="preserve"> el segundo </w:t>
+      </w:r>
+      <w:r>
+        <w:t xml:space="preserve">puede </w:t>
+      </w:r>
+      <w:r>
+        <w:rPr>
+          <w:u w:val="single"/>
+        </w:rPr>
+        <w:t>aplicar otros CPMs</w:t>
+      </w:r>
       <w:r>
         <w:t xml:space="preserve"> y </w:t>
       </w:r>
-      <w:proofErr w:type="spellStart"/>
-      <w:r>
-        <w:t>mhn</w:t>
-      </w:r>
-      <w:proofErr w:type="spellEnd"/>
-    </w:p>
-    <w:p>
-      <w:r>
-        <w:t xml:space="preserve">Respecto al paquete </w:t>
-      </w:r>
-      <w:proofErr w:type="spellStart"/>
-      <w:r>
-        <w:rPr>
-          <w:b/>
-          <w:bCs/>
-        </w:rPr>
-        <w:t>mhn</w:t>
-      </w:r>
-      <w:proofErr w:type="spellEnd"/>
-      <w:r>
-        <w:t xml:space="preserve"> de Python y </w:t>
-      </w:r>
-      <w:proofErr w:type="spellStart"/>
+      <w:r>
+        <w:t xml:space="preserve">cuenta con la función </w:t>
+      </w:r>
+      <w:r>
+        <w:rPr>
+          <w:b/>
+          <w:bCs/>
+        </w:rPr>
+        <w:t>random_evam()</w:t>
+      </w:r>
+      <w:r>
+        <w:t xml:space="preserve"> que permite </w:t>
+      </w:r>
+      <w:r>
+        <w:rPr>
+          <w:u w:val="single"/>
+        </w:rPr>
+        <w:t>crear un modelo customizado</w:t>
+      </w:r>
+      <w:r>
+        <w:t xml:space="preserve"> sin necesidad de disponer de datos; </w:t>
+      </w:r>
+      <w:r>
+        <w:t>además de</w:t>
+      </w:r>
+      <w:r>
+        <w:t xml:space="preserve"> otras funcionalidades que aportan los datos para entrenar a los modelos.</w:t>
+      </w:r>
+    </w:p>
+    <w:p>
+      <w:r>
+        <w:t xml:space="preserve">Además, contiene la función </w:t>
+      </w:r>
+      <w:r>
+        <w:rPr>
+          <w:b/>
+          <w:bCs/>
+        </w:rPr>
+        <w:t>lambda_from_cv()</w:t>
+      </w:r>
+      <w:r>
+        <w:t xml:space="preserve"> que le permite calcular el lambda óptimo para el conjunto de datos </w:t>
+      </w:r>
+      <w:commentRangeStart w:id="1"/>
+      <w:r>
+        <w:rPr>
+          <w:strike/>
+        </w:rPr>
+        <w:t>(indicando los valores de lambda máximo y mínimo, el número de pasos y el número de folds).</w:t>
+      </w:r>
+      <w:r>
+        <w:t xml:space="preserve"> </w:t>
+      </w:r>
+      <w:commentRangeEnd w:id="1"/>
+      <w:r>
+        <w:rPr>
+          <w:rStyle w:val="Refdecomentario"/>
+        </w:rPr>
+        <w:commentReference w:id="1"/>
+      </w:r>
+      <w:r>
+        <w:t xml:space="preserve">Sin embargo, para datasets pequeños el cálculo de lambda da error (Zero Divission Error). En </w:t>
+      </w:r>
       <w:r>
         <w:rPr>
           <w:b/>
@@ -285,185 +352,221 @@
         </w:rPr>
         <w:t>evamtools</w:t>
       </w:r>
-      <w:proofErr w:type="spellEnd"/>
-      <w:r>
-        <w:t xml:space="preserve"> de R, el primero</w:t>
-      </w:r>
-      <w:r>
-        <w:t xml:space="preserve"> está </w:t>
+      <w:r>
+        <w:t xml:space="preserve">, no hay ninguna función que </w:t>
+      </w:r>
+      <w:r>
+        <w:t xml:space="preserve">realice </w:t>
+      </w:r>
+      <w:r>
+        <w:t>este cálculo.</w:t>
+      </w:r>
+    </w:p>
+    <w:p>
+      <w:r>
+        <w:t>Tras el cálculo del modelo, Python sólo devuelve la matriz log-Theta</w:t>
+      </w:r>
+      <w:r>
+        <w:t xml:space="preserve"> (la cual se puede visualizar)</w:t>
+      </w:r>
+      <w:r>
+        <w:t>, mientras que R además devuelve, entre otros, la matriz log-Theta exponencial, los ratios de transición y las probabilidades de transición</w:t>
+      </w:r>
+      <w:r>
+        <w:t xml:space="preserve">; y posee la función </w:t>
+      </w:r>
+      <w:r>
+        <w:rPr>
+          <w:b/>
+          <w:bCs/>
+        </w:rPr>
+        <w:t>plot_evam</w:t>
+      </w:r>
+      <w:r>
+        <w:rPr>
+          <w:b/>
+          <w:bCs/>
+        </w:rPr>
+        <w:t xml:space="preserve"> </w:t>
+      </w:r>
+      <w:r>
+        <w:t>que permite especificar distintos tipos de gráficos a representar</w:t>
+      </w:r>
+      <w:r>
+        <w:t xml:space="preserve">. </w:t>
+      </w:r>
+    </w:p>
+    <w:p>
+      <w:r>
+        <w:t>A</w:t>
+      </w:r>
+      <w:r>
+        <w:t xml:space="preserve"> partir del</w:t>
+      </w:r>
+      <w:r>
+        <w:t xml:space="preserve"> modelo</w:t>
+      </w:r>
+      <w:r>
+        <w:t xml:space="preserve"> se pueden generar datos sintéticos empleando la función </w:t>
+      </w:r>
+      <w:r>
+        <w:rPr>
+          <w:b/>
+          <w:bCs/>
+        </w:rPr>
+        <w:t>sample_artificial_data()</w:t>
+      </w:r>
+      <w:r>
+        <w:t xml:space="preserve"> </w:t>
+      </w:r>
+      <w:r>
+        <w:t>en</w:t>
+      </w:r>
+      <w:r>
+        <w:t xml:space="preserve"> Python </w:t>
+      </w:r>
+      <w:r>
+        <w:t>y</w:t>
+      </w:r>
+      <w:r>
+        <w:t xml:space="preserve"> </w:t>
+      </w:r>
+      <w:r>
+        <w:rPr>
+          <w:b/>
+          <w:bCs/>
+        </w:rPr>
+        <w:t>sample_evam()</w:t>
+      </w:r>
+      <w:r>
+        <w:t xml:space="preserve"> </w:t>
+      </w:r>
+      <w:r>
+        <w:t>en</w:t>
+      </w:r>
+      <w:r>
+        <w:t xml:space="preserve"> R. </w:t>
+      </w:r>
+      <w:commentRangeStart w:id="2"/>
+      <w:r>
+        <w:rPr>
+          <w:strike/>
+        </w:rPr>
+        <w:t>(</w:t>
+      </w:r>
+      <w:r>
+        <w:rPr>
+          <w:strike/>
+        </w:rPr>
+        <w:t>No obstante, estas funciones requieren de unos datos previamente cargados.</w:t>
+      </w:r>
+      <w:r>
+        <w:rPr>
+          <w:strike/>
+        </w:rPr>
+        <w:t>)</w:t>
+      </w:r>
+      <w:commentRangeEnd w:id="2"/>
+      <w:r>
+        <w:rPr>
+          <w:rStyle w:val="Refdecomentario"/>
+        </w:rPr>
+        <w:commentReference w:id="2"/>
+      </w:r>
+      <w:r>
+        <w:t xml:space="preserve"> </w:t>
+      </w:r>
+    </w:p>
+    <w:p>
+      <w:commentRangeStart w:id="3"/>
+      <w:r>
+        <w:rPr>
+          <w:strike/>
+        </w:rPr>
+        <w:t>(</w:t>
+      </w:r>
+      <w:r>
+        <w:rPr>
+          <w:strike/>
+        </w:rPr>
+        <w:t xml:space="preserve">Al calcular el modelo en R con </w:t>
+      </w:r>
+      <w:r>
+        <w:rPr>
+          <w:b/>
+          <w:bCs/>
+          <w:strike/>
+        </w:rPr>
+        <w:t>evam</w:t>
+      </w:r>
+      <w:r>
+        <w:rPr>
+          <w:strike/>
+        </w:rPr>
+        <w:t xml:space="preserve"> podemos especificar el parámetro </w:t>
+      </w:r>
+      <w:r>
+        <w:rPr>
+          <w:b/>
+          <w:bCs/>
+          <w:strike/>
+        </w:rPr>
+        <w:t>paths_max=TRUE</w:t>
+      </w:r>
+      <w:r>
+        <w:rPr>
+          <w:strike/>
+        </w:rPr>
+        <w:t>, el cual nos devuelve las probabilidades que tienen cada uno de esos paths.</w:t>
+      </w:r>
+      <w:r>
+        <w:rPr>
+          <w:strike/>
+        </w:rPr>
+        <w:t>)</w:t>
+      </w:r>
+      <w:r>
+        <w:t xml:space="preserve"> </w:t>
+      </w:r>
+      <w:commentRangeEnd w:id="3"/>
+      <w:r>
+        <w:rPr>
+          <w:rStyle w:val="Refdecomentario"/>
+        </w:rPr>
+        <w:commentReference w:id="3"/>
+      </w:r>
+      <w:r>
+        <w:t xml:space="preserve">En Python, podemos calcular las probabilidad de que una mutación haya precedido a otra sabiendo que ambas se encuentran en el presente mutadas mediante la función </w:t>
+      </w:r>
+      <w:r>
+        <w:rPr>
+          <w:b/>
+          <w:bCs/>
+        </w:rPr>
+        <w:t>sample_trajectories();</w:t>
+      </w:r>
+      <w:r>
+        <w:t xml:space="preserve"> y también nos permite predecir el siguiente evento teniendo en cuenta </w:t>
       </w:r>
       <w:r>
         <w:rPr>
           <w:u w:val="single"/>
         </w:rPr>
-        <w:t xml:space="preserve">limitado a los modelos MHN </w:t>
-      </w:r>
-      <w:r>
-        <w:t>y</w:t>
-      </w:r>
-      <w:r>
-        <w:t xml:space="preserve"> puede </w:t>
-      </w:r>
-      <w:r>
-        <w:rPr>
-          <w:u w:val="single"/>
-        </w:rPr>
-        <w:t xml:space="preserve">calcular el </w:t>
-      </w:r>
-      <w:proofErr w:type="spellStart"/>
-      <w:r>
-        <w:rPr>
-          <w:u w:val="single"/>
-        </w:rPr>
-        <w:t>oMHN</w:t>
-      </w:r>
-      <w:proofErr w:type="spellEnd"/>
-      <w:r>
-        <w:t xml:space="preserve"> (aplicando la </w:t>
-      </w:r>
-      <w:proofErr w:type="spellStart"/>
-      <w:r>
-        <w:t>correción</w:t>
-      </w:r>
-      <w:proofErr w:type="spellEnd"/>
-      <w:r>
-        <w:t xml:space="preserve"> del sesgo).</w:t>
-      </w:r>
-      <w:r>
-        <w:t xml:space="preserve"> Sin embargo</w:t>
-      </w:r>
-      <w:r>
-        <w:t>,</w:t>
-      </w:r>
-      <w:r>
-        <w:t xml:space="preserve"> el segundo </w:t>
-      </w:r>
-      <w:r>
-        <w:t xml:space="preserve">puede </w:t>
-      </w:r>
-      <w:r>
-        <w:rPr>
-          <w:u w:val="single"/>
-        </w:rPr>
-        <w:t xml:space="preserve">aplicar otros </w:t>
-      </w:r>
-      <w:proofErr w:type="spellStart"/>
-      <w:r>
-        <w:rPr>
-          <w:u w:val="single"/>
-        </w:rPr>
-        <w:t>CPMs</w:t>
-      </w:r>
-      <w:proofErr w:type="spellEnd"/>
-      <w:r>
-        <w:t xml:space="preserve"> y </w:t>
-      </w:r>
-      <w:r>
-        <w:t xml:space="preserve">cuenta con la función </w:t>
-      </w:r>
-      <w:proofErr w:type="spellStart"/>
-      <w:r>
-        <w:rPr>
-          <w:b/>
-          <w:bCs/>
-        </w:rPr>
-        <w:t>random_evam</w:t>
-      </w:r>
-      <w:proofErr w:type="spellEnd"/>
-      <w:r>
-        <w:rPr>
-          <w:b/>
-          <w:bCs/>
-        </w:rPr>
-        <w:t>()</w:t>
-      </w:r>
-      <w:r>
-        <w:t xml:space="preserve"> que permite </w:t>
-      </w:r>
-      <w:r>
-        <w:rPr>
-          <w:u w:val="single"/>
-        </w:rPr>
-        <w:t>crear un modelo customizado</w:t>
-      </w:r>
-      <w:r>
-        <w:t xml:space="preserve"> sin necesidad de disponer de datos; y otras funcionalidades que aportan los datos para entrenar a los modelos.</w:t>
-      </w:r>
-    </w:p>
-    <w:p>
-      <w:r>
-        <w:t xml:space="preserve">Además, contiene la función </w:t>
-      </w:r>
-      <w:proofErr w:type="spellStart"/>
-      <w:r>
-        <w:rPr>
-          <w:b/>
-          <w:bCs/>
-        </w:rPr>
-        <w:t>lambda_from_cv</w:t>
-      </w:r>
-      <w:proofErr w:type="spellEnd"/>
-      <w:r>
-        <w:rPr>
-          <w:b/>
-          <w:bCs/>
-        </w:rPr>
-        <w:t>()</w:t>
-      </w:r>
-      <w:r>
-        <w:t xml:space="preserve"> que le permite calcular el lambda óptimo para el conjunto de datos </w:t>
-      </w:r>
-      <w:commentRangeStart w:id="1"/>
-      <w:r>
-        <w:rPr>
-          <w:strike/>
-        </w:rPr>
-        <w:t xml:space="preserve">(indicando los valores de lambda máximo y mínimo, el número de pasos y el número de </w:t>
-      </w:r>
-      <w:proofErr w:type="spellStart"/>
-      <w:r>
-        <w:rPr>
-          <w:strike/>
-        </w:rPr>
-        <w:t>folds</w:t>
-      </w:r>
-      <w:proofErr w:type="spellEnd"/>
-      <w:r>
-        <w:rPr>
-          <w:strike/>
-        </w:rPr>
-        <w:t>).</w:t>
-      </w:r>
-      <w:r>
-        <w:t xml:space="preserve"> </w:t>
-      </w:r>
-      <w:commentRangeEnd w:id="1"/>
-      <w:r>
-        <w:rPr>
-          <w:rStyle w:val="Refdecomentario"/>
-        </w:rPr>
-        <w:commentReference w:id="1"/>
-      </w:r>
-      <w:r>
-        <w:t xml:space="preserve">Sin embargo, para </w:t>
-      </w:r>
-      <w:proofErr w:type="spellStart"/>
-      <w:r>
-        <w:t>datasets</w:t>
-      </w:r>
-      <w:proofErr w:type="spellEnd"/>
-      <w:r>
-        <w:t xml:space="preserve"> pequeños el cálculo de lambda da error (Zero </w:t>
-      </w:r>
-      <w:proofErr w:type="spellStart"/>
-      <w:r>
-        <w:t>Divission</w:t>
-      </w:r>
-      <w:proofErr w:type="spellEnd"/>
-      <w:r>
-        <w:t xml:space="preserve"> Error). En </w:t>
-      </w:r>
-      <w:proofErr w:type="spellStart"/>
+        <w:t>un genotipo particular</w:t>
+      </w:r>
+      <w:r>
+        <w:t xml:space="preserve"> con la función </w:t>
+      </w:r>
+      <w:r>
+        <w:rPr>
+          <w:b/>
+          <w:bCs/>
+        </w:rPr>
+        <w:t>compute_next_events_probs().</w:t>
+      </w:r>
+      <w:r>
+        <w:t xml:space="preserve"> Estas dos últimas funcionalidades no las presenta </w:t>
+      </w:r>
       <w:r>
         <w:rPr>
           <w:b/>
@@ -471,295 +574,6 @@
         </w:rPr>
         <w:t>evamtools</w:t>
       </w:r>
-      <w:proofErr w:type="spellEnd"/>
-      <w:r>
-        <w:t xml:space="preserve">, no hay ninguna función que </w:t>
-      </w:r>
-      <w:r>
-        <w:t xml:space="preserve">realice </w:t>
-      </w:r>
-      <w:r>
-        <w:t>este cálculo.</w:t>
-      </w:r>
-    </w:p>
-    <w:p>
-      <w:r>
-        <w:t>Tras el cálculo del modelo, Python sólo devuelve la matriz log-Theta</w:t>
-      </w:r>
-      <w:r>
-        <w:t xml:space="preserve"> (la cual se puede visualizar)</w:t>
-      </w:r>
-      <w:r>
-        <w:t>, mientras que R además devuelve, entre otros, la matriz log-Theta exponencial, los ratios de transición y las probabilidades de transición</w:t>
-      </w:r>
-      <w:r>
-        <w:t xml:space="preserve">; y posee la función </w:t>
-      </w:r>
-      <w:proofErr w:type="spellStart"/>
-      <w:r>
-        <w:rPr>
-          <w:b/>
-          <w:bCs/>
-        </w:rPr>
-        <w:t>plot_evam</w:t>
-      </w:r>
-      <w:proofErr w:type="spellEnd"/>
-      <w:r>
-        <w:rPr>
-          <w:b/>
-          <w:bCs/>
-        </w:rPr>
-        <w:t xml:space="preserve"> </w:t>
-      </w:r>
-      <w:r>
-        <w:t>que permite especificar distintos tipos de gráficos a representar</w:t>
-      </w:r>
-      <w:r>
-        <w:t xml:space="preserve">. </w:t>
-      </w:r>
-    </w:p>
-    <w:p>
-      <w:r>
-        <w:t>A</w:t>
-      </w:r>
-      <w:r>
-        <w:t xml:space="preserve"> partir del</w:t>
-      </w:r>
-      <w:r>
-        <w:t xml:space="preserve"> modelo</w:t>
-      </w:r>
-      <w:r>
-        <w:t xml:space="preserve"> se pueden generar datos sintéticos empleando la función </w:t>
-      </w:r>
-      <w:proofErr w:type="spellStart"/>
-      <w:r>
-        <w:rPr>
-          <w:b/>
-          <w:bCs/>
-        </w:rPr>
-        <w:t>sample_artificial_data</w:t>
-      </w:r>
-      <w:proofErr w:type="spellEnd"/>
-      <w:r>
-        <w:rPr>
-          <w:b/>
-          <w:bCs/>
-        </w:rPr>
-        <w:t>()</w:t>
-      </w:r>
-      <w:r>
-        <w:t xml:space="preserve"> </w:t>
-      </w:r>
-      <w:r>
-        <w:t>en</w:t>
-      </w:r>
-      <w:r>
-        <w:t xml:space="preserve"> Python </w:t>
-      </w:r>
-      <w:r>
-        <w:t>y</w:t>
-      </w:r>
-      <w:r>
-        <w:t xml:space="preserve"> </w:t>
-      </w:r>
-      <w:proofErr w:type="spellStart"/>
-      <w:r>
-        <w:rPr>
-          <w:b/>
-          <w:bCs/>
-        </w:rPr>
-        <w:t>sample_evam</w:t>
-      </w:r>
-      <w:proofErr w:type="spellEnd"/>
-      <w:r>
-        <w:rPr>
-          <w:b/>
-          <w:bCs/>
-        </w:rPr>
-        <w:t>()</w:t>
-      </w:r>
-      <w:r>
-        <w:t xml:space="preserve"> </w:t>
-      </w:r>
-      <w:r>
-        <w:t>en</w:t>
-      </w:r>
-      <w:r>
-        <w:t xml:space="preserve"> R. </w:t>
-      </w:r>
-      <w:commentRangeStart w:id="2"/>
-      <w:r>
-        <w:rPr>
-          <w:strike/>
-        </w:rPr>
-        <w:t>(</w:t>
-      </w:r>
-      <w:r>
-        <w:rPr>
-          <w:strike/>
-        </w:rPr>
-        <w:t>No obstante, estas funciones requieren de unos datos previamente cargados.</w:t>
-      </w:r>
-      <w:r>
-        <w:rPr>
-          <w:strike/>
-        </w:rPr>
-        <w:t>)</w:t>
-      </w:r>
-      <w:commentRangeEnd w:id="2"/>
-      <w:r>
-        <w:rPr>
-          <w:rStyle w:val="Refdecomentario"/>
-        </w:rPr>
-        <w:commentReference w:id="2"/>
-      </w:r>
-      <w:r>
-        <w:t xml:space="preserve"> </w:t>
-      </w:r>
-    </w:p>
-    <w:p>
-      <w:commentRangeStart w:id="3"/>
-      <w:r>
-        <w:rPr>
-          <w:strike/>
-        </w:rPr>
-        <w:t>(</w:t>
-      </w:r>
-      <w:r>
-        <w:rPr>
-          <w:strike/>
-        </w:rPr>
-        <w:t xml:space="preserve">Al calcular el modelo en R con </w:t>
-      </w:r>
-      <w:proofErr w:type="spellStart"/>
-      <w:r>
-        <w:rPr>
-          <w:b/>
-          <w:bCs/>
-          <w:strike/>
-        </w:rPr>
-        <w:t>evam</w:t>
-      </w:r>
-      <w:proofErr w:type="spellEnd"/>
-      <w:r>
-        <w:rPr>
-          <w:strike/>
-        </w:rPr>
-        <w:t xml:space="preserve"> podemos especificar el parámetro </w:t>
-      </w:r>
-      <w:proofErr w:type="spellStart"/>
-      <w:r>
-        <w:rPr>
-          <w:b/>
-          <w:bCs/>
-          <w:strike/>
-        </w:rPr>
-        <w:t>paths_max</w:t>
-      </w:r>
-      <w:proofErr w:type="spellEnd"/>
-      <w:r>
-        <w:rPr>
-          <w:b/>
-          <w:bCs/>
-          <w:strike/>
-        </w:rPr>
-        <w:t>=TRUE</w:t>
-      </w:r>
-      <w:r>
-        <w:rPr>
-          <w:strike/>
-        </w:rPr>
-        <w:t xml:space="preserve">, el cual nos devuelve las probabilidades que tienen cada uno de esos </w:t>
-      </w:r>
-      <w:proofErr w:type="spellStart"/>
-      <w:r>
-        <w:rPr>
-          <w:strike/>
-        </w:rPr>
-        <w:t>paths</w:t>
-      </w:r>
-      <w:proofErr w:type="spellEnd"/>
-      <w:r>
-        <w:rPr>
-          <w:strike/>
-        </w:rPr>
-        <w:t>.</w:t>
-      </w:r>
-      <w:r>
-        <w:rPr>
-          <w:strike/>
-        </w:rPr>
-        <w:t>)</w:t>
-      </w:r>
-      <w:r>
-        <w:t xml:space="preserve"> </w:t>
-      </w:r>
-      <w:commentRangeEnd w:id="3"/>
-      <w:r>
-        <w:rPr>
-          <w:rStyle w:val="Refdecomentario"/>
-        </w:rPr>
-        <w:commentReference w:id="3"/>
-      </w:r>
-      <w:r>
-        <w:t xml:space="preserve">En Python, podemos calcular las probabilidad de que una mutación haya precedido a otra sabiendo que ambas se encuentran en el presente mutadas mediante la función </w:t>
-      </w:r>
-      <w:proofErr w:type="spellStart"/>
-      <w:r>
-        <w:rPr>
-          <w:b/>
-          <w:bCs/>
-        </w:rPr>
-        <w:t>sample_trajectories</w:t>
-      </w:r>
-      <w:proofErr w:type="spellEnd"/>
-      <w:r>
-        <w:rPr>
-          <w:b/>
-          <w:bCs/>
-        </w:rPr>
-        <w:t>();</w:t>
-      </w:r>
-      <w:r>
-        <w:t xml:space="preserve"> y también nos permite predecir el siguiente evento teniendo en cuenta </w:t>
-      </w:r>
-      <w:r>
-        <w:rPr>
-          <w:u w:val="single"/>
-        </w:rPr>
-        <w:t>un genotipo particular</w:t>
-      </w:r>
-      <w:r>
-        <w:t xml:space="preserve"> con la función </w:t>
-      </w:r>
-      <w:proofErr w:type="spellStart"/>
-      <w:r>
-        <w:rPr>
-          <w:b/>
-          <w:bCs/>
-        </w:rPr>
-        <w:t>compute_next_events_probs</w:t>
-      </w:r>
-      <w:proofErr w:type="spellEnd"/>
-      <w:r>
-        <w:rPr>
-          <w:b/>
-          <w:bCs/>
-        </w:rPr>
-        <w:t>().</w:t>
-      </w:r>
-      <w:r>
-        <w:t xml:space="preserve"> Estas dos últimas funcionalidades no las presenta </w:t>
-      </w:r>
-      <w:proofErr w:type="spellStart"/>
-      <w:r>
-        <w:rPr>
-          <w:b/>
-          <w:bCs/>
-        </w:rPr>
-        <w:t>evamtools</w:t>
-      </w:r>
-      <w:proofErr w:type="spellEnd"/>
       <w:r>
         <w:t>.</w:t>
       </w:r>
@@ -775,7 +589,6 @@
       <w:r>
         <w:t>Integración del código en Python en R (</w:t>
       </w:r>
-      <w:proofErr w:type="spellStart"/>
       <w:r>
         <w:rPr>
           <w:b/>
@@ -783,11 +596,9 @@
         </w:rPr>
         <w:t>evamtools</w:t>
       </w:r>
-      <w:proofErr w:type="spellEnd"/>
       <w:r>
         <w:t xml:space="preserve">): </w:t>
       </w:r>
-      <w:proofErr w:type="spellStart"/>
       <w:r>
         <w:rPr>
           <w:b/>
@@ -802,7 +613,6 @@
         </w:rPr>
         <w:t>eticulate</w:t>
       </w:r>
-      <w:proofErr w:type="spellEnd"/>
     </w:p>
     <w:p>
       <w:r>
@@ -822,7 +632,6 @@
         <w:lastRenderedPageBreak/>
         <w:t>funcionalidades de ambos paquetes (</w:t>
       </w:r>
-      <w:proofErr w:type="spellStart"/>
       <w:r>
         <w:rPr>
           <w:b/>
@@ -831,14 +640,12 @@
         </w:rPr>
         <w:t>mhn</w:t>
       </w:r>
-      <w:proofErr w:type="spellEnd"/>
       <w:r>
         <w:rPr>
           <w:strike/>
         </w:rPr>
         <w:t xml:space="preserve"> y </w:t>
       </w:r>
-      <w:proofErr w:type="spellStart"/>
       <w:r>
         <w:rPr>
           <w:b/>
@@ -847,7 +654,6 @@
         </w:rPr>
         <w:t>evamtools</w:t>
       </w:r>
-      <w:proofErr w:type="spellEnd"/>
       <w:r>
         <w:rPr>
           <w:strike/>
@@ -866,7 +672,6 @@
       <w:r>
         <w:t xml:space="preserve">Con este propósito, el paquete </w:t>
       </w:r>
-      <w:proofErr w:type="spellStart"/>
       <w:r>
         <w:rPr>
           <w:b/>
@@ -874,7 +679,6 @@
         </w:rPr>
         <w:t>reticulate</w:t>
       </w:r>
-      <w:proofErr w:type="spellEnd"/>
       <w:r>
         <w:t xml:space="preserve"> de R proporciona una interfaz versátil que permite ejecutar código de Python desde el entorno de R</w:t>
       </w:r>
@@ -893,7 +697,6 @@
       <w:r>
         <w:t xml:space="preserve"> (como </w:t>
       </w:r>
-      <w:proofErr w:type="spellStart"/>
       <w:r>
         <w:rPr>
           <w:b/>
@@ -901,7 +704,6 @@
         </w:rPr>
         <w:t>mhn</w:t>
       </w:r>
-      <w:proofErr w:type="spellEnd"/>
       <w:r>
         <w:t>)</w:t>
       </w:r>
@@ -942,7 +744,6 @@
       <w:r>
         <w:t xml:space="preserve"> al código de Python relacionado con el paquete </w:t>
       </w:r>
-      <w:proofErr w:type="spellStart"/>
       <w:r>
         <w:rPr>
           <w:b/>
@@ -950,7 +751,6 @@
         </w:rPr>
         <w:t>mhn</w:t>
       </w:r>
-      <w:proofErr w:type="spellEnd"/>
       <w:r>
         <w:t xml:space="preserve"> desde R. Los pasos seguidos fueron:</w:t>
       </w:r>
@@ -964,15 +764,7 @@
         </w:numPr>
       </w:pPr>
       <w:r>
-        <w:t xml:space="preserve">Configuración del entorno en Docker: Asegurar que Python esté instalado y accesible desde R mediante la configuración del intérprete Python en </w:t>
-      </w:r>
-      <w:proofErr w:type="spellStart"/>
-      <w:r>
-        <w:t>reticulate</w:t>
-      </w:r>
-      <w:proofErr w:type="spellEnd"/>
-      <w:r>
-        <w:t xml:space="preserve"> en la imagen de Docker.</w:t>
+        <w:t>Configuración del entorno en Docker: Asegurar que Python esté instalado y accesible desde R mediante la configuración del intérprete Python en reticulate en la imagen de Docker.</w:t>
       </w:r>
     </w:p>
     <w:p>
@@ -986,7 +778,6 @@
       <w:r>
         <w:t xml:space="preserve">Instalación del paquete </w:t>
       </w:r>
-      <w:proofErr w:type="spellStart"/>
       <w:r>
         <w:rPr>
           <w:b/>
@@ -994,7 +785,6 @@
         </w:rPr>
         <w:t>mhn</w:t>
       </w:r>
-      <w:proofErr w:type="spellEnd"/>
       <w:r>
         <w:t xml:space="preserve"> en Python</w:t>
       </w:r>
@@ -1010,7 +800,6 @@
       <w:r>
         <w:t xml:space="preserve">Ejecución de código de Python desde R: Llamar a las funciones del paquete </w:t>
       </w:r>
-      <w:proofErr w:type="spellStart"/>
       <w:r>
         <w:rPr>
           <w:b/>
@@ -1018,7 +807,6 @@
         </w:rPr>
         <w:t>mhn</w:t>
       </w:r>
-      <w:proofErr w:type="spellEnd"/>
       <w:r>
         <w:t xml:space="preserve"> </w:t>
       </w:r>
@@ -1055,17 +843,8 @@
     <w:p/>
     <w:p>
       <w:r>
-        <w:t xml:space="preserve">En Python, se nombra </w:t>
-      </w:r>
-      <w:proofErr w:type="spellStart"/>
-      <w:r>
-        <w:t>cMHN</w:t>
-      </w:r>
-      <w:proofErr w:type="spellEnd"/>
-      <w:r>
-        <w:t xml:space="preserve"> como el modelo clásico de MHN, el cual es el implementado en </w:t>
-      </w:r>
-      <w:proofErr w:type="spellStart"/>
+        <w:t xml:space="preserve">En Python, se nombra cMHN como el modelo clásico de MHN, el cual es el implementado en </w:t>
+      </w:r>
       <w:r>
         <w:rPr>
           <w:b/>
@@ -1073,7 +852,6 @@
         </w:rPr>
         <w:t>evamtools</w:t>
       </w:r>
-      <w:proofErr w:type="spellEnd"/>
       <w:r>
         <w:t xml:space="preserve">. </w:t>
       </w:r>
@@ -1081,15 +859,7 @@
         <w:t>Por</w:t>
       </w:r>
       <w:r>
-        <w:t xml:space="preserve"> ello, hemos querido comparar los resultados, utilizando el mismo </w:t>
-      </w:r>
-      <w:proofErr w:type="spellStart"/>
-      <w:r>
-        <w:t>dataset</w:t>
-      </w:r>
-      <w:proofErr w:type="spellEnd"/>
-      <w:r>
-        <w:t xml:space="preserve"> en Python y en R. </w:t>
+        <w:t xml:space="preserve"> ello, hemos querido comparar los resultados, utilizando el mismo dataset en Python y en R. </w:t>
       </w:r>
       <w:r>
         <w:t>Estos</w:t>
@@ -1159,7 +929,6 @@
       <w:r>
         <w:t xml:space="preserve"> los dos códigos, la diferencia radica en el cálculo de un valor óptimo de lambda ajustado a los datos en el caso de Python, mientras que </w:t>
       </w:r>
-      <w:proofErr w:type="spellStart"/>
       <w:r>
         <w:rPr>
           <w:b/>
@@ -1167,7 +936,6 @@
         </w:rPr>
         <w:t>evamtools</w:t>
       </w:r>
-      <w:proofErr w:type="spellEnd"/>
       <w:r>
         <w:rPr>
           <w:b/>
@@ -1196,7 +964,6 @@
       <w:r>
         <w:t xml:space="preserve"> por </w:t>
       </w:r>
-      <w:proofErr w:type="spellStart"/>
       <w:r>
         <w:rPr>
           <w:b/>
@@ -1211,11 +978,9 @@
         </w:rPr>
         <w:t>n</w:t>
       </w:r>
-      <w:proofErr w:type="spellEnd"/>
       <w:r>
         <w:t xml:space="preserve"> en </w:t>
       </w:r>
-      <w:proofErr w:type="spellStart"/>
       <w:r>
         <w:rPr>
           <w:b/>
@@ -1223,7 +988,6 @@
         </w:rPr>
         <w:t>evam</w:t>
       </w:r>
-      <w:proofErr w:type="spellEnd"/>
       <w:r>
         <w:t xml:space="preserve">, </w:t>
       </w:r>
@@ -1250,7 +1014,7 @@
 </file>
 
 <file path=word/comments.xml><?xml version="1.0" encoding="utf-8"?>
-<w:comments xmlns:wpc="http://schemas.microsoft.com/office/word/2010/wordprocessingCanvas" xmlns:cx="http://schemas.microsoft.com/office/drawing/2014/chartex" xmlns:cx1="http://schemas.microsoft.com/office/drawing/2015/9/8/chartex" xmlns:cx2="http://schemas.microsoft.com/office/drawing/2015/10/21/chartex" xmlns:cx3="http://schemas.microsoft.com/office/drawing/2016/5/9/chartex" xmlns:cx4="http://schemas.microsoft.com/office/drawing/2016/5/10/chartex" xmlns:cx5="http://schemas.microsoft.com/office/drawing/2016/5/11/chartex" xmlns:cx6="http://schemas.microsoft.com/office/drawing/2016/5/12/chartex" xmlns:cx7="http://schemas.microsoft.com/office/drawing/2016/5/13/chartex" xmlns:cx8="http://schemas.microsoft.com/office/drawing/2016/5/14/chartex" xmlns:mc="http://schemas.openxmlformats.org/markup-compatibility/2006" xmlns:aink="http://schemas.microsoft.com/office/drawing/2016/ink" xmlns:am3d="http://schemas.microsoft.com/office/drawing/2017/model3d" xmlns:o="urn:schemas-microsoft-com:office:office" xmlns:oel="http://schemas.microsoft.com/office/2019/extlst" xmlns:r="http://schemas.openxmlformats.org/officeDocument/2006/relationships" xmlns:m="http://schemas.openxmlformats.org/officeDocument/2006/math" xmlns:v="urn:schemas-microsoft-com:vml" xmlns:wp14="http://schemas.microsoft.com/office/word/2010/wordprocessingDrawing" xmlns:wp="http://schemas.openxmlformats.org/drawingml/2006/wordprocessingDrawing" xmlns:w10="urn:schemas-microsoft-com:office:word" xmlns:w="http://schemas.openxmlformats.org/wordprocessingml/2006/main" xmlns:w14="http://schemas.microsoft.com/office/word/2010/wordml" xmlns:w15="http://schemas.microsoft.com/office/word/2012/wordml" xmlns:w16cex="http://schemas.microsoft.com/office/word/2018/wordml/cex" xmlns:w16cid="http://schemas.microsoft.com/office/word/2016/wordml/cid" xmlns:w16="http://schemas.microsoft.com/office/word/2018/wordml" xmlns:w16du="http://schemas.microsoft.com/office/word/2023/wordml/word16du" xmlns:w16sdtdh="http://schemas.microsoft.com/office/word/2020/wordml/sdtdatahash" xmlns:w16sdtfl="http://schemas.microsoft.com/office/word/2024/wordml/sdtformatlock" xmlns:w16se="http://schemas.microsoft.com/office/word/2015/wordml/symex" xmlns:wpg="http://schemas.microsoft.com/office/word/2010/wordprocessingGroup" xmlns:wpi="http://schemas.microsoft.com/office/word/2010/wordprocessingInk" xmlns:wne="http://schemas.microsoft.com/office/word/2006/wordml" xmlns:wps="http://schemas.microsoft.com/office/word/2010/wordprocessingShape" mc:Ignorable="w14 w15 w16se w16cid w16 w16cex w16sdtdh w16sdtfl w16du wp14">
+<w:comments xmlns:wpc="http://schemas.microsoft.com/office/word/2010/wordprocessingCanvas" xmlns:cx="http://schemas.microsoft.com/office/drawing/2014/chartex" xmlns:cx1="http://schemas.microsoft.com/office/drawing/2015/9/8/chartex" xmlns:cx2="http://schemas.microsoft.com/office/drawing/2015/10/21/chartex" xmlns:cx3="http://schemas.microsoft.com/office/drawing/2016/5/9/chartex" xmlns:cx4="http://schemas.microsoft.com/office/drawing/2016/5/10/chartex" xmlns:cx5="http://schemas.microsoft.com/office/drawing/2016/5/11/chartex" xmlns:cx6="http://schemas.microsoft.com/office/drawing/2016/5/12/chartex" xmlns:cx7="http://schemas.microsoft.com/office/drawing/2016/5/13/chartex" xmlns:cx8="http://schemas.microsoft.com/office/drawing/2016/5/14/chartex" xmlns:mc="http://schemas.openxmlformats.org/markup-compatibility/2006" xmlns:aink="http://schemas.microsoft.com/office/drawing/2016/ink" xmlns:am3d="http://schemas.microsoft.com/office/drawing/2017/model3d" xmlns:o="urn:schemas-microsoft-com:office:office" xmlns:oel="http://schemas.microsoft.com/office/2019/extlst" xmlns:r="http://schemas.openxmlformats.org/officeDocument/2006/relationships" xmlns:m="http://schemas.openxmlformats.org/officeDocument/2006/math" xmlns:v="urn:schemas-microsoft-com:vml" xmlns:wp14="http://schemas.microsoft.com/office/word/2010/wordprocessingDrawing" xmlns:wp="http://schemas.openxmlformats.org/drawingml/2006/wordprocessingDrawing" xmlns:w10="urn:schemas-microsoft-com:office:word" xmlns:w="http://schemas.openxmlformats.org/wordprocessingml/2006/main" xmlns:w14="http://schemas.microsoft.com/office/word/2010/wordml" xmlns:w15="http://schemas.microsoft.com/office/word/2012/wordml" xmlns:w16cex="http://schemas.microsoft.com/office/word/2018/wordml/cex" xmlns:w16cid="http://schemas.microsoft.com/office/word/2016/wordml/cid" xmlns:w16="http://schemas.microsoft.com/office/word/2018/wordml" xmlns:w16du="http://schemas.microsoft.com/office/word/2023/wordml/word16du" xmlns:w16sdtdh="http://schemas.microsoft.com/office/word/2020/wordml/sdtdatahash" xmlns:w16se="http://schemas.microsoft.com/office/word/2015/wordml/symex" xmlns:wpg="http://schemas.microsoft.com/office/word/2010/wordprocessingGroup" xmlns:wpi="http://schemas.microsoft.com/office/word/2010/wordprocessingInk" xmlns:wne="http://schemas.microsoft.com/office/word/2006/wordml" xmlns:wps="http://schemas.microsoft.com/office/word/2010/wordprocessingShape" mc:Ignorable="w14 w15 w16se w16cid w16 w16cex w16sdtdh w16du wp14">
   <w:comment w:id="0" w:author="Daniel Parra" w:date="2025-01-07T09:13:00Z" w:initials="DP">
     <w:p>
       <w:pPr>
@@ -1407,7 +1171,7 @@
 </file>
 
 <file path=word/commentsExtended.xml><?xml version="1.0" encoding="utf-8"?>
-<w15:commentsEx xmlns:wpc="http://schemas.microsoft.com/office/word/2010/wordprocessingCanvas" xmlns:cx="http://schemas.microsoft.com/office/drawing/2014/chartex" xmlns:cx1="http://schemas.microsoft.com/office/drawing/2015/9/8/chartex" xmlns:cx2="http://schemas.microsoft.com/office/drawing/2015/10/21/chartex" xmlns:cx3="http://schemas.microsoft.com/office/drawing/2016/5/9/chartex" xmlns:cx4="http://schemas.microsoft.com/office/drawing/2016/5/10/chartex" xmlns:cx5="http://schemas.microsoft.com/office/drawing/2016/5/11/chartex" xmlns:cx6="http://schemas.microsoft.com/office/drawing/2016/5/12/chartex" xmlns:cx7="http://schemas.microsoft.com/office/drawing/2016/5/13/chartex" xmlns:cx8="http://schemas.microsoft.com/office/drawing/2016/5/14/chartex" xmlns:mc="http://schemas.openxmlformats.org/markup-compatibility/2006" xmlns:aink="http://schemas.microsoft.com/office/drawing/2016/ink" xmlns:am3d="http://schemas.microsoft.com/office/drawing/2017/model3d" xmlns:o="urn:schemas-microsoft-com:office:office" xmlns:oel="http://schemas.microsoft.com/office/2019/extlst" xmlns:r="http://schemas.openxmlformats.org/officeDocument/2006/relationships" xmlns:m="http://schemas.openxmlformats.org/officeDocument/2006/math" xmlns:v="urn:schemas-microsoft-com:vml" xmlns:wp14="http://schemas.microsoft.com/office/word/2010/wordprocessingDrawing" xmlns:wp="http://schemas.openxmlformats.org/drawingml/2006/wordprocessingDrawing" xmlns:w10="urn:schemas-microsoft-com:office:word" xmlns:w="http://schemas.openxmlformats.org/wordprocessingml/2006/main" xmlns:w14="http://schemas.microsoft.com/office/word/2010/wordml" xmlns:w15="http://schemas.microsoft.com/office/word/2012/wordml" xmlns:w16cex="http://schemas.microsoft.com/office/word/2018/wordml/cex" xmlns:w16cid="http://schemas.microsoft.com/office/word/2016/wordml/cid" xmlns:w16="http://schemas.microsoft.com/office/word/2018/wordml" xmlns:w16du="http://schemas.microsoft.com/office/word/2023/wordml/word16du" xmlns:w16sdtdh="http://schemas.microsoft.com/office/word/2020/wordml/sdtdatahash" xmlns:w16sdtfl="http://schemas.microsoft.com/office/word/2024/wordml/sdtformatlock" xmlns:w16se="http://schemas.microsoft.com/office/word/2015/wordml/symex" xmlns:wpg="http://schemas.microsoft.com/office/word/2010/wordprocessingGroup" xmlns:wpi="http://schemas.microsoft.com/office/word/2010/wordprocessingInk" xmlns:wne="http://schemas.microsoft.com/office/word/2006/wordml" xmlns:wps="http://schemas.microsoft.com/office/word/2010/wordprocessingShape" mc:Ignorable="w14 w15 w16se w16cid w16 w16cex w16sdtdh w16sdtfl w16du wp14">
+<w15:commentsEx xmlns:wpc="http://schemas.microsoft.com/office/word/2010/wordprocessingCanvas" xmlns:cx="http://schemas.microsoft.com/office/drawing/2014/chartex" xmlns:cx1="http://schemas.microsoft.com/office/drawing/2015/9/8/chartex" xmlns:cx2="http://schemas.microsoft.com/office/drawing/2015/10/21/chartex" xmlns:cx3="http://schemas.microsoft.com/office/drawing/2016/5/9/chartex" xmlns:cx4="http://schemas.microsoft.com/office/drawing/2016/5/10/chartex" xmlns:cx5="http://schemas.microsoft.com/office/drawing/2016/5/11/chartex" xmlns:cx6="http://schemas.microsoft.com/office/drawing/2016/5/12/chartex" xmlns:cx7="http://schemas.microsoft.com/office/drawing/2016/5/13/chartex" xmlns:cx8="http://schemas.microsoft.com/office/drawing/2016/5/14/chartex" xmlns:mc="http://schemas.openxmlformats.org/markup-compatibility/2006" xmlns:aink="http://schemas.microsoft.com/office/drawing/2016/ink" xmlns:am3d="http://schemas.microsoft.com/office/drawing/2017/model3d" xmlns:o="urn:schemas-microsoft-com:office:office" xmlns:oel="http://schemas.microsoft.com/office/2019/extlst" xmlns:r="http://schemas.openxmlformats.org/officeDocument/2006/relationships" xmlns:m="http://schemas.openxmlformats.org/officeDocument/2006/math" xmlns:v="urn:schemas-microsoft-com:vml" xmlns:wp14="http://schemas.microsoft.com/office/word/2010/wordprocessingDrawing" xmlns:wp="http://schemas.openxmlformats.org/drawingml/2006/wordprocessingDrawing" xmlns:w10="urn:schemas-microsoft-com:office:word" xmlns:w="http://schemas.openxmlformats.org/wordprocessingml/2006/main" xmlns:w14="http://schemas.microsoft.com/office/word/2010/wordml" xmlns:w15="http://schemas.microsoft.com/office/word/2012/wordml" xmlns:w16cex="http://schemas.microsoft.com/office/word/2018/wordml/cex" xmlns:w16cid="http://schemas.microsoft.com/office/word/2016/wordml/cid" xmlns:w16="http://schemas.microsoft.com/office/word/2018/wordml" xmlns:w16du="http://schemas.microsoft.com/office/word/2023/wordml/word16du" xmlns:w16sdtdh="http://schemas.microsoft.com/office/word/2020/wordml/sdtdatahash" xmlns:w16se="http://schemas.microsoft.com/office/word/2015/wordml/symex" xmlns:wpg="http://schemas.microsoft.com/office/word/2010/wordprocessingGroup" xmlns:wpi="http://schemas.microsoft.com/office/word/2010/wordprocessingInk" xmlns:wne="http://schemas.microsoft.com/office/word/2006/wordml" xmlns:wps="http://schemas.microsoft.com/office/word/2010/wordprocessingShape" mc:Ignorable="w14 w15 w16se w16cid w16 w16cex w16sdtdh w16du wp14">
   <w15:commentEx w15:paraId="377670DF" w15:done="0"/>
   <w15:commentEx w15:paraId="72217A0A" w15:done="0"/>
   <w15:commentEx w15:paraId="3ABA5523" w15:done="0"/>
@@ -1421,7 +1185,7 @@
 </file>
 
 <file path=word/commentsExtensible.xml><?xml version="1.0" encoding="utf-8"?>
-<w16cex:commentsExtensible xmlns:wpc="http://schemas.microsoft.com/office/word/2010/wordprocessingCanvas" xmlns:cx="http://schemas.microsoft.com/office/drawing/2014/chartex" xmlns:cx1="http://schemas.microsoft.com/office/drawing/2015/9/8/chartex" xmlns:cx2="http://schemas.microsoft.com/office/drawing/2015/10/21/chartex" xmlns:cx3="http://schemas.microsoft.com/office/drawing/2016/5/9/chartex" xmlns:cx4="http://schemas.microsoft.com/office/drawing/2016/5/10/chartex" xmlns:cx5="http://schemas.microsoft.com/office/drawing/2016/5/11/chartex" xmlns:cx6="http://schemas.microsoft.com/office/drawing/2016/5/12/chartex" xmlns:cx7="http://schemas.microsoft.com/office/drawing/2016/5/13/chartex" xmlns:cx8="http://schemas.microsoft.com/office/drawing/2016/5/14/chartex" xmlns:cr="http://schemas.microsoft.com/office/comments/2020/reactions" xmlns:mc="http://schemas.openxmlformats.org/markup-compatibility/2006" xmlns:aink="http://schemas.microsoft.com/office/drawing/2016/ink" xmlns:am3d="http://schemas.microsoft.com/office/drawing/2017/model3d" xmlns:o="urn:schemas-microsoft-com:office:office" xmlns:oel="http://schemas.microsoft.com/office/2019/extlst" xmlns:r="http://schemas.openxmlformats.org/officeDocument/2006/relationships" xmlns:m="http://schemas.openxmlformats.org/officeDocument/2006/math" xmlns:v="urn:schemas-microsoft-com:vml" xmlns:wp14="http://schemas.microsoft.com/office/word/2010/wordprocessingDrawing" xmlns:wp="http://schemas.openxmlformats.org/drawingml/2006/wordprocessingDrawing" xmlns:w10="urn:schemas-microsoft-com:office:word" xmlns:w="http://schemas.openxmlformats.org/wordprocessingml/2006/main" xmlns:w14="http://schemas.microsoft.com/office/word/2010/wordml" xmlns:w15="http://schemas.microsoft.com/office/word/2012/wordml" xmlns:w16cex="http://schemas.microsoft.com/office/word/2018/wordml/cex" xmlns:w16cid="http://schemas.microsoft.com/office/word/2016/wordml/cid" xmlns:w16="http://schemas.microsoft.com/office/word/2018/wordml" xmlns:w16du="http://schemas.microsoft.com/office/word/2023/wordml/word16du" xmlns:w16sdtdh="http://schemas.microsoft.com/office/word/2020/wordml/sdtdatahash" xmlns:w16sdtfl="http://schemas.microsoft.com/office/word/2024/wordml/sdtformatlock" xmlns:w16se="http://schemas.microsoft.com/office/word/2015/wordml/symex" xmlns:wpg="http://schemas.microsoft.com/office/word/2010/wordprocessingGroup" xmlns:wpi="http://schemas.microsoft.com/office/word/2010/wordprocessingInk" xmlns:wne="http://schemas.microsoft.com/office/word/2006/wordml" xmlns:wps="http://schemas.microsoft.com/office/word/2010/wordprocessingShape" mc:Ignorable="w14 w15 w16se w16cid w16 w16cex w16sdtdh w16sdtfl cr w16du wp14">
+<w16cex:commentsExtensible xmlns:wpc="http://schemas.microsoft.com/office/word/2010/wordprocessingCanvas" xmlns:cx="http://schemas.microsoft.com/office/drawing/2014/chartex" xmlns:cx1="http://schemas.microsoft.com/office/drawing/2015/9/8/chartex" xmlns:cx2="http://schemas.microsoft.com/office/drawing/2015/10/21/chartex" xmlns:cx3="http://schemas.microsoft.com/office/drawing/2016/5/9/chartex" xmlns:cx4="http://schemas.microsoft.com/office/drawing/2016/5/10/chartex" xmlns:cx5="http://schemas.microsoft.com/office/drawing/2016/5/11/chartex" xmlns:cx6="http://schemas.microsoft.com/office/drawing/2016/5/12/chartex" xmlns:cx7="http://schemas.microsoft.com/office/drawing/2016/5/13/chartex" xmlns:cx8="http://schemas.microsoft.com/office/drawing/2016/5/14/chartex" xmlns:cr="http://schemas.microsoft.com/office/comments/2020/reactions" xmlns:mc="http://schemas.openxmlformats.org/markup-compatibility/2006" xmlns:aink="http://schemas.microsoft.com/office/drawing/2016/ink" xmlns:am3d="http://schemas.microsoft.com/office/drawing/2017/model3d" xmlns:o="urn:schemas-microsoft-com:office:office" xmlns:oel="http://schemas.microsoft.com/office/2019/extlst" xmlns:r="http://schemas.openxmlformats.org/officeDocument/2006/relationships" xmlns:m="http://schemas.openxmlformats.org/officeDocument/2006/math" xmlns:v="urn:schemas-microsoft-com:vml" xmlns:wp14="http://schemas.microsoft.com/office/word/2010/wordprocessingDrawing" xmlns:wp="http://schemas.openxmlformats.org/drawingml/2006/wordprocessingDrawing" xmlns:w10="urn:schemas-microsoft-com:office:word" xmlns:w="http://schemas.openxmlformats.org/wordprocessingml/2006/main" xmlns:w14="http://schemas.microsoft.com/office/word/2010/wordml" xmlns:w15="http://schemas.microsoft.com/office/word/2012/wordml" xmlns:w16cex="http://schemas.microsoft.com/office/word/2018/wordml/cex" xmlns:w16cid="http://schemas.microsoft.com/office/word/2016/wordml/cid" xmlns:w16="http://schemas.microsoft.com/office/word/2018/wordml" xmlns:w16du="http://schemas.microsoft.com/office/word/2023/wordml/word16du" xmlns:w16sdtdh="http://schemas.microsoft.com/office/word/2020/wordml/sdtdatahash" xmlns:w16se="http://schemas.microsoft.com/office/word/2015/wordml/symex" xmlns:wpg="http://schemas.microsoft.com/office/word/2010/wordprocessingGroup" xmlns:wpi="http://schemas.microsoft.com/office/word/2010/wordprocessingInk" xmlns:wne="http://schemas.microsoft.com/office/word/2006/wordml" xmlns:wps="http://schemas.microsoft.com/office/word/2010/wordprocessingShape" mc:Ignorable="w14 w15 w16se w16cid w16 w16cex w16sdtdh cr w16du wp14">
   <w16cex:commentExtensible w16cex:durableId="6403676D" w16cex:dateUtc="2025-01-07T08:13:00Z"/>
   <w16cex:commentExtensible w16cex:durableId="18200464" w16cex:dateUtc="2025-01-06T09:18:00Z"/>
   <w16cex:commentExtensible w16cex:durableId="427B5BD5" w16cex:dateUtc="2025-01-06T09:30:00Z"/>
@@ -1435,7 +1199,7 @@
 </file>
 
 <file path=word/commentsIds.xml><?xml version="1.0" encoding="utf-8"?>
-<w16cid:commentsIds xmlns:wpc="http://schemas.microsoft.com/office/word/2010/wordprocessingCanvas" xmlns:cx="http://schemas.microsoft.com/office/drawing/2014/chartex" xmlns:cx1="http://schemas.microsoft.com/office/drawing/2015/9/8/chartex" xmlns:cx2="http://schemas.microsoft.com/office/drawing/2015/10/21/chartex" xmlns:cx3="http://schemas.microsoft.com/office/drawing/2016/5/9/chartex" xmlns:cx4="http://schemas.microsoft.com/office/drawing/2016/5/10/chartex" xmlns:cx5="http://schemas.microsoft.com/office/drawing/2016/5/11/chartex" xmlns:cx6="http://schemas.microsoft.com/office/drawing/2016/5/12/chartex" xmlns:cx7="http://schemas.microsoft.com/office/drawing/2016/5/13/chartex" xmlns:cx8="http://schemas.microsoft.com/office/drawing/2016/5/14/chartex" xmlns:mc="http://schemas.openxmlformats.org/markup-compatibility/2006" xmlns:aink="http://schemas.microsoft.com/office/drawing/2016/ink" xmlns:am3d="http://schemas.microsoft.com/office/drawing/2017/model3d" xmlns:o="urn:schemas-microsoft-com:office:office" xmlns:oel="http://schemas.microsoft.com/office/2019/extlst" xmlns:r="http://schemas.openxmlformats.org/officeDocument/2006/relationships" xmlns:m="http://schemas.openxmlformats.org/officeDocument/2006/math" xmlns:v="urn:schemas-microsoft-com:vml" xmlns:wp14="http://schemas.microsoft.com/office/word/2010/wordprocessingDrawing" xmlns:wp="http://schemas.openxmlformats.org/drawingml/2006/wordprocessingDrawing" xmlns:w10="urn:schemas-microsoft-com:office:word" xmlns:w="http://schemas.openxmlformats.org/wordprocessingml/2006/main" xmlns:w14="http://schemas.microsoft.com/office/word/2010/wordml" xmlns:w15="http://schemas.microsoft.com/office/word/2012/wordml" xmlns:w16cex="http://schemas.microsoft.com/office/word/2018/wordml/cex" xmlns:w16cid="http://schemas.microsoft.com/office/word/2016/wordml/cid" xmlns:w16="http://schemas.microsoft.com/office/word/2018/wordml" xmlns:w16du="http://schemas.microsoft.com/office/word/2023/wordml/word16du" xmlns:w16sdtdh="http://schemas.microsoft.com/office/word/2020/wordml/sdtdatahash" xmlns:w16sdtfl="http://schemas.microsoft.com/office/word/2024/wordml/sdtformatlock" xmlns:w16se="http://schemas.microsoft.com/office/word/2015/wordml/symex" xmlns:wpg="http://schemas.microsoft.com/office/word/2010/wordprocessingGroup" xmlns:wpi="http://schemas.microsoft.com/office/word/2010/wordprocessingInk" xmlns:wne="http://schemas.microsoft.com/office/word/2006/wordml" xmlns:wps="http://schemas.microsoft.com/office/word/2010/wordprocessingShape" mc:Ignorable="w14 w15 w16se w16cid w16 w16cex w16sdtdh w16sdtfl w16du wp14">
+<w16cid:commentsIds xmlns:wpc="http://schemas.microsoft.com/office/word/2010/wordprocessingCanvas" xmlns:cx="http://schemas.microsoft.com/office/drawing/2014/chartex" xmlns:cx1="http://schemas.microsoft.com/office/drawing/2015/9/8/chartex" xmlns:cx2="http://schemas.microsoft.com/office/drawing/2015/10/21/chartex" xmlns:cx3="http://schemas.microsoft.com/office/drawing/2016/5/9/chartex" xmlns:cx4="http://schemas.microsoft.com/office/drawing/2016/5/10/chartex" xmlns:cx5="http://schemas.microsoft.com/office/drawing/2016/5/11/chartex" xmlns:cx6="http://schemas.microsoft.com/office/drawing/2016/5/12/chartex" xmlns:cx7="http://schemas.microsoft.com/office/drawing/2016/5/13/chartex" xmlns:cx8="http://schemas.microsoft.com/office/drawing/2016/5/14/chartex" xmlns:mc="http://schemas.openxmlformats.org/markup-compatibility/2006" xmlns:aink="http://schemas.microsoft.com/office/drawing/2016/ink" xmlns:am3d="http://schemas.microsoft.com/office/drawing/2017/model3d" xmlns:o="urn:schemas-microsoft-com:office:office" xmlns:oel="http://schemas.microsoft.com/office/2019/extlst" xmlns:r="http://schemas.openxmlformats.org/officeDocument/2006/relationships" xmlns:m="http://schemas.openxmlformats.org/officeDocument/2006/math" xmlns:v="urn:schemas-microsoft-com:vml" xmlns:wp14="http://schemas.microsoft.com/office/word/2010/wordprocessingDrawing" xmlns:wp="http://schemas.openxmlformats.org/drawingml/2006/wordprocessingDrawing" xmlns:w10="urn:schemas-microsoft-com:office:word" xmlns:w="http://schemas.openxmlformats.org/wordprocessingml/2006/main" xmlns:w14="http://schemas.microsoft.com/office/word/2010/wordml" xmlns:w15="http://schemas.microsoft.com/office/word/2012/wordml" xmlns:w16cex="http://schemas.microsoft.com/office/word/2018/wordml/cex" xmlns:w16cid="http://schemas.microsoft.com/office/word/2016/wordml/cid" xmlns:w16="http://schemas.microsoft.com/office/word/2018/wordml" xmlns:w16du="http://schemas.microsoft.com/office/word/2023/wordml/word16du" xmlns:w16sdtdh="http://schemas.microsoft.com/office/word/2020/wordml/sdtdatahash" xmlns:w16se="http://schemas.microsoft.com/office/word/2015/wordml/symex" xmlns:wpg="http://schemas.microsoft.com/office/word/2010/wordprocessingGroup" xmlns:wpi="http://schemas.microsoft.com/office/word/2010/wordprocessingInk" xmlns:wne="http://schemas.microsoft.com/office/word/2006/wordml" xmlns:wps="http://schemas.microsoft.com/office/word/2010/wordprocessingShape" mc:Ignorable="w14 w15 w16se w16cid w16 w16cex w16sdtdh w16du wp14">
   <w16cid:commentId w16cid:paraId="377670DF" w16cid:durableId="6403676D"/>
   <w16cid:commentId w16cid:paraId="72217A0A" w16cid:durableId="18200464"/>
   <w16cid:commentId w16cid:paraId="3ABA5523" w16cid:durableId="427B5BD5"/>
@@ -1449,7 +1213,7 @@
 </file>
 
 <file path=word/numbering.xml><?xml version="1.0" encoding="utf-8"?>
-<w:numbering xmlns:wpc="http://schemas.microsoft.com/office/word/2010/wordprocessingCanvas" xmlns:cx="http://schemas.microsoft.com/office/drawing/2014/chartex" xmlns:cx1="http://schemas.microsoft.com/office/drawing/2015/9/8/chartex" xmlns:cx2="http://schemas.microsoft.com/office/drawing/2015/10/21/chartex" xmlns:cx3="http://schemas.microsoft.com/office/drawing/2016/5/9/chartex" xmlns:cx4="http://schemas.microsoft.com/office/drawing/2016/5/10/chartex" xmlns:cx5="http://schemas.microsoft.com/office/drawing/2016/5/11/chartex" xmlns:cx6="http://schemas.microsoft.com/office/drawing/2016/5/12/chartex" xmlns:cx7="http://schemas.microsoft.com/office/drawing/2016/5/13/chartex" xmlns:cx8="http://schemas.microsoft.com/office/drawing/2016/5/14/chartex" xmlns:mc="http://schemas.openxmlformats.org/markup-compatibility/2006" xmlns:aink="http://schemas.microsoft.com/office/drawing/2016/ink" xmlns:am3d="http://schemas.microsoft.com/office/drawing/2017/model3d" xmlns:o="urn:schemas-microsoft-com:office:office" xmlns:oel="http://schemas.microsoft.com/office/2019/extlst" xmlns:r="http://schemas.openxmlformats.org/officeDocument/2006/relationships" xmlns:m="http://schemas.openxmlformats.org/officeDocument/2006/math" xmlns:v="urn:schemas-microsoft-com:vml" xmlns:wp14="http://schemas.microsoft.com/office/word/2010/wordprocessingDrawing" xmlns:wp="http://schemas.openxmlformats.org/drawingml/2006/wordprocessingDrawing" xmlns:w10="urn:schemas-microsoft-com:office:word" xmlns:w="http://schemas.openxmlformats.org/wordprocessingml/2006/main" xmlns:w14="http://schemas.microsoft.com/office/word/2010/wordml" xmlns:w15="http://schemas.microsoft.com/office/word/2012/wordml" xmlns:w16cex="http://schemas.microsoft.com/office/word/2018/wordml/cex" xmlns:w16cid="http://schemas.microsoft.com/office/word/2016/wordml/cid" xmlns:w16="http://schemas.microsoft.com/office/word/2018/wordml" xmlns:w16du="http://schemas.microsoft.com/office/word/2023/wordml/word16du" xmlns:w16sdtdh="http://schemas.microsoft.com/office/word/2020/wordml/sdtdatahash" xmlns:w16sdtfl="http://schemas.microsoft.com/office/word/2024/wordml/sdtformatlock" xmlns:w16se="http://schemas.microsoft.com/office/word/2015/wordml/symex" xmlns:wpg="http://schemas.microsoft.com/office/word/2010/wordprocessingGroup" xmlns:wpi="http://schemas.microsoft.com/office/word/2010/wordprocessingInk" xmlns:wne="http://schemas.microsoft.com/office/word/2006/wordml" xmlns:wps="http://schemas.microsoft.com/office/word/2010/wordprocessingShape" mc:Ignorable="w14 w15 w16se w16cid w16 w16cex w16sdtdh w16sdtfl w16du wp14">
+<w:numbering xmlns:wpc="http://schemas.microsoft.com/office/word/2010/wordprocessingCanvas" xmlns:cx="http://schemas.microsoft.com/office/drawing/2014/chartex" xmlns:cx1="http://schemas.microsoft.com/office/drawing/2015/9/8/chartex" xmlns:cx2="http://schemas.microsoft.com/office/drawing/2015/10/21/chartex" xmlns:cx3="http://schemas.microsoft.com/office/drawing/2016/5/9/chartex" xmlns:cx4="http://schemas.microsoft.com/office/drawing/2016/5/10/chartex" xmlns:cx5="http://schemas.microsoft.com/office/drawing/2016/5/11/chartex" xmlns:cx6="http://schemas.microsoft.com/office/drawing/2016/5/12/chartex" xmlns:cx7="http://schemas.microsoft.com/office/drawing/2016/5/13/chartex" xmlns:cx8="http://schemas.microsoft.com/office/drawing/2016/5/14/chartex" xmlns:mc="http://schemas.openxmlformats.org/markup-compatibility/2006" xmlns:aink="http://schemas.microsoft.com/office/drawing/2016/ink" xmlns:am3d="http://schemas.microsoft.com/office/drawing/2017/model3d" xmlns:o="urn:schemas-microsoft-com:office:office" xmlns:oel="http://schemas.microsoft.com/office/2019/extlst" xmlns:r="http://schemas.openxmlformats.org/officeDocument/2006/relationships" xmlns:m="http://schemas.openxmlformats.org/officeDocument/2006/math" xmlns:v="urn:schemas-microsoft-com:vml" xmlns:wp14="http://schemas.microsoft.com/office/word/2010/wordprocessingDrawing" xmlns:wp="http://schemas.openxmlformats.org/drawingml/2006/wordprocessingDrawing" xmlns:w10="urn:schemas-microsoft-com:office:word" xmlns:w="http://schemas.openxmlformats.org/wordprocessingml/2006/main" xmlns:w14="http://schemas.microsoft.com/office/word/2010/wordml" xmlns:w15="http://schemas.microsoft.com/office/word/2012/wordml" xmlns:w16cex="http://schemas.microsoft.com/office/word/2018/wordml/cex" xmlns:w16cid="http://schemas.microsoft.com/office/word/2016/wordml/cid" xmlns:w16="http://schemas.microsoft.com/office/word/2018/wordml" xmlns:w16du="http://schemas.microsoft.com/office/word/2023/wordml/word16du" xmlns:w16sdtdh="http://schemas.microsoft.com/office/word/2020/wordml/sdtdatahash" xmlns:w16se="http://schemas.microsoft.com/office/word/2015/wordml/symex" xmlns:wpg="http://schemas.microsoft.com/office/word/2010/wordprocessingGroup" xmlns:wpi="http://schemas.microsoft.com/office/word/2010/wordprocessingInk" xmlns:wne="http://schemas.microsoft.com/office/word/2006/wordml" xmlns:wps="http://schemas.microsoft.com/office/word/2010/wordprocessingShape" mc:Ignorable="w14 w15 w16se w16cid w16 w16cex w16sdtdh w16du wp14">
   <w:abstractNum w:abstractNumId="0" w15:restartNumberingAfterBreak="0">
     <w:nsid w:val="0B1C6C8E"/>
     <w:multiLevelType w:val="hybridMultilevel"/>
@@ -1658,7 +1422,7 @@
 </file>
 
 <file path=word/people.xml><?xml version="1.0" encoding="utf-8"?>
-<w15:people xmlns:wpc="http://schemas.microsoft.com/office/word/2010/wordprocessingCanvas" xmlns:cx="http://schemas.microsoft.com/office/drawing/2014/chartex" xmlns:cx1="http://schemas.microsoft.com/office/drawing/2015/9/8/chartex" xmlns:cx2="http://schemas.microsoft.com/office/drawing/2015/10/21/chartex" xmlns:cx3="http://schemas.microsoft.com/office/drawing/2016/5/9/chartex" xmlns:cx4="http://schemas.microsoft.com/office/drawing/2016/5/10/chartex" xmlns:cx5="http://schemas.microsoft.com/office/drawing/2016/5/11/chartex" xmlns:cx6="http://schemas.microsoft.com/office/drawing/2016/5/12/chartex" xmlns:cx7="http://schemas.microsoft.com/office/drawing/2016/5/13/chartex" xmlns:cx8="http://schemas.microsoft.com/office/drawing/2016/5/14/chartex" xmlns:mc="http://schemas.openxmlformats.org/markup-compatibility/2006" xmlns:aink="http://schemas.microsoft.com/office/drawing/2016/ink" xmlns:am3d="http://schemas.microsoft.com/office/drawing/2017/model3d" xmlns:o="urn:schemas-microsoft-com:office:office" xmlns:oel="http://schemas.microsoft.com/office/2019/extlst" xmlns:r="http://schemas.openxmlformats.org/officeDocument/2006/relationships" xmlns:m="http://schemas.openxmlformats.org/officeDocument/2006/math" xmlns:v="urn:schemas-microsoft-com:vml" xmlns:wp14="http://schemas.microsoft.com/office/word/2010/wordprocessingDrawing" xmlns:wp="http://schemas.openxmlformats.org/drawingml/2006/wordprocessingDrawing" xmlns:w10="urn:schemas-microsoft-com:office:word" xmlns:w="http://schemas.openxmlformats.org/wordprocessingml/2006/main" xmlns:w14="http://schemas.microsoft.com/office/word/2010/wordml" xmlns:w15="http://schemas.microsoft.com/office/word/2012/wordml" xmlns:w16cex="http://schemas.microsoft.com/office/word/2018/wordml/cex" xmlns:w16cid="http://schemas.microsoft.com/office/word/2016/wordml/cid" xmlns:w16="http://schemas.microsoft.com/office/word/2018/wordml" xmlns:w16du="http://schemas.microsoft.com/office/word/2023/wordml/word16du" xmlns:w16sdtdh="http://schemas.microsoft.com/office/word/2020/wordml/sdtdatahash" xmlns:w16sdtfl="http://schemas.microsoft.com/office/word/2024/wordml/sdtformatlock" xmlns:w16se="http://schemas.microsoft.com/office/word/2015/wordml/symex" xmlns:wpg="http://schemas.microsoft.com/office/word/2010/wordprocessingGroup" xmlns:wpi="http://schemas.microsoft.com/office/word/2010/wordprocessingInk" xmlns:wne="http://schemas.microsoft.com/office/word/2006/wordml" xmlns:wps="http://schemas.microsoft.com/office/word/2010/wordprocessingShape" mc:Ignorable="w14 w15 w16se w16cid w16 w16cex w16sdtdh w16sdtfl w16du wp14">
+<w15:people xmlns:wpc="http://schemas.microsoft.com/office/word/2010/wordprocessingCanvas" xmlns:cx="http://schemas.microsoft.com/office/drawing/2014/chartex" xmlns:cx1="http://schemas.microsoft.com/office/drawing/2015/9/8/chartex" xmlns:cx2="http://schemas.microsoft.com/office/drawing/2015/10/21/chartex" xmlns:cx3="http://schemas.microsoft.com/office/drawing/2016/5/9/chartex" xmlns:cx4="http://schemas.microsoft.com/office/drawing/2016/5/10/chartex" xmlns:cx5="http://schemas.microsoft.com/office/drawing/2016/5/11/chartex" xmlns:cx6="http://schemas.microsoft.com/office/drawing/2016/5/12/chartex" xmlns:cx7="http://schemas.microsoft.com/office/drawing/2016/5/13/chartex" xmlns:cx8="http://schemas.microsoft.com/office/drawing/2016/5/14/chartex" xmlns:mc="http://schemas.openxmlformats.org/markup-compatibility/2006" xmlns:aink="http://schemas.microsoft.com/office/drawing/2016/ink" xmlns:am3d="http://schemas.microsoft.com/office/drawing/2017/model3d" xmlns:o="urn:schemas-microsoft-com:office:office" xmlns:oel="http://schemas.microsoft.com/office/2019/extlst" xmlns:r="http://schemas.openxmlformats.org/officeDocument/2006/relationships" xmlns:m="http://schemas.openxmlformats.org/officeDocument/2006/math" xmlns:v="urn:schemas-microsoft-com:vml" xmlns:wp14="http://schemas.microsoft.com/office/word/2010/wordprocessingDrawing" xmlns:wp="http://schemas.openxmlformats.org/drawingml/2006/wordprocessingDrawing" xmlns:w10="urn:schemas-microsoft-com:office:word" xmlns:w="http://schemas.openxmlformats.org/wordprocessingml/2006/main" xmlns:w14="http://schemas.microsoft.com/office/word/2010/wordml" xmlns:w15="http://schemas.microsoft.com/office/word/2012/wordml" xmlns:w16cex="http://schemas.microsoft.com/office/word/2018/wordml/cex" xmlns:w16cid="http://schemas.microsoft.com/office/word/2016/wordml/cid" xmlns:w16="http://schemas.microsoft.com/office/word/2018/wordml" xmlns:w16du="http://schemas.microsoft.com/office/word/2023/wordml/word16du" xmlns:w16sdtdh="http://schemas.microsoft.com/office/word/2020/wordml/sdtdatahash" xmlns:w16se="http://schemas.microsoft.com/office/word/2015/wordml/symex" xmlns:wpg="http://schemas.microsoft.com/office/word/2010/wordprocessingGroup" xmlns:wpi="http://schemas.microsoft.com/office/word/2010/wordprocessingInk" xmlns:wne="http://schemas.microsoft.com/office/word/2006/wordml" xmlns:wps="http://schemas.microsoft.com/office/word/2010/wordprocessingShape" mc:Ignorable="w14 w15 w16se w16cid w16 w16cex w16sdtdh w16du wp14">
   <w15:person w15:author="Daniel Parra">
     <w15:presenceInfo w15:providerId="Windows Live" w15:userId="c5dbecc73b6fc60e"/>
   </w15:person>
@@ -1669,7 +1433,7 @@
 </file>
 
 <file path=word/styles.xml><?xml version="1.0" encoding="utf-8"?>
-<w:styles xmlns:mc="http://schemas.openxmlformats.org/markup-compatibility/2006" xmlns:r="http://schemas.openxmlformats.org/officeDocument/2006/relationships" xmlns:w="http://schemas.openxmlformats.org/wordprocessingml/2006/main" xmlns:w14="http://schemas.microsoft.com/office/word/2010/wordml" xmlns:w15="http://schemas.microsoft.com/office/word/2012/wordml" xmlns:w16cex="http://schemas.microsoft.com/office/word/2018/wordml/cex" xmlns:w16cid="http://schemas.microsoft.com/office/word/2016/wordml/cid" xmlns:w16="http://schemas.microsoft.com/office/word/2018/wordml" xmlns:w16du="http://schemas.microsoft.com/office/word/2023/wordml/word16du" xmlns:w16sdtdh="http://schemas.microsoft.com/office/word/2020/wordml/sdtdatahash" xmlns:w16sdtfl="http://schemas.microsoft.com/office/word/2024/wordml/sdtformatlock" xmlns:w16se="http://schemas.microsoft.com/office/word/2015/wordml/symex" mc:Ignorable="w14 w15 w16se w16cid w16 w16cex w16sdtdh w16sdtfl w16du">
+<w:styles xmlns:mc="http://schemas.openxmlformats.org/markup-compatibility/2006" xmlns:r="http://schemas.openxmlformats.org/officeDocument/2006/relationships" xmlns:w="http://schemas.openxmlformats.org/wordprocessingml/2006/main" xmlns:w14="http://schemas.microsoft.com/office/word/2010/wordml" xmlns:w15="http://schemas.microsoft.com/office/word/2012/wordml" xmlns:w16cex="http://schemas.microsoft.com/office/word/2018/wordml/cex" xmlns:w16cid="http://schemas.microsoft.com/office/word/2016/wordml/cid" xmlns:w16="http://schemas.microsoft.com/office/word/2018/wordml" xmlns:w16du="http://schemas.microsoft.com/office/word/2023/wordml/word16du" xmlns:w16sdtdh="http://schemas.microsoft.com/office/word/2020/wordml/sdtdatahash" xmlns:w16se="http://schemas.microsoft.com/office/word/2015/wordml/symex" mc:Ignorable="w14 w15 w16se w16cid w16 w16cex w16sdtdh w16du">
   <w:docDefaults>
     <w:rPrDefault>
       <w:rPr>

</xml_diff>

<commit_message>
Mini modificación de Python tiene en cuenta observaciones en predicciones
</commit_message>
<xml_diff>
--- a/Guiones/Guion_Dani.docx
+++ b/Guiones/Guion_Dani.docx
@@ -33,6 +33,7 @@
       <w:r>
         <w:t xml:space="preserve">Comparativa entre las funcionalidades de </w:t>
       </w:r>
+      <w:proofErr w:type="spellStart"/>
       <w:r>
         <w:rPr>
           <w:b/>
@@ -40,13 +41,22 @@
         </w:rPr>
         <w:t>evamtools</w:t>
       </w:r>
+      <w:proofErr w:type="spellEnd"/>
       <w:r>
         <w:t xml:space="preserve"> y su página web</w:t>
       </w:r>
     </w:p>
     <w:p>
       <w:r>
-        <w:t xml:space="preserve">Ambos calculan un modelo MHN sin correción de sesgo </w:t>
+        <w:t xml:space="preserve">Ambos calculan un modelo MHN sin </w:t>
+      </w:r>
+      <w:proofErr w:type="spellStart"/>
+      <w:r>
+        <w:t>correción</w:t>
+      </w:r>
+      <w:proofErr w:type="spellEnd"/>
+      <w:r>
+        <w:t xml:space="preserve"> de sesgo </w:t>
       </w:r>
       <w:commentRangeStart w:id="0"/>
       <w:r>
@@ -108,6 +118,7 @@
       <w:r>
         <w:t xml:space="preserve">La página web permite introducir la frecuencia de los genotipos de forma manual y, los datos cargados pueden ser modificados. El cálculo del modelo se realiza con la función </w:t>
       </w:r>
+      <w:proofErr w:type="spellStart"/>
       <w:r>
         <w:rPr>
           <w:b/>
@@ -115,6 +126,7 @@
         </w:rPr>
         <w:t>evam</w:t>
       </w:r>
+      <w:proofErr w:type="spellEnd"/>
       <w:r>
         <w:t xml:space="preserve"> del paquete </w:t>
       </w:r>
@@ -122,8 +134,13 @@
         <w:t xml:space="preserve">y se </w:t>
       </w:r>
       <w:r>
-        <w:t>pueden especificar parámetros como el número de núcleos (core</w:t>
-      </w:r>
+        <w:t>pueden especificar parámetros como el número de núcleos (</w:t>
+      </w:r>
+      <w:proofErr w:type="spellStart"/>
+      <w:r>
+        <w:t>core</w:t>
+      </w:r>
+      <w:proofErr w:type="spellEnd"/>
       <w:r>
         <w:t>, sólo desde R</w:t>
       </w:r>
@@ -137,15 +154,33 @@
         <w:t>dos</w:t>
       </w:r>
       <w:r>
-        <w:t>, el hiperparámetro lambda (</w:t>
-      </w:r>
+        <w:t xml:space="preserve">, el </w:t>
+      </w:r>
+      <w:proofErr w:type="spellStart"/>
+      <w:r>
+        <w:t>hiperparámetro</w:t>
+      </w:r>
+      <w:proofErr w:type="spellEnd"/>
+      <w:r>
+        <w:t xml:space="preserve"> lambda (</w:t>
+      </w:r>
+      <w:proofErr w:type="spellStart"/>
       <w:r>
         <w:rPr>
           <w:i/>
           <w:iCs/>
           <w:color w:val="7F7F7F" w:themeColor="text1" w:themeTint="80"/>
         </w:rPr>
-        <w:t>hiperparámetro = un parámetro cuyo valor se utiliza para controlar el proceso de aprendizaje</w:t>
+        <w:t>hiperparámetro</w:t>
+      </w:r>
+      <w:proofErr w:type="spellEnd"/>
+      <w:r>
+        <w:rPr>
+          <w:i/>
+          <w:iCs/>
+          <w:color w:val="7F7F7F" w:themeColor="text1" w:themeTint="80"/>
+        </w:rPr>
+        <w:t xml:space="preserve"> = un parámetro cuyo valor se utiliza para controlar el proceso de aprendizaje</w:t>
       </w:r>
       <w:r>
         <w:t xml:space="preserve">). </w:t>
@@ -210,13 +245,27 @@
         </w:numPr>
       </w:pPr>
       <w:r>
-        <w:t>Comparativa entre las funcionalidades de evamtools y mhn</w:t>
-      </w:r>
+        <w:t xml:space="preserve">Comparativa entre las funcionalidades de </w:t>
+      </w:r>
+      <w:proofErr w:type="spellStart"/>
+      <w:r>
+        <w:t>evamtools</w:t>
+      </w:r>
+      <w:proofErr w:type="spellEnd"/>
+      <w:r>
+        <w:t xml:space="preserve"> y </w:t>
+      </w:r>
+      <w:proofErr w:type="spellStart"/>
+      <w:r>
+        <w:t>mhn</w:t>
+      </w:r>
+      <w:proofErr w:type="spellEnd"/>
     </w:p>
     <w:p>
       <w:r>
         <w:t xml:space="preserve">Respecto al paquete </w:t>
       </w:r>
+      <w:proofErr w:type="spellStart"/>
       <w:r>
         <w:rPr>
           <w:b/>
@@ -224,9 +273,11 @@
         </w:rPr>
         <w:t>mhn</w:t>
       </w:r>
+      <w:proofErr w:type="spellEnd"/>
       <w:r>
         <w:t xml:space="preserve"> de Python y </w:t>
       </w:r>
+      <w:proofErr w:type="spellStart"/>
       <w:r>
         <w:rPr>
           <w:b/>
@@ -234,6 +285,7 @@
         </w:rPr>
         <w:t>evamtools</w:t>
       </w:r>
+      <w:proofErr w:type="spellEnd"/>
       <w:r>
         <w:t xml:space="preserve"> de R, el primero</w:t>
       </w:r>
@@ -256,10 +308,26 @@
         <w:rPr>
           <w:u w:val="single"/>
         </w:rPr>
-        <w:t>calcular el oMHN</w:t>
-      </w:r>
-      <w:r>
-        <w:t xml:space="preserve"> (aplicando la correción del sesgo).</w:t>
+        <w:t xml:space="preserve">calcular el </w:t>
+      </w:r>
+      <w:proofErr w:type="spellStart"/>
+      <w:r>
+        <w:rPr>
+          <w:u w:val="single"/>
+        </w:rPr>
+        <w:t>oMHN</w:t>
+      </w:r>
+      <w:proofErr w:type="spellEnd"/>
+      <w:r>
+        <w:t xml:space="preserve"> (aplicando la </w:t>
+      </w:r>
+      <w:proofErr w:type="spellStart"/>
+      <w:r>
+        <w:t>correción</w:t>
+      </w:r>
+      <w:proofErr w:type="spellEnd"/>
+      <w:r>
+        <w:t xml:space="preserve"> del sesgo).</w:t>
       </w:r>
       <w:r>
         <w:t xml:space="preserve"> Sin embargo</w:t>
@@ -277,20 +345,37 @@
         <w:rPr>
           <w:u w:val="single"/>
         </w:rPr>
-        <w:t>aplicar otros CPMs</w:t>
-      </w:r>
+        <w:t xml:space="preserve">aplicar otros </w:t>
+      </w:r>
+      <w:proofErr w:type="spellStart"/>
+      <w:r>
+        <w:rPr>
+          <w:u w:val="single"/>
+        </w:rPr>
+        <w:t>CPMs</w:t>
+      </w:r>
+      <w:proofErr w:type="spellEnd"/>
       <w:r>
         <w:t xml:space="preserve"> y </w:t>
       </w:r>
       <w:r>
         <w:t xml:space="preserve">cuenta con la función </w:t>
       </w:r>
-      <w:r>
-        <w:rPr>
-          <w:b/>
-          <w:bCs/>
-        </w:rPr>
-        <w:t>random_evam()</w:t>
+      <w:proofErr w:type="spellStart"/>
+      <w:r>
+        <w:rPr>
+          <w:b/>
+          <w:bCs/>
+        </w:rPr>
+        <w:t>random_evam</w:t>
+      </w:r>
+      <w:proofErr w:type="spellEnd"/>
+      <w:r>
+        <w:rPr>
+          <w:b/>
+          <w:bCs/>
+        </w:rPr>
+        <w:t>()</w:t>
       </w:r>
       <w:r>
         <w:t xml:space="preserve"> que permite </w:t>
@@ -315,12 +400,21 @@
       <w:r>
         <w:t xml:space="preserve">Además, contiene la función </w:t>
       </w:r>
-      <w:r>
-        <w:rPr>
-          <w:b/>
-          <w:bCs/>
-        </w:rPr>
-        <w:t>lambda_from_cv()</w:t>
+      <w:proofErr w:type="spellStart"/>
+      <w:r>
+        <w:rPr>
+          <w:b/>
+          <w:bCs/>
+        </w:rPr>
+        <w:t>lambda_from_cv</w:t>
+      </w:r>
+      <w:proofErr w:type="spellEnd"/>
+      <w:r>
+        <w:rPr>
+          <w:b/>
+          <w:bCs/>
+        </w:rPr>
+        <w:t>()</w:t>
       </w:r>
       <w:r>
         <w:t xml:space="preserve"> que le permite calcular el lambda óptimo para el conjunto de datos </w:t>
@@ -330,7 +424,21 @@
         <w:rPr>
           <w:strike/>
         </w:rPr>
-        <w:t>(indicando los valores de lambda máximo y mínimo, el número de pasos y el número de folds).</w:t>
+        <w:t xml:space="preserve">(indicando los valores de lambda máximo y mínimo, el número de pasos y el número de </w:t>
+      </w:r>
+      <w:proofErr w:type="spellStart"/>
+      <w:r>
+        <w:rPr>
+          <w:strike/>
+        </w:rPr>
+        <w:t>folds</w:t>
+      </w:r>
+      <w:proofErr w:type="spellEnd"/>
+      <w:r>
+        <w:rPr>
+          <w:strike/>
+        </w:rPr>
+        <w:t>).</w:t>
       </w:r>
       <w:r>
         <w:t xml:space="preserve"> </w:t>
@@ -343,8 +451,25 @@
         <w:commentReference w:id="1"/>
       </w:r>
       <w:r>
-        <w:t xml:space="preserve">Sin embargo, para datasets pequeños el cálculo de lambda da error (Zero Divission Error). En </w:t>
-      </w:r>
+        <w:t xml:space="preserve">Sin embargo, para </w:t>
+      </w:r>
+      <w:proofErr w:type="spellStart"/>
+      <w:r>
+        <w:t>datasets</w:t>
+      </w:r>
+      <w:proofErr w:type="spellEnd"/>
+      <w:r>
+        <w:t xml:space="preserve"> pequeños el cálculo de lambda da error (Zero </w:t>
+      </w:r>
+      <w:proofErr w:type="spellStart"/>
+      <w:r>
+        <w:t>Divission</w:t>
+      </w:r>
+      <w:proofErr w:type="spellEnd"/>
+      <w:r>
+        <w:t xml:space="preserve"> Error). En </w:t>
+      </w:r>
+      <w:proofErr w:type="spellStart"/>
       <w:r>
         <w:rPr>
           <w:b/>
@@ -352,6 +477,7 @@
         </w:rPr>
         <w:t>evamtools</w:t>
       </w:r>
+      <w:proofErr w:type="spellEnd"/>
       <w:r>
         <w:t xml:space="preserve">, no hay ninguna función que </w:t>
       </w:r>
@@ -375,6 +501,7 @@
       <w:r>
         <w:t xml:space="preserve">; y posee la función </w:t>
       </w:r>
+      <w:proofErr w:type="spellStart"/>
       <w:r>
         <w:rPr>
           <w:b/>
@@ -382,6 +509,7 @@
         </w:rPr>
         <w:t>plot_evam</w:t>
       </w:r>
+      <w:proofErr w:type="spellEnd"/>
       <w:r>
         <w:rPr>
           <w:b/>
@@ -409,12 +537,21 @@
       <w:r>
         <w:t xml:space="preserve"> se pueden generar datos sintéticos empleando la función </w:t>
       </w:r>
-      <w:r>
-        <w:rPr>
-          <w:b/>
-          <w:bCs/>
-        </w:rPr>
-        <w:t>sample_artificial_data()</w:t>
+      <w:proofErr w:type="spellStart"/>
+      <w:r>
+        <w:rPr>
+          <w:b/>
+          <w:bCs/>
+        </w:rPr>
+        <w:t>sample_artificial_data</w:t>
+      </w:r>
+      <w:proofErr w:type="spellEnd"/>
+      <w:r>
+        <w:rPr>
+          <w:b/>
+          <w:bCs/>
+        </w:rPr>
+        <w:t>()</w:t>
       </w:r>
       <w:r>
         <w:t xml:space="preserve"> </w:t>
@@ -431,12 +568,21 @@
       <w:r>
         <w:t xml:space="preserve"> </w:t>
       </w:r>
-      <w:r>
-        <w:rPr>
-          <w:b/>
-          <w:bCs/>
-        </w:rPr>
-        <w:t>sample_evam()</w:t>
+      <w:proofErr w:type="spellStart"/>
+      <w:r>
+        <w:rPr>
+          <w:b/>
+          <w:bCs/>
+        </w:rPr>
+        <w:t>sample_evam</w:t>
+      </w:r>
+      <w:proofErr w:type="spellEnd"/>
+      <w:r>
+        <w:rPr>
+          <w:b/>
+          <w:bCs/>
+        </w:rPr>
+        <w:t>()</w:t>
       </w:r>
       <w:r>
         <w:t xml:space="preserve"> </w:t>
@@ -491,6 +637,7 @@
         </w:rPr>
         <w:t xml:space="preserve">Al calcular el modelo en R con </w:t>
       </w:r>
+      <w:proofErr w:type="spellStart"/>
       <w:r>
         <w:rPr>
           <w:b/>
@@ -499,30 +646,55 @@
         </w:rPr>
         <w:t>evam</w:t>
       </w:r>
+      <w:proofErr w:type="spellEnd"/>
       <w:r>
         <w:rPr>
           <w:strike/>
         </w:rPr>
         <w:t xml:space="preserve"> podemos especificar el parámetro </w:t>
       </w:r>
+      <w:proofErr w:type="spellStart"/>
       <w:r>
         <w:rPr>
           <w:b/>
           <w:bCs/>
           <w:strike/>
         </w:rPr>
-        <w:t>paths_max=TRUE</w:t>
-      </w:r>
-      <w:r>
-        <w:rPr>
+        <w:t>paths_max</w:t>
+      </w:r>
+      <w:proofErr w:type="spellEnd"/>
+      <w:r>
+        <w:rPr>
+          <w:b/>
+          <w:bCs/>
           <w:strike/>
         </w:rPr>
-        <w:t>, el cual nos devuelve las probabilidades que tienen cada uno de esos paths.</w:t>
+        <w:t>=TRUE</w:t>
       </w:r>
       <w:r>
         <w:rPr>
           <w:strike/>
         </w:rPr>
+        <w:t xml:space="preserve">, el cual nos devuelve las probabilidades que tienen cada uno de esos </w:t>
+      </w:r>
+      <w:proofErr w:type="spellStart"/>
+      <w:r>
+        <w:rPr>
+          <w:strike/>
+        </w:rPr>
+        <w:t>paths</w:t>
+      </w:r>
+      <w:proofErr w:type="spellEnd"/>
+      <w:r>
+        <w:rPr>
+          <w:strike/>
+        </w:rPr>
+        <w:t>.</w:t>
+      </w:r>
+      <w:r>
+        <w:rPr>
+          <w:strike/>
+        </w:rPr>
         <w:t>)</w:t>
       </w:r>
       <w:r>
@@ -536,14 +708,32 @@
         <w:commentReference w:id="3"/>
       </w:r>
       <w:r>
-        <w:t xml:space="preserve">En Python, podemos calcular las probabilidad de que una mutación haya precedido a otra sabiendo que ambas se encuentran en el presente mutadas mediante la función </w:t>
-      </w:r>
-      <w:r>
-        <w:rPr>
-          <w:b/>
-          <w:bCs/>
-        </w:rPr>
-        <w:t>sample_trajectories();</w:t>
+        <w:t xml:space="preserve">En Python, podemos calcular las probabilidad de que una mutación haya precedido a otra </w:t>
+      </w:r>
+      <w:r>
+        <w:rPr>
+          <w:color w:val="ADADAD" w:themeColor="background2" w:themeShade="BF"/>
+        </w:rPr>
+        <w:t xml:space="preserve">sabiendo que ambas se encuentran en el presente mutadas </w:t>
+      </w:r>
+      <w:r>
+        <w:t xml:space="preserve">mediante la función </w:t>
+      </w:r>
+      <w:proofErr w:type="spellStart"/>
+      <w:r>
+        <w:rPr>
+          <w:b/>
+          <w:bCs/>
+        </w:rPr>
+        <w:t>sample_trajectories</w:t>
+      </w:r>
+      <w:proofErr w:type="spellEnd"/>
+      <w:r>
+        <w:rPr>
+          <w:b/>
+          <w:bCs/>
+        </w:rPr>
+        <w:t>();</w:t>
       </w:r>
       <w:r>
         <w:t xml:space="preserve"> y también nos permite predecir el siguiente evento teniendo en cuenta </w:t>
@@ -555,18 +745,34 @@
         <w:t>un genotipo particular</w:t>
       </w:r>
       <w:r>
-        <w:t xml:space="preserve"> con la función </w:t>
-      </w:r>
-      <w:r>
-        <w:rPr>
-          <w:b/>
-          <w:bCs/>
-        </w:rPr>
-        <w:t>compute_next_events_probs().</w:t>
+        <w:t xml:space="preserve"> </w:t>
+      </w:r>
+      <w:r>
+        <w:t xml:space="preserve">(e incluir las observaciones) </w:t>
+      </w:r>
+      <w:r>
+        <w:t xml:space="preserve">con la función </w:t>
+      </w:r>
+      <w:proofErr w:type="spellStart"/>
+      <w:r>
+        <w:rPr>
+          <w:b/>
+          <w:bCs/>
+        </w:rPr>
+        <w:t>compute_next_events_probs</w:t>
+      </w:r>
+      <w:proofErr w:type="spellEnd"/>
+      <w:r>
+        <w:rPr>
+          <w:b/>
+          <w:bCs/>
+        </w:rPr>
+        <w:t>().</w:t>
       </w:r>
       <w:r>
         <w:t xml:space="preserve"> Estas dos últimas funcionalidades no las presenta </w:t>
       </w:r>
+      <w:proofErr w:type="spellStart"/>
       <w:r>
         <w:rPr>
           <w:b/>
@@ -574,6 +780,7 @@
         </w:rPr>
         <w:t>evamtools</w:t>
       </w:r>
+      <w:proofErr w:type="spellEnd"/>
       <w:r>
         <w:t>.</w:t>
       </w:r>
@@ -589,6 +796,7 @@
       <w:r>
         <w:t>Integración del código en Python en R (</w:t>
       </w:r>
+      <w:proofErr w:type="spellStart"/>
       <w:r>
         <w:rPr>
           <w:b/>
@@ -596,9 +804,11 @@
         </w:rPr>
         <w:t>evamtools</w:t>
       </w:r>
+      <w:proofErr w:type="spellEnd"/>
       <w:r>
         <w:t xml:space="preserve">): </w:t>
       </w:r>
+      <w:proofErr w:type="spellStart"/>
       <w:r>
         <w:rPr>
           <w:b/>
@@ -613,6 +823,7 @@
         </w:rPr>
         <w:t>eticulate</w:t>
       </w:r>
+      <w:proofErr w:type="spellEnd"/>
     </w:p>
     <w:p>
       <w:r>
@@ -623,15 +834,16 @@
         <w:rPr>
           <w:strike/>
         </w:rPr>
-        <w:t xml:space="preserve">(La integración entre los lenguajes de Python y R puede ser clave, permitiendo así disponer de las </w:t>
+        <w:t xml:space="preserve">(La integración </w:t>
       </w:r>
       <w:r>
         <w:rPr>
           <w:strike/>
         </w:rPr>
         <w:lastRenderedPageBreak/>
-        <w:t>funcionalidades de ambos paquetes (</w:t>
-      </w:r>
+        <w:t>entre los lenguajes de Python y R puede ser clave, permitiendo así disponer de las funcionalidades de ambos paquetes (</w:t>
+      </w:r>
+      <w:proofErr w:type="spellStart"/>
       <w:r>
         <w:rPr>
           <w:b/>
@@ -640,12 +852,14 @@
         </w:rPr>
         <w:t>mhn</w:t>
       </w:r>
+      <w:proofErr w:type="spellEnd"/>
       <w:r>
         <w:rPr>
           <w:strike/>
         </w:rPr>
         <w:t xml:space="preserve"> y </w:t>
       </w:r>
+      <w:proofErr w:type="spellStart"/>
       <w:r>
         <w:rPr>
           <w:b/>
@@ -654,6 +868,7 @@
         </w:rPr>
         <w:t>evamtools</w:t>
       </w:r>
+      <w:proofErr w:type="spellEnd"/>
       <w:r>
         <w:rPr>
           <w:strike/>
@@ -672,6 +887,7 @@
       <w:r>
         <w:t xml:space="preserve">Con este propósito, el paquete </w:t>
       </w:r>
+      <w:proofErr w:type="spellStart"/>
       <w:r>
         <w:rPr>
           <w:b/>
@@ -679,6 +895,7 @@
         </w:rPr>
         <w:t>reticulate</w:t>
       </w:r>
+      <w:proofErr w:type="spellEnd"/>
       <w:r>
         <w:t xml:space="preserve"> de R proporciona una interfaz versátil que permite ejecutar código de Python desde el entorno de R</w:t>
       </w:r>
@@ -697,6 +914,7 @@
       <w:r>
         <w:t xml:space="preserve"> (como </w:t>
       </w:r>
+      <w:proofErr w:type="spellStart"/>
       <w:r>
         <w:rPr>
           <w:b/>
@@ -704,6 +922,7 @@
         </w:rPr>
         <w:t>mhn</w:t>
       </w:r>
+      <w:proofErr w:type="spellEnd"/>
       <w:r>
         <w:t>)</w:t>
       </w:r>
@@ -744,6 +963,7 @@
       <w:r>
         <w:t xml:space="preserve"> al código de Python relacionado con el paquete </w:t>
       </w:r>
+      <w:proofErr w:type="spellStart"/>
       <w:r>
         <w:rPr>
           <w:b/>
@@ -751,6 +971,7 @@
         </w:rPr>
         <w:t>mhn</w:t>
       </w:r>
+      <w:proofErr w:type="spellEnd"/>
       <w:r>
         <w:t xml:space="preserve"> desde R. Los pasos seguidos fueron:</w:t>
       </w:r>
@@ -764,7 +985,15 @@
         </w:numPr>
       </w:pPr>
       <w:r>
-        <w:t>Configuración del entorno en Docker: Asegurar que Python esté instalado y accesible desde R mediante la configuración del intérprete Python en reticulate en la imagen de Docker.</w:t>
+        <w:t xml:space="preserve">Configuración del entorno en Docker: Asegurar que Python esté instalado y accesible desde R mediante la configuración del intérprete Python en </w:t>
+      </w:r>
+      <w:proofErr w:type="spellStart"/>
+      <w:r>
+        <w:t>reticulate</w:t>
+      </w:r>
+      <w:proofErr w:type="spellEnd"/>
+      <w:r>
+        <w:t xml:space="preserve"> en la imagen de Docker.</w:t>
       </w:r>
     </w:p>
     <w:p>
@@ -778,6 +1007,7 @@
       <w:r>
         <w:t xml:space="preserve">Instalación del paquete </w:t>
       </w:r>
+      <w:proofErr w:type="spellStart"/>
       <w:r>
         <w:rPr>
           <w:b/>
@@ -785,6 +1015,7 @@
         </w:rPr>
         <w:t>mhn</w:t>
       </w:r>
+      <w:proofErr w:type="spellEnd"/>
       <w:r>
         <w:t xml:space="preserve"> en Python</w:t>
       </w:r>
@@ -800,6 +1031,7 @@
       <w:r>
         <w:t xml:space="preserve">Ejecución de código de Python desde R: Llamar a las funciones del paquete </w:t>
       </w:r>
+      <w:proofErr w:type="spellStart"/>
       <w:r>
         <w:rPr>
           <w:b/>
@@ -807,6 +1039,7 @@
         </w:rPr>
         <w:t>mhn</w:t>
       </w:r>
+      <w:proofErr w:type="spellEnd"/>
       <w:r>
         <w:t xml:space="preserve"> </w:t>
       </w:r>
@@ -843,8 +1076,17 @@
     <w:p/>
     <w:p>
       <w:r>
-        <w:t xml:space="preserve">En Python, se nombra cMHN como el modelo clásico de MHN, el cual es el implementado en </w:t>
-      </w:r>
+        <w:t xml:space="preserve">En Python, se nombra </w:t>
+      </w:r>
+      <w:proofErr w:type="spellStart"/>
+      <w:r>
+        <w:t>cMHN</w:t>
+      </w:r>
+      <w:proofErr w:type="spellEnd"/>
+      <w:r>
+        <w:t xml:space="preserve"> como el modelo clásico de MHN, el cual es el implementado en </w:t>
+      </w:r>
+      <w:proofErr w:type="spellStart"/>
       <w:r>
         <w:rPr>
           <w:b/>
@@ -852,6 +1094,7 @@
         </w:rPr>
         <w:t>evamtools</w:t>
       </w:r>
+      <w:proofErr w:type="spellEnd"/>
       <w:r>
         <w:t xml:space="preserve">. </w:t>
       </w:r>
@@ -859,7 +1102,15 @@
         <w:t>Por</w:t>
       </w:r>
       <w:r>
-        <w:t xml:space="preserve"> ello, hemos querido comparar los resultados, utilizando el mismo dataset en Python y en R. </w:t>
+        <w:t xml:space="preserve"> ello, hemos querido comparar los resultados, utilizando el mismo </w:t>
+      </w:r>
+      <w:proofErr w:type="spellStart"/>
+      <w:r>
+        <w:t>dataset</w:t>
+      </w:r>
+      <w:proofErr w:type="spellEnd"/>
+      <w:r>
+        <w:t xml:space="preserve"> en Python y en R. </w:t>
       </w:r>
       <w:r>
         <w:t>Estos</w:t>
@@ -929,6 +1180,7 @@
       <w:r>
         <w:t xml:space="preserve"> los dos códigos, la diferencia radica en el cálculo de un valor óptimo de lambda ajustado a los datos en el caso de Python, mientras que </w:t>
       </w:r>
+      <w:proofErr w:type="spellStart"/>
       <w:r>
         <w:rPr>
           <w:b/>
@@ -936,6 +1188,7 @@
         </w:rPr>
         <w:t>evamtools</w:t>
       </w:r>
+      <w:proofErr w:type="spellEnd"/>
       <w:r>
         <w:rPr>
           <w:b/>
@@ -964,6 +1217,7 @@
       <w:r>
         <w:t xml:space="preserve"> por </w:t>
       </w:r>
+      <w:proofErr w:type="spellStart"/>
       <w:r>
         <w:rPr>
           <w:b/>
@@ -978,9 +1232,11 @@
         </w:rPr>
         <w:t>n</w:t>
       </w:r>
+      <w:proofErr w:type="spellEnd"/>
       <w:r>
         <w:t xml:space="preserve"> en </w:t>
       </w:r>
+      <w:proofErr w:type="spellStart"/>
       <w:r>
         <w:rPr>
           <w:b/>
@@ -988,6 +1244,7 @@
         </w:rPr>
         <w:t>evam</w:t>
       </w:r>
+      <w:proofErr w:type="spellEnd"/>
       <w:r>
         <w:t xml:space="preserve">, </w:t>
       </w:r>

</xml_diff>

<commit_message>
Añadida aclaración sobre el predicted_genotipes de evamtools
</commit_message>
<xml_diff>
--- a/Guiones/Guion_Dani.docx
+++ b/Guiones/Guion_Dani.docx
@@ -33,7 +33,6 @@
       <w:r>
         <w:t xml:space="preserve">Comparativa entre las funcionalidades de </w:t>
       </w:r>
-      <w:proofErr w:type="spellStart"/>
       <w:r>
         <w:rPr>
           <w:b/>
@@ -41,22 +40,13 @@
         </w:rPr>
         <w:t>evamtools</w:t>
       </w:r>
-      <w:proofErr w:type="spellEnd"/>
       <w:r>
         <w:t xml:space="preserve"> y su página web</w:t>
       </w:r>
     </w:p>
     <w:p>
       <w:r>
-        <w:t xml:space="preserve">Ambos calculan un modelo MHN sin </w:t>
-      </w:r>
-      <w:proofErr w:type="spellStart"/>
-      <w:r>
-        <w:t>correción</w:t>
-      </w:r>
-      <w:proofErr w:type="spellEnd"/>
-      <w:r>
-        <w:t xml:space="preserve"> de sesgo </w:t>
+        <w:t xml:space="preserve">Ambos calculan un modelo MHN sin correción de sesgo </w:t>
       </w:r>
       <w:commentRangeStart w:id="0"/>
       <w:r>
@@ -118,7 +108,6 @@
       <w:r>
         <w:t xml:space="preserve">La página web permite introducir la frecuencia de los genotipos de forma manual y, los datos cargados pueden ser modificados. El cálculo del modelo se realiza con la función </w:t>
       </w:r>
-      <w:proofErr w:type="spellStart"/>
       <w:r>
         <w:rPr>
           <w:b/>
@@ -126,7 +115,6 @@
         </w:rPr>
         <w:t>evam</w:t>
       </w:r>
-      <w:proofErr w:type="spellEnd"/>
       <w:r>
         <w:t xml:space="preserve"> del paquete </w:t>
       </w:r>
@@ -134,13 +122,8 @@
         <w:t xml:space="preserve">y se </w:t>
       </w:r>
       <w:r>
-        <w:t>pueden especificar parámetros como el número de núcleos (</w:t>
-      </w:r>
-      <w:proofErr w:type="spellStart"/>
-      <w:r>
-        <w:t>core</w:t>
-      </w:r>
-      <w:proofErr w:type="spellEnd"/>
+        <w:t>pueden especificar parámetros como el número de núcleos (core</w:t>
+      </w:r>
       <w:r>
         <w:t>, sólo desde R</w:t>
       </w:r>
@@ -154,33 +137,15 @@
         <w:t>dos</w:t>
       </w:r>
       <w:r>
-        <w:t xml:space="preserve">, el </w:t>
-      </w:r>
-      <w:proofErr w:type="spellStart"/>
-      <w:r>
-        <w:t>hiperparámetro</w:t>
-      </w:r>
-      <w:proofErr w:type="spellEnd"/>
-      <w:r>
-        <w:t xml:space="preserve"> lambda (</w:t>
-      </w:r>
-      <w:proofErr w:type="spellStart"/>
+        <w:t>, el hiperparámetro lambda (</w:t>
+      </w:r>
       <w:r>
         <w:rPr>
           <w:i/>
           <w:iCs/>
           <w:color w:val="7F7F7F" w:themeColor="text1" w:themeTint="80"/>
         </w:rPr>
-        <w:t>hiperparámetro</w:t>
-      </w:r>
-      <w:proofErr w:type="spellEnd"/>
-      <w:r>
-        <w:rPr>
-          <w:i/>
-          <w:iCs/>
-          <w:color w:val="7F7F7F" w:themeColor="text1" w:themeTint="80"/>
-        </w:rPr>
-        <w:t xml:space="preserve"> = un parámetro cuyo valor se utiliza para controlar el proceso de aprendizaje</w:t>
+        <w:t>hiperparámetro = un parámetro cuyo valor se utiliza para controlar el proceso de aprendizaje</w:t>
       </w:r>
       <w:r>
         <w:t xml:space="preserve">). </w:t>
@@ -245,39 +210,141 @@
         </w:numPr>
       </w:pPr>
       <w:r>
-        <w:t xml:space="preserve">Comparativa entre las funcionalidades de </w:t>
-      </w:r>
-      <w:proofErr w:type="spellStart"/>
-      <w:r>
+        <w:t>Comparativa entre las funcionalidades de evamtools y mhn</w:t>
+      </w:r>
+    </w:p>
+    <w:p>
+      <w:r>
+        <w:t xml:space="preserve">Respecto al paquete </w:t>
+      </w:r>
+      <w:r>
+        <w:rPr>
+          <w:b/>
+          <w:bCs/>
+        </w:rPr>
+        <w:t>mhn</w:t>
+      </w:r>
+      <w:r>
+        <w:t xml:space="preserve"> de Python y </w:t>
+      </w:r>
+      <w:r>
+        <w:rPr>
+          <w:b/>
+          <w:bCs/>
+        </w:rPr>
         <w:t>evamtools</w:t>
       </w:r>
-      <w:proofErr w:type="spellEnd"/>
+      <w:r>
+        <w:t xml:space="preserve"> de R, el primero</w:t>
+      </w:r>
+      <w:r>
+        <w:t xml:space="preserve"> está </w:t>
+      </w:r>
+      <w:r>
+        <w:rPr>
+          <w:u w:val="single"/>
+        </w:rPr>
+        <w:t xml:space="preserve">limitado a los modelos MHN </w:t>
+      </w:r>
+      <w:r>
+        <w:t>y</w:t>
+      </w:r>
+      <w:r>
+        <w:t xml:space="preserve"> puede </w:t>
+      </w:r>
+      <w:r>
+        <w:rPr>
+          <w:u w:val="single"/>
+        </w:rPr>
+        <w:t>calcular el oMHN</w:t>
+      </w:r>
+      <w:r>
+        <w:t xml:space="preserve"> (aplicando la correción del sesgo).</w:t>
+      </w:r>
+      <w:r>
+        <w:t xml:space="preserve"> Sin embargo</w:t>
+      </w:r>
+      <w:r>
+        <w:t>,</w:t>
+      </w:r>
+      <w:r>
+        <w:t xml:space="preserve"> el segundo </w:t>
+      </w:r>
+      <w:r>
+        <w:t xml:space="preserve">puede </w:t>
+      </w:r>
+      <w:r>
+        <w:rPr>
+          <w:u w:val="single"/>
+        </w:rPr>
+        <w:t>aplicar otros CPMs</w:t>
+      </w:r>
       <w:r>
         <w:t xml:space="preserve"> y </w:t>
       </w:r>
-      <w:proofErr w:type="spellStart"/>
-      <w:r>
-        <w:t>mhn</w:t>
-      </w:r>
-      <w:proofErr w:type="spellEnd"/>
-    </w:p>
-    <w:p>
-      <w:r>
-        <w:t xml:space="preserve">Respecto al paquete </w:t>
-      </w:r>
-      <w:proofErr w:type="spellStart"/>
-      <w:r>
-        <w:rPr>
-          <w:b/>
-          <w:bCs/>
-        </w:rPr>
-        <w:t>mhn</w:t>
-      </w:r>
-      <w:proofErr w:type="spellEnd"/>
-      <w:r>
-        <w:t xml:space="preserve"> de Python y </w:t>
-      </w:r>
-      <w:proofErr w:type="spellStart"/>
+      <w:r>
+        <w:t xml:space="preserve">cuenta con la función </w:t>
+      </w:r>
+      <w:r>
+        <w:rPr>
+          <w:b/>
+          <w:bCs/>
+        </w:rPr>
+        <w:t>random_evam()</w:t>
+      </w:r>
+      <w:r>
+        <w:t xml:space="preserve"> que permite </w:t>
+      </w:r>
+      <w:r>
+        <w:rPr>
+          <w:u w:val="single"/>
+        </w:rPr>
+        <w:t>crear un modelo customizado</w:t>
+      </w:r>
+      <w:r>
+        <w:t xml:space="preserve"> sin necesidad de disponer de datos; </w:t>
+      </w:r>
+      <w:r>
+        <w:t>además de</w:t>
+      </w:r>
+      <w:r>
+        <w:t xml:space="preserve"> otras funcionalidades que aportan los datos para entrenar a los modelos.</w:t>
+      </w:r>
+    </w:p>
+    <w:p>
+      <w:r>
+        <w:t xml:space="preserve">Además, contiene la función </w:t>
+      </w:r>
+      <w:r>
+        <w:rPr>
+          <w:b/>
+          <w:bCs/>
+        </w:rPr>
+        <w:t>lambda_from_cv()</w:t>
+      </w:r>
+      <w:r>
+        <w:t xml:space="preserve"> que le permite calcular el lambda óptimo para el conjunto de datos </w:t>
+      </w:r>
+      <w:commentRangeStart w:id="1"/>
+      <w:r>
+        <w:rPr>
+          <w:strike/>
+        </w:rPr>
+        <w:t>(indicando los valores de lambda máximo y mínimo, el número de pasos y el número de folds).</w:t>
+      </w:r>
+      <w:r>
+        <w:t xml:space="preserve"> </w:t>
+      </w:r>
+      <w:commentRangeEnd w:id="1"/>
+      <w:r>
+        <w:rPr>
+          <w:rStyle w:val="Refdecomentario"/>
+        </w:rPr>
+        <w:commentReference w:id="1"/>
+      </w:r>
+      <w:r>
+        <w:t xml:space="preserve">Sin embargo, para datasets pequeños el cálculo de lambda da error (Zero Divission Error). En </w:t>
+      </w:r>
       <w:r>
         <w:rPr>
           <w:b/>
@@ -285,191 +352,236 @@
         </w:rPr>
         <w:t>evamtools</w:t>
       </w:r>
-      <w:proofErr w:type="spellEnd"/>
-      <w:r>
-        <w:t xml:space="preserve"> de R, el primero</w:t>
-      </w:r>
-      <w:r>
-        <w:t xml:space="preserve"> está </w:t>
+      <w:r>
+        <w:t xml:space="preserve">, no hay ninguna función que </w:t>
+      </w:r>
+      <w:r>
+        <w:t xml:space="preserve">realice </w:t>
+      </w:r>
+      <w:r>
+        <w:t>este cálculo.</w:t>
+      </w:r>
+    </w:p>
+    <w:p>
+      <w:r>
+        <w:t>Tras el cálculo del modelo, Python sólo devuelve la matriz log-Theta</w:t>
+      </w:r>
+      <w:r>
+        <w:t xml:space="preserve"> (la cual se puede visualizar)</w:t>
+      </w:r>
+      <w:r>
+        <w:t>, mientras que R además devuelve, entre otros, la matriz log-Theta exponencial, los ratios de transición y las probabilidades de transición</w:t>
+      </w:r>
+      <w:r>
+        <w:t xml:space="preserve">; y posee la función </w:t>
+      </w:r>
+      <w:r>
+        <w:rPr>
+          <w:b/>
+          <w:bCs/>
+        </w:rPr>
+        <w:t>plot_evam</w:t>
+      </w:r>
+      <w:r>
+        <w:rPr>
+          <w:b/>
+          <w:bCs/>
+        </w:rPr>
+        <w:t xml:space="preserve"> </w:t>
+      </w:r>
+      <w:r>
+        <w:t>que permite especificar distintos tipos de gráficos a representar</w:t>
+      </w:r>
+      <w:r>
+        <w:t xml:space="preserve">. </w:t>
+      </w:r>
+    </w:p>
+    <w:p>
+      <w:r>
+        <w:t>A</w:t>
+      </w:r>
+      <w:r>
+        <w:t xml:space="preserve"> partir del</w:t>
+      </w:r>
+      <w:r>
+        <w:t xml:space="preserve"> modelo</w:t>
+      </w:r>
+      <w:r>
+        <w:t xml:space="preserve"> se pueden generar datos sintéticos empleando la función </w:t>
+      </w:r>
+      <w:r>
+        <w:rPr>
+          <w:b/>
+          <w:bCs/>
+        </w:rPr>
+        <w:t>sample_artificial_data()</w:t>
+      </w:r>
+      <w:r>
+        <w:t xml:space="preserve"> </w:t>
+      </w:r>
+      <w:r>
+        <w:t>en</w:t>
+      </w:r>
+      <w:r>
+        <w:t xml:space="preserve"> Python </w:t>
+      </w:r>
+      <w:r>
+        <w:t>y</w:t>
+      </w:r>
+      <w:r>
+        <w:t xml:space="preserve"> </w:t>
+      </w:r>
+      <w:r>
+        <w:rPr>
+          <w:b/>
+          <w:bCs/>
+        </w:rPr>
+        <w:t>sample_evam()</w:t>
+      </w:r>
+      <w:r>
+        <w:t xml:space="preserve"> </w:t>
+      </w:r>
+      <w:r>
+        <w:t>en</w:t>
+      </w:r>
+      <w:r>
+        <w:t xml:space="preserve"> R. </w:t>
+      </w:r>
+      <w:commentRangeStart w:id="2"/>
+      <w:r>
+        <w:rPr>
+          <w:strike/>
+        </w:rPr>
+        <w:t>(</w:t>
+      </w:r>
+      <w:r>
+        <w:rPr>
+          <w:strike/>
+        </w:rPr>
+        <w:t>No obstante, estas funciones requieren de unos datos previamente cargados.</w:t>
+      </w:r>
+      <w:r>
+        <w:rPr>
+          <w:strike/>
+        </w:rPr>
+        <w:t>)</w:t>
+      </w:r>
+      <w:commentRangeEnd w:id="2"/>
+      <w:r>
+        <w:rPr>
+          <w:rStyle w:val="Refdecomentario"/>
+        </w:rPr>
+        <w:commentReference w:id="2"/>
+      </w:r>
+      <w:r>
+        <w:t xml:space="preserve"> </w:t>
+      </w:r>
+    </w:p>
+    <w:p>
+      <w:commentRangeStart w:id="3"/>
+      <w:r>
+        <w:rPr>
+          <w:strike/>
+        </w:rPr>
+        <w:t>(</w:t>
+      </w:r>
+      <w:r>
+        <w:rPr>
+          <w:strike/>
+        </w:rPr>
+        <w:t xml:space="preserve">Al calcular el modelo en R con </w:t>
+      </w:r>
+      <w:r>
+        <w:rPr>
+          <w:b/>
+          <w:bCs/>
+          <w:strike/>
+        </w:rPr>
+        <w:t>evam</w:t>
+      </w:r>
+      <w:r>
+        <w:rPr>
+          <w:strike/>
+        </w:rPr>
+        <w:t xml:space="preserve"> podemos especificar el parámetro </w:t>
+      </w:r>
+      <w:r>
+        <w:rPr>
+          <w:b/>
+          <w:bCs/>
+          <w:strike/>
+        </w:rPr>
+        <w:t>paths_max=TRUE</w:t>
+      </w:r>
+      <w:r>
+        <w:rPr>
+          <w:strike/>
+        </w:rPr>
+        <w:t>, el cual nos devuelve las probabilidades que tienen cada uno de esos paths.</w:t>
+      </w:r>
+      <w:r>
+        <w:rPr>
+          <w:strike/>
+        </w:rPr>
+        <w:t>)</w:t>
+      </w:r>
+      <w:r>
+        <w:t xml:space="preserve"> </w:t>
+      </w:r>
+      <w:commentRangeEnd w:id="3"/>
+      <w:r>
+        <w:rPr>
+          <w:rStyle w:val="Refdecomentario"/>
+        </w:rPr>
+        <w:commentReference w:id="3"/>
+      </w:r>
+      <w:r>
+        <w:t xml:space="preserve">En Python, podemos calcular las probabilidad de que una mutación haya precedido a otra </w:t>
+      </w:r>
+      <w:r>
+        <w:rPr>
+          <w:color w:val="ADADAD" w:themeColor="background2" w:themeShade="BF"/>
+        </w:rPr>
+        <w:t xml:space="preserve">sabiendo que ambas se encuentran en el presente mutadas </w:t>
+      </w:r>
+      <w:r>
+        <w:t xml:space="preserve">mediante la función </w:t>
+      </w:r>
+      <w:r>
+        <w:rPr>
+          <w:b/>
+          <w:bCs/>
+        </w:rPr>
+        <w:t>sample_trajectories();</w:t>
+      </w:r>
+      <w:r>
+        <w:t xml:space="preserve"> y también nos permite predecir el siguiente evento teniendo en cuenta </w:t>
       </w:r>
       <w:r>
         <w:rPr>
           <w:u w:val="single"/>
         </w:rPr>
-        <w:t xml:space="preserve">limitado a los modelos MHN </w:t>
-      </w:r>
-      <w:r>
-        <w:t>y</w:t>
-      </w:r>
-      <w:r>
-        <w:t xml:space="preserve"> puede </w:t>
-      </w:r>
-      <w:r>
-        <w:rPr>
-          <w:u w:val="single"/>
-        </w:rPr>
-        <w:t xml:space="preserve">calcular el </w:t>
-      </w:r>
-      <w:proofErr w:type="spellStart"/>
-      <w:r>
-        <w:rPr>
-          <w:u w:val="single"/>
-        </w:rPr>
-        <w:t>oMHN</w:t>
-      </w:r>
-      <w:proofErr w:type="spellEnd"/>
-      <w:r>
-        <w:t xml:space="preserve"> (aplicando la </w:t>
-      </w:r>
-      <w:proofErr w:type="spellStart"/>
-      <w:r>
-        <w:t>correción</w:t>
-      </w:r>
-      <w:proofErr w:type="spellEnd"/>
-      <w:r>
-        <w:t xml:space="preserve"> del sesgo).</w:t>
-      </w:r>
-      <w:r>
-        <w:t xml:space="preserve"> Sin embargo</w:t>
-      </w:r>
-      <w:r>
-        <w:t>,</w:t>
-      </w:r>
-      <w:r>
-        <w:t xml:space="preserve"> el segundo </w:t>
-      </w:r>
-      <w:r>
-        <w:t xml:space="preserve">puede </w:t>
-      </w:r>
-      <w:r>
-        <w:rPr>
-          <w:u w:val="single"/>
-        </w:rPr>
-        <w:t xml:space="preserve">aplicar otros </w:t>
-      </w:r>
-      <w:proofErr w:type="spellStart"/>
-      <w:r>
-        <w:rPr>
-          <w:u w:val="single"/>
-        </w:rPr>
-        <w:t>CPMs</w:t>
-      </w:r>
-      <w:proofErr w:type="spellEnd"/>
-      <w:r>
-        <w:t xml:space="preserve"> y </w:t>
-      </w:r>
-      <w:r>
-        <w:t xml:space="preserve">cuenta con la función </w:t>
-      </w:r>
-      <w:proofErr w:type="spellStart"/>
-      <w:r>
-        <w:rPr>
-          <w:b/>
-          <w:bCs/>
-        </w:rPr>
-        <w:t>random_evam</w:t>
-      </w:r>
-      <w:proofErr w:type="spellEnd"/>
-      <w:r>
-        <w:rPr>
-          <w:b/>
-          <w:bCs/>
-        </w:rPr>
-        <w:t>()</w:t>
-      </w:r>
-      <w:r>
-        <w:t xml:space="preserve"> que permite </w:t>
-      </w:r>
-      <w:r>
-        <w:rPr>
-          <w:u w:val="single"/>
-        </w:rPr>
-        <w:t>crear un modelo customizado</w:t>
-      </w:r>
-      <w:r>
-        <w:t xml:space="preserve"> sin necesidad de disponer de datos; </w:t>
-      </w:r>
-      <w:r>
-        <w:t>además de</w:t>
-      </w:r>
-      <w:r>
-        <w:t xml:space="preserve"> otras funcionalidades que aportan los datos para entrenar a los modelos.</w:t>
-      </w:r>
-    </w:p>
-    <w:p>
-      <w:r>
-        <w:t xml:space="preserve">Además, contiene la función </w:t>
-      </w:r>
-      <w:proofErr w:type="spellStart"/>
-      <w:r>
-        <w:rPr>
-          <w:b/>
-          <w:bCs/>
-        </w:rPr>
-        <w:t>lambda_from_cv</w:t>
-      </w:r>
-      <w:proofErr w:type="spellEnd"/>
-      <w:r>
-        <w:rPr>
-          <w:b/>
-          <w:bCs/>
-        </w:rPr>
-        <w:t>()</w:t>
-      </w:r>
-      <w:r>
-        <w:t xml:space="preserve"> que le permite calcular el lambda óptimo para el conjunto de datos </w:t>
-      </w:r>
-      <w:commentRangeStart w:id="1"/>
-      <w:r>
-        <w:rPr>
-          <w:strike/>
-        </w:rPr>
-        <w:t xml:space="preserve">(indicando los valores de lambda máximo y mínimo, el número de pasos y el número de </w:t>
-      </w:r>
-      <w:proofErr w:type="spellStart"/>
-      <w:r>
-        <w:rPr>
-          <w:strike/>
-        </w:rPr>
-        <w:t>folds</w:t>
-      </w:r>
-      <w:proofErr w:type="spellEnd"/>
-      <w:r>
-        <w:rPr>
-          <w:strike/>
-        </w:rPr>
-        <w:t>).</w:t>
+        <w:t>un genotipo particular</w:t>
       </w:r>
       <w:r>
         <w:t xml:space="preserve"> </w:t>
       </w:r>
-      <w:commentRangeEnd w:id="1"/>
-      <w:r>
-        <w:rPr>
-          <w:rStyle w:val="Refdecomentario"/>
-        </w:rPr>
-        <w:commentReference w:id="1"/>
-      </w:r>
-      <w:r>
-        <w:t xml:space="preserve">Sin embargo, para </w:t>
-      </w:r>
-      <w:proofErr w:type="spellStart"/>
-      <w:r>
-        <w:t>datasets</w:t>
-      </w:r>
-      <w:proofErr w:type="spellEnd"/>
-      <w:r>
-        <w:t xml:space="preserve"> pequeños el cálculo de lambda da error (Zero </w:t>
-      </w:r>
-      <w:proofErr w:type="spellStart"/>
-      <w:r>
-        <w:t>Divission</w:t>
-      </w:r>
-      <w:proofErr w:type="spellEnd"/>
-      <w:r>
-        <w:t xml:space="preserve"> Error). En </w:t>
-      </w:r>
-      <w:proofErr w:type="spellStart"/>
+      <w:r>
+        <w:t xml:space="preserve">(e incluir las observaciones) </w:t>
+      </w:r>
+      <w:r>
+        <w:t xml:space="preserve">con la función </w:t>
+      </w:r>
+      <w:r>
+        <w:rPr>
+          <w:b/>
+          <w:bCs/>
+        </w:rPr>
+        <w:t>compute_next_events_probs().</w:t>
+      </w:r>
+      <w:r>
+        <w:t xml:space="preserve"> Estas dos últimas funcionalidades no las presenta </w:t>
+      </w:r>
       <w:r>
         <w:rPr>
           <w:b/>
@@ -477,39 +589,6 @@
         </w:rPr>
         <w:t>evamtools</w:t>
       </w:r>
-      <w:proofErr w:type="spellEnd"/>
-      <w:r>
-        <w:t xml:space="preserve">, no hay ninguna función que </w:t>
-      </w:r>
-      <w:r>
-        <w:t xml:space="preserve">realice </w:t>
-      </w:r>
-      <w:r>
-        <w:t>este cálculo.</w:t>
-      </w:r>
-    </w:p>
-    <w:p>
-      <w:r>
-        <w:t>Tras el cálculo del modelo, Python sólo devuelve la matriz log-Theta</w:t>
-      </w:r>
-      <w:r>
-        <w:t xml:space="preserve"> (la cual se puede visualizar)</w:t>
-      </w:r>
-      <w:r>
-        <w:t>, mientras que R además devuelve, entre otros, la matriz log-Theta exponencial, los ratios de transición y las probabilidades de transición</w:t>
-      </w:r>
-      <w:r>
-        <w:t xml:space="preserve">; y posee la función </w:t>
-      </w:r>
-      <w:proofErr w:type="spellStart"/>
-      <w:r>
-        <w:rPr>
-          <w:b/>
-          <w:bCs/>
-        </w:rPr>
-        <w:t>plot_evam</w:t>
-      </w:r>
-      <w:proofErr w:type="spellEnd"/>
       <w:r>
         <w:rPr>
           <w:b/>
@@ -518,269 +597,47 @@
         <w:t xml:space="preserve"> </w:t>
       </w:r>
       <w:r>
-        <w:t>que permite especificar distintos tipos de gráficos a representar</w:t>
-      </w:r>
-      <w:r>
-        <w:t xml:space="preserve">. </w:t>
-      </w:r>
-    </w:p>
-    <w:p>
-      <w:r>
-        <w:t>A</w:t>
-      </w:r>
-      <w:r>
-        <w:t xml:space="preserve"> partir del</w:t>
-      </w:r>
-      <w:r>
-        <w:t xml:space="preserve"> modelo</w:t>
-      </w:r>
-      <w:r>
-        <w:t xml:space="preserve"> se pueden generar datos sintéticos empleando la función </w:t>
-      </w:r>
-      <w:proofErr w:type="spellStart"/>
-      <w:r>
-        <w:rPr>
-          <w:b/>
-          <w:bCs/>
-        </w:rPr>
-        <w:t>sample_artificial_data</w:t>
-      </w:r>
-      <w:proofErr w:type="spellEnd"/>
-      <w:r>
-        <w:rPr>
-          <w:b/>
-          <w:bCs/>
-        </w:rPr>
-        <w:t>()</w:t>
-      </w:r>
-      <w:r>
+        <w:rPr>
+          <w:color w:val="ADADAD" w:themeColor="background2" w:themeShade="BF"/>
+        </w:rPr>
+        <w:t>(</w:t>
+      </w:r>
+      <w:r>
+        <w:rPr>
+          <w:color w:val="ADADAD" w:themeColor="background2" w:themeShade="BF"/>
+        </w:rPr>
+        <w:t>NO confundir con</w:t>
+      </w:r>
+      <w:r>
+        <w:rPr>
+          <w:color w:val="ADADAD" w:themeColor="background2" w:themeShade="BF"/>
+        </w:rPr>
         <w:t xml:space="preserve"> </w:t>
       </w:r>
       <w:r>
-        <w:t>en</w:t>
-      </w:r>
-      <w:r>
-        <w:t xml:space="preserve"> Python </w:t>
-      </w:r>
-      <w:r>
-        <w:t>y</w:t>
-      </w:r>
-      <w:r>
-        <w:t xml:space="preserve"> </w:t>
-      </w:r>
-      <w:proofErr w:type="spellStart"/>
-      <w:r>
-        <w:rPr>
-          <w:b/>
-          <w:bCs/>
-        </w:rPr>
-        <w:t>sample_evam</w:t>
-      </w:r>
-      <w:proofErr w:type="spellEnd"/>
-      <w:r>
-        <w:rPr>
-          <w:b/>
-          <w:bCs/>
-        </w:rPr>
-        <w:t>()</w:t>
-      </w:r>
-      <w:r>
-        <w:t xml:space="preserve"> </w:t>
-      </w:r>
-      <w:r>
-        <w:t>en</w:t>
-      </w:r>
-      <w:r>
-        <w:t xml:space="preserve"> R. </w:t>
-      </w:r>
-      <w:commentRangeStart w:id="2"/>
-      <w:r>
-        <w:rPr>
-          <w:strike/>
-        </w:rPr>
-        <w:t>(</w:t>
-      </w:r>
-      <w:r>
-        <w:rPr>
-          <w:strike/>
-        </w:rPr>
-        <w:t>No obstante, estas funciones requieren de unos datos previamente cargados.</w:t>
-      </w:r>
-      <w:r>
-        <w:rPr>
-          <w:strike/>
+        <w:rPr>
+          <w:color w:val="ADADAD" w:themeColor="background2" w:themeShade="BF"/>
+        </w:rPr>
+        <w:t>MHN_predicted_genotype_freqs</w:t>
+      </w:r>
+      <w:r>
+        <w:rPr>
+          <w:color w:val="ADADAD" w:themeColor="background2" w:themeShade="BF"/>
+        </w:rPr>
+        <w:t xml:space="preserve">: </w:t>
+      </w:r>
+      <w:r>
+        <w:rPr>
+          <w:color w:val="ADADAD" w:themeColor="background2" w:themeShade="BF"/>
+        </w:rPr>
+        <w:t>vector que contiene las frecuencias genotípicas predichas bajo el modelo MHN. Este podría representar la probabilidad de cada genotipo en cada uno de los 16 estados posibles</w:t>
+      </w:r>
+      <w:r>
+        <w:rPr>
+          <w:color w:val="ADADAD" w:themeColor="background2" w:themeShade="BF"/>
         </w:rPr>
         <w:t>)</w:t>
       </w:r>
-      <w:commentRangeEnd w:id="2"/>
-      <w:r>
-        <w:rPr>
-          <w:rStyle w:val="Refdecomentario"/>
-        </w:rPr>
-        <w:commentReference w:id="2"/>
-      </w:r>
-      <w:r>
-        <w:t xml:space="preserve"> </w:t>
-      </w:r>
-    </w:p>
-    <w:p>
-      <w:commentRangeStart w:id="3"/>
-      <w:r>
-        <w:rPr>
-          <w:strike/>
-        </w:rPr>
-        <w:t>(</w:t>
-      </w:r>
-      <w:r>
-        <w:rPr>
-          <w:strike/>
-        </w:rPr>
-        <w:t xml:space="preserve">Al calcular el modelo en R con </w:t>
-      </w:r>
-      <w:proofErr w:type="spellStart"/>
-      <w:r>
-        <w:rPr>
-          <w:b/>
-          <w:bCs/>
-          <w:strike/>
-        </w:rPr>
-        <w:t>evam</w:t>
-      </w:r>
-      <w:proofErr w:type="spellEnd"/>
-      <w:r>
-        <w:rPr>
-          <w:strike/>
-        </w:rPr>
-        <w:t xml:space="preserve"> podemos especificar el parámetro </w:t>
-      </w:r>
-      <w:proofErr w:type="spellStart"/>
-      <w:r>
-        <w:rPr>
-          <w:b/>
-          <w:bCs/>
-          <w:strike/>
-        </w:rPr>
-        <w:t>paths_max</w:t>
-      </w:r>
-      <w:proofErr w:type="spellEnd"/>
-      <w:r>
-        <w:rPr>
-          <w:b/>
-          <w:bCs/>
-          <w:strike/>
-        </w:rPr>
-        <w:t>=TRUE</w:t>
-      </w:r>
-      <w:r>
-        <w:rPr>
-          <w:strike/>
-        </w:rPr>
-        <w:t xml:space="preserve">, el cual nos devuelve las probabilidades que tienen cada uno de esos </w:t>
-      </w:r>
-      <w:proofErr w:type="spellStart"/>
-      <w:r>
-        <w:rPr>
-          <w:strike/>
-        </w:rPr>
-        <w:t>paths</w:t>
-      </w:r>
-      <w:proofErr w:type="spellEnd"/>
-      <w:r>
-        <w:rPr>
-          <w:strike/>
-        </w:rPr>
-        <w:t>.</w:t>
-      </w:r>
-      <w:r>
-        <w:rPr>
-          <w:strike/>
-        </w:rPr>
-        <w:t>)</w:t>
-      </w:r>
-      <w:r>
-        <w:t xml:space="preserve"> </w:t>
-      </w:r>
-      <w:commentRangeEnd w:id="3"/>
-      <w:r>
-        <w:rPr>
-          <w:rStyle w:val="Refdecomentario"/>
-        </w:rPr>
-        <w:commentReference w:id="3"/>
-      </w:r>
-      <w:r>
-        <w:t xml:space="preserve">En Python, podemos calcular las probabilidad de que una mutación haya precedido a otra </w:t>
-      </w:r>
-      <w:r>
-        <w:rPr>
-          <w:color w:val="ADADAD" w:themeColor="background2" w:themeShade="BF"/>
-        </w:rPr>
-        <w:t xml:space="preserve">sabiendo que ambas se encuentran en el presente mutadas </w:t>
-      </w:r>
-      <w:r>
-        <w:t xml:space="preserve">mediante la función </w:t>
-      </w:r>
-      <w:proofErr w:type="spellStart"/>
-      <w:r>
-        <w:rPr>
-          <w:b/>
-          <w:bCs/>
-        </w:rPr>
-        <w:t>sample_trajectories</w:t>
-      </w:r>
-      <w:proofErr w:type="spellEnd"/>
-      <w:r>
-        <w:rPr>
-          <w:b/>
-          <w:bCs/>
-        </w:rPr>
-        <w:t>();</w:t>
-      </w:r>
-      <w:r>
-        <w:t xml:space="preserve"> y también nos permite predecir el siguiente evento teniendo en cuenta </w:t>
-      </w:r>
-      <w:r>
-        <w:rPr>
-          <w:u w:val="single"/>
-        </w:rPr>
-        <w:t>un genotipo particular</w:t>
-      </w:r>
-      <w:r>
-        <w:t xml:space="preserve"> </w:t>
-      </w:r>
-      <w:r>
-        <w:t xml:space="preserve">(e incluir las observaciones) </w:t>
-      </w:r>
-      <w:r>
-        <w:t xml:space="preserve">con la función </w:t>
-      </w:r>
-      <w:proofErr w:type="spellStart"/>
-      <w:r>
-        <w:rPr>
-          <w:b/>
-          <w:bCs/>
-        </w:rPr>
-        <w:t>compute_next_events_probs</w:t>
-      </w:r>
-      <w:proofErr w:type="spellEnd"/>
-      <w:r>
-        <w:rPr>
-          <w:b/>
-          <w:bCs/>
-        </w:rPr>
-        <w:t>().</w:t>
-      </w:r>
-      <w:r>
-        <w:t xml:space="preserve"> Estas dos últimas funcionalidades no las presenta </w:t>
-      </w:r>
-      <w:proofErr w:type="spellStart"/>
-      <w:r>
-        <w:rPr>
-          <w:b/>
-          <w:bCs/>
-        </w:rPr>
-        <w:t>evamtools</w:t>
-      </w:r>
-      <w:proofErr w:type="spellEnd"/>
       <w:r>
         <w:t>.</w:t>
       </w:r>
@@ -796,7 +653,6 @@
       <w:r>
         <w:t>Integración del código en Python en R (</w:t>
       </w:r>
-      <w:proofErr w:type="spellStart"/>
       <w:r>
         <w:rPr>
           <w:b/>
@@ -804,11 +660,9 @@
         </w:rPr>
         <w:t>evamtools</w:t>
       </w:r>
-      <w:proofErr w:type="spellEnd"/>
       <w:r>
         <w:t xml:space="preserve">): </w:t>
       </w:r>
-      <w:proofErr w:type="spellStart"/>
       <w:r>
         <w:rPr>
           <w:b/>
@@ -823,10 +677,10 @@
         </w:rPr>
         <w:t>eticulate</w:t>
       </w:r>
-      <w:proofErr w:type="spellEnd"/>
-    </w:p>
-    <w:p>
-      <w:r>
+    </w:p>
+    <w:p>
+      <w:r>
+        <w:lastRenderedPageBreak/>
         <w:t xml:space="preserve">En ocasiones, es necesario combinar herramientas y librerías de diferentes lenguajes de programación con el objetivo de aprovechar sus fortalezas específicas. </w:t>
       </w:r>
       <w:commentRangeStart w:id="4"/>
@@ -834,87 +688,120 @@
         <w:rPr>
           <w:strike/>
         </w:rPr>
-        <w:t xml:space="preserve">(La integración </w:t>
-      </w:r>
-      <w:r>
-        <w:rPr>
+        <w:t>(La integración entre los lenguajes de Python y R puede ser clave, permitiendo así disponer de las funcionalidades de ambos paquetes (</w:t>
+      </w:r>
+      <w:r>
+        <w:rPr>
+          <w:b/>
+          <w:bCs/>
           <w:strike/>
         </w:rPr>
-        <w:lastRenderedPageBreak/>
-        <w:t>entre los lenguajes de Python y R puede ser clave, permitiendo así disponer de las funcionalidades de ambos paquetes (</w:t>
-      </w:r>
-      <w:proofErr w:type="spellStart"/>
-      <w:r>
-        <w:rPr>
-          <w:b/>
-          <w:bCs/>
+        <w:t>mhn</w:t>
+      </w:r>
+      <w:r>
+        <w:rPr>
           <w:strike/>
         </w:rPr>
+        <w:t xml:space="preserve"> y </w:t>
+      </w:r>
+      <w:r>
+        <w:rPr>
+          <w:b/>
+          <w:bCs/>
+          <w:strike/>
+        </w:rPr>
+        <w:t>evamtools</w:t>
+      </w:r>
+      <w:r>
+        <w:rPr>
+          <w:strike/>
+        </w:rPr>
+        <w:t>) para poder desarrollar proyectos más complejos.)</w:t>
+      </w:r>
+      <w:commentRangeEnd w:id="4"/>
+      <w:r>
+        <w:rPr>
+          <w:rStyle w:val="Refdecomentario"/>
+        </w:rPr>
+        <w:commentReference w:id="4"/>
+      </w:r>
+    </w:p>
+    <w:p>
+      <w:r>
+        <w:t xml:space="preserve">Con este propósito, el paquete </w:t>
+      </w:r>
+      <w:r>
+        <w:rPr>
+          <w:b/>
+          <w:bCs/>
+        </w:rPr>
+        <w:t>reticulate</w:t>
+      </w:r>
+      <w:r>
+        <w:t xml:space="preserve"> de R proporciona una interfaz versátil que permite ejecutar código de Python desde el entorno de R</w:t>
+      </w:r>
+      <w:r>
+        <w:t xml:space="preserve">, </w:t>
+      </w:r>
+      <w:r>
+        <w:t>facilita</w:t>
+      </w:r>
+      <w:r>
+        <w:t>ndo</w:t>
+      </w:r>
+      <w:r>
+        <w:t xml:space="preserve"> la interoperabilidad entre ambos lenguajes, permitiendo acceder a librerías</w:t>
+      </w:r>
+      <w:r>
+        <w:t xml:space="preserve"> (como </w:t>
+      </w:r>
+      <w:r>
+        <w:rPr>
+          <w:b/>
+          <w:bCs/>
+        </w:rPr>
         <w:t>mhn</w:t>
       </w:r>
-      <w:proofErr w:type="spellEnd"/>
-      <w:r>
-        <w:rPr>
-          <w:strike/>
-        </w:rPr>
-        <w:t xml:space="preserve"> y </w:t>
-      </w:r>
-      <w:proofErr w:type="spellStart"/>
-      <w:r>
-        <w:rPr>
-          <w:b/>
-          <w:bCs/>
-          <w:strike/>
-        </w:rPr>
-        <w:t>evamtools</w:t>
-      </w:r>
-      <w:proofErr w:type="spellEnd"/>
-      <w:r>
-        <w:rPr>
-          <w:strike/>
-        </w:rPr>
-        <w:t>) para poder desarrollar proyectos más complejos.)</w:t>
-      </w:r>
-      <w:commentRangeEnd w:id="4"/>
+      <w:r>
+        <w:t>)</w:t>
+      </w:r>
+      <w:r>
+        <w:t>, funciones y objetos de Python como si fueran nativos en R</w:t>
+      </w:r>
+      <w:r>
+        <w:t>. Por ello</w:t>
+      </w:r>
+      <w:r>
+        <w:t xml:space="preserve"> es la opción elegida</w:t>
+      </w:r>
+      <w:r>
+        <w:t>.</w:t>
+      </w:r>
+      <w:r>
+        <w:t xml:space="preserve"> </w:t>
+      </w:r>
+      <w:commentRangeStart w:id="5"/>
+      <w:r>
+        <w:rPr>
+          <w:color w:val="7F7F7F" w:themeColor="text1" w:themeTint="80"/>
+        </w:rPr>
+        <w:t xml:space="preserve">debido a su simplicidad, flexibilidad y su fácil acceso a las numerosas librerías de Python. </w:t>
+      </w:r>
+      <w:commentRangeEnd w:id="5"/>
       <w:r>
         <w:rPr>
           <w:rStyle w:val="Refdecomentario"/>
         </w:rPr>
-        <w:commentReference w:id="4"/>
-      </w:r>
-    </w:p>
-    <w:p>
-      <w:r>
-        <w:t xml:space="preserve">Con este propósito, el paquete </w:t>
-      </w:r>
-      <w:proofErr w:type="spellStart"/>
-      <w:r>
-        <w:rPr>
-          <w:b/>
-          <w:bCs/>
-        </w:rPr>
-        <w:t>reticulate</w:t>
-      </w:r>
-      <w:proofErr w:type="spellEnd"/>
-      <w:r>
-        <w:t xml:space="preserve"> de R proporciona una interfaz versátil que permite ejecutar código de Python desde el entorno de R</w:t>
-      </w:r>
-      <w:r>
-        <w:t xml:space="preserve">, </w:t>
-      </w:r>
-      <w:r>
-        <w:t>facilita</w:t>
-      </w:r>
-      <w:r>
-        <w:t>ndo</w:t>
-      </w:r>
-      <w:r>
-        <w:t xml:space="preserve"> la interoperabilidad entre ambos lenguajes, permitiendo acceder a librerías</w:t>
-      </w:r>
-      <w:r>
-        <w:t xml:space="preserve"> (como </w:t>
-      </w:r>
-      <w:proofErr w:type="spellStart"/>
+        <w:commentReference w:id="5"/>
+      </w:r>
+    </w:p>
+    <w:p>
+      <w:r>
+        <w:t>Con este llamamos</w:t>
+      </w:r>
+      <w:r>
+        <w:t xml:space="preserve"> al código de Python relacionado con el paquete </w:t>
+      </w:r>
       <w:r>
         <w:rPr>
           <w:b/>
@@ -922,56 +809,6 @@
         </w:rPr>
         <w:t>mhn</w:t>
       </w:r>
-      <w:proofErr w:type="spellEnd"/>
-      <w:r>
-        <w:t>)</w:t>
-      </w:r>
-      <w:r>
-        <w:t>, funciones y objetos de Python como si fueran nativos en R</w:t>
-      </w:r>
-      <w:r>
-        <w:t>. Por ello</w:t>
-      </w:r>
-      <w:r>
-        <w:t xml:space="preserve"> es la opción elegida</w:t>
-      </w:r>
-      <w:r>
-        <w:t>.</w:t>
-      </w:r>
-      <w:r>
-        <w:t xml:space="preserve"> </w:t>
-      </w:r>
-      <w:commentRangeStart w:id="5"/>
-      <w:r>
-        <w:rPr>
-          <w:color w:val="7F7F7F" w:themeColor="text1" w:themeTint="80"/>
-        </w:rPr>
-        <w:t xml:space="preserve">debido a su simplicidad, flexibilidad y su fácil acceso a las numerosas librerías de Python. </w:t>
-      </w:r>
-      <w:commentRangeEnd w:id="5"/>
-      <w:r>
-        <w:rPr>
-          <w:rStyle w:val="Refdecomentario"/>
-        </w:rPr>
-        <w:commentReference w:id="5"/>
-      </w:r>
-    </w:p>
-    <w:p>
-      <w:r>
-        <w:t>Con este llamamos</w:t>
-      </w:r>
-      <w:r>
-        <w:t xml:space="preserve"> al código de Python relacionado con el paquete </w:t>
-      </w:r>
-      <w:proofErr w:type="spellStart"/>
-      <w:r>
-        <w:rPr>
-          <w:b/>
-          <w:bCs/>
-        </w:rPr>
-        <w:t>mhn</w:t>
-      </w:r>
-      <w:proofErr w:type="spellEnd"/>
       <w:r>
         <w:t xml:space="preserve"> desde R. Los pasos seguidos fueron:</w:t>
       </w:r>
@@ -985,15 +822,7 @@
         </w:numPr>
       </w:pPr>
       <w:r>
-        <w:t xml:space="preserve">Configuración del entorno en Docker: Asegurar que Python esté instalado y accesible desde R mediante la configuración del intérprete Python en </w:t>
-      </w:r>
-      <w:proofErr w:type="spellStart"/>
-      <w:r>
-        <w:t>reticulate</w:t>
-      </w:r>
-      <w:proofErr w:type="spellEnd"/>
-      <w:r>
-        <w:t xml:space="preserve"> en la imagen de Docker.</w:t>
+        <w:t>Configuración del entorno en Docker: Asegurar que Python esté instalado y accesible desde R mediante la configuración del intérprete Python en reticulate en la imagen de Docker.</w:t>
       </w:r>
     </w:p>
     <w:p>
@@ -1007,7 +836,6 @@
       <w:r>
         <w:t xml:space="preserve">Instalación del paquete </w:t>
       </w:r>
-      <w:proofErr w:type="spellStart"/>
       <w:r>
         <w:rPr>
           <w:b/>
@@ -1015,7 +843,6 @@
         </w:rPr>
         <w:t>mhn</w:t>
       </w:r>
-      <w:proofErr w:type="spellEnd"/>
       <w:r>
         <w:t xml:space="preserve"> en Python</w:t>
       </w:r>
@@ -1031,7 +858,6 @@
       <w:r>
         <w:t xml:space="preserve">Ejecución de código de Python desde R: Llamar a las funciones del paquete </w:t>
       </w:r>
-      <w:proofErr w:type="spellStart"/>
       <w:r>
         <w:rPr>
           <w:b/>
@@ -1039,7 +865,6 @@
         </w:rPr>
         <w:t>mhn</w:t>
       </w:r>
-      <w:proofErr w:type="spellEnd"/>
       <w:r>
         <w:t xml:space="preserve"> </w:t>
       </w:r>
@@ -1076,17 +901,8 @@
     <w:p/>
     <w:p>
       <w:r>
-        <w:t xml:space="preserve">En Python, se nombra </w:t>
-      </w:r>
-      <w:proofErr w:type="spellStart"/>
-      <w:r>
-        <w:t>cMHN</w:t>
-      </w:r>
-      <w:proofErr w:type="spellEnd"/>
-      <w:r>
-        <w:t xml:space="preserve"> como el modelo clásico de MHN, el cual es el implementado en </w:t>
-      </w:r>
-      <w:proofErr w:type="spellStart"/>
+        <w:t xml:space="preserve">En Python, se nombra cMHN como el modelo clásico de MHN, el cual es el implementado en </w:t>
+      </w:r>
       <w:r>
         <w:rPr>
           <w:b/>
@@ -1094,7 +910,6 @@
         </w:rPr>
         <w:t>evamtools</w:t>
       </w:r>
-      <w:proofErr w:type="spellEnd"/>
       <w:r>
         <w:t xml:space="preserve">. </w:t>
       </w:r>
@@ -1102,15 +917,7 @@
         <w:t>Por</w:t>
       </w:r>
       <w:r>
-        <w:t xml:space="preserve"> ello, hemos querido comparar los resultados, utilizando el mismo </w:t>
-      </w:r>
-      <w:proofErr w:type="spellStart"/>
-      <w:r>
-        <w:t>dataset</w:t>
-      </w:r>
-      <w:proofErr w:type="spellEnd"/>
-      <w:r>
-        <w:t xml:space="preserve"> en Python y en R. </w:t>
+        <w:t xml:space="preserve"> ello, hemos querido comparar los resultados, utilizando el mismo dataset en Python y en R. </w:t>
       </w:r>
       <w:r>
         <w:t>Estos</w:t>
@@ -1180,7 +987,6 @@
       <w:r>
         <w:t xml:space="preserve"> los dos códigos, la diferencia radica en el cálculo de un valor óptimo de lambda ajustado a los datos en el caso de Python, mientras que </w:t>
       </w:r>
-      <w:proofErr w:type="spellStart"/>
       <w:r>
         <w:rPr>
           <w:b/>
@@ -1188,7 +994,6 @@
         </w:rPr>
         <w:t>evamtools</w:t>
       </w:r>
-      <w:proofErr w:type="spellEnd"/>
       <w:r>
         <w:rPr>
           <w:b/>
@@ -1217,7 +1022,6 @@
       <w:r>
         <w:t xml:space="preserve"> por </w:t>
       </w:r>
-      <w:proofErr w:type="spellStart"/>
       <w:r>
         <w:rPr>
           <w:b/>
@@ -1232,11 +1036,9 @@
         </w:rPr>
         <w:t>n</w:t>
       </w:r>
-      <w:proofErr w:type="spellEnd"/>
       <w:r>
         <w:t xml:space="preserve"> en </w:t>
       </w:r>
-      <w:proofErr w:type="spellStart"/>
       <w:r>
         <w:rPr>
           <w:b/>
@@ -1244,7 +1046,6 @@
         </w:rPr>
         <w:t>evam</w:t>
       </w:r>
-      <w:proofErr w:type="spellEnd"/>
       <w:r>
         <w:t xml:space="preserve">, </w:t>
       </w:r>

</xml_diff>